<commit_message>
feat: Enhance product result formatting and Google AI Mode integration
</commit_message>
<xml_diff>
--- a/tests/fixtures/sample-tender.docx
+++ b/tests/fixtures/sample-tender.docx
@@ -518,7 +518,7 @@
                 <w:szCs w:val="18"/>
                 <w:lang w:val="hy-AM" w:eastAsia="ru-RU"/>
               </w:rPr>
-              <w:t>Պլանշետ-նոթբուք</w:t>
+              <w:t>սեղանի համակարգիչներ</w:t>
             </w:r>
           </w:p>
         </w:tc>
@@ -529,665 +529,184 @@
           </w:tcPr>
           <w:p>
             <w:pPr>
-              <w:spacing w:after="0" w:line="240" w:lineRule="auto"/>
-              <w:rPr>
-                <w:rFonts w:ascii="GHEA Grapalat" w:eastAsia="Times New Roman" w:hAnsi="GHEA Grapalat" w:cs="Times New Roman"/>
-                <w:color w:val="000000"/>
-                <w:sz w:val="18"/>
-                <w:szCs w:val="18"/>
-                <w:lang w:val="hy-AM" w:eastAsia="ru-RU"/>
-              </w:rPr>
-            </w:pPr>
-            <w:r>
-              <w:rPr>
-                <w:rFonts w:ascii="GHEA Grapalat" w:eastAsia="Times New Roman" w:hAnsi="GHEA Grapalat" w:cs="Times New Roman"/>
-                <w:color w:val="000000"/>
-                <w:sz w:val="18"/>
-                <w:szCs w:val="18"/>
-                <w:lang w:val="hy-AM" w:eastAsia="ru-RU"/>
-              </w:rPr>
-              <w:t>Սարքի տեսակ՝ 2-ը 1-ում պլանշետ + նոթբուք (Detachable)</w:t>
-            </w:r>
-          </w:p>
-          <w:p>
-            <w:pPr>
-              <w:spacing w:after="0" w:line="240" w:lineRule="auto"/>
-              <w:rPr>
-                <w:rFonts w:ascii="GHEA Grapalat" w:eastAsia="Times New Roman" w:hAnsi="GHEA Grapalat" w:cs="Times New Roman"/>
-                <w:color w:val="000000"/>
-                <w:sz w:val="18"/>
-                <w:szCs w:val="18"/>
-                <w:lang w:val="hy-AM" w:eastAsia="ru-RU"/>
-              </w:rPr>
-            </w:pPr>
-            <w:r>
-              <w:rPr>
-                <w:rFonts w:ascii="GHEA Grapalat" w:eastAsia="Times New Roman" w:hAnsi="GHEA Grapalat" w:cs="Times New Roman"/>
-                <w:color w:val="000000"/>
-                <w:sz w:val="18"/>
-                <w:szCs w:val="18"/>
-                <w:lang w:val="hy-AM" w:eastAsia="ru-RU"/>
-              </w:rPr>
-              <w:t>Օպերացիոն համակարգ՝ Windows 11 Pro</w:t>
-            </w:r>
-          </w:p>
-          <w:p>
-            <w:pPr>
-              <w:spacing w:after="0" w:line="240" w:lineRule="auto"/>
-              <w:rPr>
-                <w:rFonts w:ascii="GHEA Grapalat" w:eastAsia="Times New Roman" w:hAnsi="GHEA Grapalat" w:cs="Times New Roman"/>
-                <w:color w:val="000000"/>
-                <w:sz w:val="18"/>
-                <w:szCs w:val="18"/>
-                <w:lang w:val="hy-AM" w:eastAsia="ru-RU"/>
-              </w:rPr>
-            </w:pPr>
-            <w:r>
-              <w:rPr>
-                <w:rFonts w:ascii="GHEA Grapalat" w:eastAsia="Times New Roman" w:hAnsi="GHEA Grapalat" w:cs="Times New Roman"/>
-                <w:color w:val="000000"/>
-                <w:sz w:val="18"/>
-                <w:szCs w:val="18"/>
-                <w:lang w:val="hy-AM" w:eastAsia="ru-RU"/>
-              </w:rPr>
-              <w:t>Աջակցում է՝ ստեղնաշար, գրիչ, մկնիկ</w:t>
-            </w:r>
-          </w:p>
-          <w:p>
-            <w:pPr>
-              <w:spacing w:after="0" w:line="240" w:lineRule="auto"/>
-              <w:rPr>
-                <w:rFonts w:ascii="GHEA Grapalat" w:eastAsia="Times New Roman" w:hAnsi="GHEA Grapalat" w:cs="Times New Roman"/>
-                <w:color w:val="000000"/>
-                <w:sz w:val="18"/>
-                <w:szCs w:val="18"/>
-                <w:lang w:val="hy-AM" w:eastAsia="ru-RU"/>
-              </w:rPr>
-            </w:pPr>
-            <w:r>
-              <w:rPr>
-                <w:rFonts w:ascii="GHEA Grapalat" w:eastAsia="Times New Roman" w:hAnsi="GHEA Grapalat" w:cs="Times New Roman"/>
-                <w:color w:val="000000"/>
-                <w:sz w:val="18"/>
-                <w:szCs w:val="18"/>
-                <w:lang w:val="hy-AM" w:eastAsia="ru-RU"/>
-              </w:rPr>
-              <w:t>Էկրան</w:t>
-            </w:r>
-          </w:p>
-          <w:p>
-            <w:pPr>
-              <w:spacing w:after="0" w:line="240" w:lineRule="auto"/>
-              <w:rPr>
-                <w:rFonts w:ascii="GHEA Grapalat" w:eastAsia="Times New Roman" w:hAnsi="GHEA Grapalat" w:cs="Times New Roman"/>
-                <w:color w:val="000000"/>
-                <w:sz w:val="18"/>
-                <w:szCs w:val="18"/>
-                <w:lang w:val="hy-AM" w:eastAsia="ru-RU"/>
-              </w:rPr>
-            </w:pPr>
-            <w:r>
-              <w:rPr>
-                <w:rFonts w:ascii="GHEA Grapalat" w:eastAsia="Times New Roman" w:hAnsi="GHEA Grapalat" w:cs="Times New Roman"/>
-                <w:color w:val="000000"/>
-                <w:sz w:val="18"/>
-                <w:szCs w:val="18"/>
-                <w:lang w:val="hy-AM" w:eastAsia="ru-RU"/>
-              </w:rPr>
-              <w:t>Չափ՝ 13 դյույմ Touchscreen</w:t>
-            </w:r>
-          </w:p>
-          <w:p>
-            <w:pPr>
-              <w:spacing w:after="0" w:line="240" w:lineRule="auto"/>
-              <w:rPr>
-                <w:rFonts w:ascii="GHEA Grapalat" w:eastAsia="Times New Roman" w:hAnsi="GHEA Grapalat" w:cs="Times New Roman"/>
-                <w:color w:val="000000"/>
-                <w:sz w:val="18"/>
-                <w:szCs w:val="18"/>
-                <w:lang w:val="hy-AM" w:eastAsia="ru-RU"/>
-              </w:rPr>
-            </w:pPr>
-            <w:r>
-              <w:rPr>
-                <w:rFonts w:ascii="GHEA Grapalat" w:eastAsia="Times New Roman" w:hAnsi="GHEA Grapalat" w:cs="Times New Roman"/>
-                <w:color w:val="000000"/>
-                <w:sz w:val="18"/>
-                <w:szCs w:val="18"/>
-                <w:lang w:val="hy-AM" w:eastAsia="ru-RU"/>
-              </w:rPr>
-              <w:t>Կետայնություն՝  առնվազն 2880 × 1920</w:t>
-            </w:r>
-          </w:p>
-          <w:p>
-            <w:pPr>
-              <w:spacing w:after="0" w:line="240" w:lineRule="auto"/>
-              <w:rPr>
-                <w:rFonts w:ascii="GHEA Grapalat" w:eastAsia="Times New Roman" w:hAnsi="GHEA Grapalat" w:cs="Times New Roman"/>
-                <w:color w:val="000000"/>
-                <w:sz w:val="18"/>
-                <w:szCs w:val="18"/>
-                <w:lang w:val="hy-AM" w:eastAsia="ru-RU"/>
-              </w:rPr>
-            </w:pPr>
-            <w:r>
-              <w:rPr>
-                <w:rFonts w:ascii="GHEA Grapalat" w:eastAsia="Times New Roman" w:hAnsi="GHEA Grapalat" w:cs="Times New Roman"/>
-                <w:color w:val="000000"/>
-                <w:sz w:val="18"/>
-                <w:szCs w:val="18"/>
-                <w:lang w:val="hy-AM" w:eastAsia="ru-RU"/>
-              </w:rPr>
-              <w:t>Էկրանի հարաբերակցություն՝ 3:2</w:t>
-            </w:r>
-          </w:p>
-          <w:p>
-            <w:pPr>
-              <w:spacing w:after="0" w:line="240" w:lineRule="auto"/>
-              <w:rPr>
-                <w:rFonts w:ascii="GHEA Grapalat" w:eastAsia="Times New Roman" w:hAnsi="GHEA Grapalat" w:cs="Times New Roman"/>
-                <w:color w:val="000000"/>
-                <w:sz w:val="18"/>
-                <w:szCs w:val="18"/>
-                <w:lang w:val="hy-AM" w:eastAsia="ru-RU"/>
-              </w:rPr>
-            </w:pPr>
-            <w:r>
-              <w:rPr>
-                <w:rFonts w:ascii="GHEA Grapalat" w:eastAsia="Times New Roman" w:hAnsi="GHEA Grapalat" w:cs="Times New Roman"/>
-                <w:color w:val="000000"/>
-                <w:sz w:val="18"/>
-                <w:szCs w:val="18"/>
-                <w:lang w:val="hy-AM" w:eastAsia="ru-RU"/>
-              </w:rPr>
-              <w:t>Պրոցեսոր (CPU)</w:t>
-            </w:r>
-          </w:p>
-          <w:p>
-            <w:pPr>
-              <w:spacing w:after="0" w:line="240" w:lineRule="auto"/>
-              <w:rPr>
-                <w:rFonts w:ascii="GHEA Grapalat" w:eastAsia="Times New Roman" w:hAnsi="GHEA Grapalat" w:cs="Times New Roman"/>
-                <w:color w:val="000000"/>
-                <w:sz w:val="18"/>
-                <w:szCs w:val="18"/>
-                <w:lang w:val="hy-AM" w:eastAsia="ru-RU"/>
-              </w:rPr>
-            </w:pPr>
-            <w:r>
-              <w:rPr>
-                <w:rFonts w:ascii="GHEA Grapalat" w:eastAsia="Times New Roman" w:hAnsi="GHEA Grapalat" w:cs="Times New Roman"/>
-                <w:color w:val="000000"/>
-                <w:sz w:val="18"/>
-                <w:szCs w:val="18"/>
-                <w:lang w:val="hy-AM" w:eastAsia="ru-RU"/>
-              </w:rPr>
-              <w:t>Qualcomm Snapdragon® X Plus (8-core) / Intel Core Ultra 7</w:t>
-            </w:r>
-          </w:p>
-          <w:p>
-            <w:pPr>
-              <w:spacing w:after="0" w:line="240" w:lineRule="auto"/>
-              <w:rPr>
-                <w:rFonts w:ascii="GHEA Grapalat" w:eastAsia="Times New Roman" w:hAnsi="GHEA Grapalat" w:cs="Times New Roman"/>
-                <w:color w:val="000000"/>
-                <w:sz w:val="18"/>
-                <w:szCs w:val="18"/>
-                <w:lang w:val="hy-AM" w:eastAsia="ru-RU"/>
-              </w:rPr>
-            </w:pPr>
-            <w:r>
-              <w:rPr>
-                <w:rFonts w:ascii="GHEA Grapalat" w:eastAsia="Times New Roman" w:hAnsi="GHEA Grapalat" w:cs="Times New Roman"/>
-                <w:color w:val="000000"/>
-                <w:sz w:val="18"/>
-                <w:szCs w:val="18"/>
-                <w:lang w:val="hy-AM" w:eastAsia="ru-RU"/>
-              </w:rPr>
-              <w:t>Տեսաքարտ (GPU) (ներկառուցված)</w:t>
-            </w:r>
-          </w:p>
-          <w:p>
-            <w:pPr>
-              <w:spacing w:after="0" w:line="240" w:lineRule="auto"/>
-              <w:rPr>
-                <w:rFonts w:ascii="GHEA Grapalat" w:eastAsia="Times New Roman" w:hAnsi="GHEA Grapalat" w:cs="Times New Roman"/>
-                <w:color w:val="000000"/>
-                <w:sz w:val="18"/>
-                <w:szCs w:val="18"/>
-                <w:lang w:val="hy-AM" w:eastAsia="ru-RU"/>
-              </w:rPr>
-            </w:pPr>
-            <w:r>
-              <w:rPr>
-                <w:rFonts w:ascii="GHEA Grapalat" w:eastAsia="Times New Roman" w:hAnsi="GHEA Grapalat" w:cs="Times New Roman"/>
-                <w:color w:val="000000"/>
-                <w:sz w:val="18"/>
-                <w:szCs w:val="18"/>
-                <w:lang w:val="hy-AM" w:eastAsia="ru-RU"/>
-              </w:rPr>
-              <w:t>Օպերատիվ հիշողություն (RAM)</w:t>
-            </w:r>
-          </w:p>
-          <w:p>
-            <w:pPr>
-              <w:spacing w:after="0" w:line="240" w:lineRule="auto"/>
-              <w:rPr>
-                <w:rFonts w:ascii="GHEA Grapalat" w:eastAsia="Times New Roman" w:hAnsi="GHEA Grapalat" w:cs="Times New Roman"/>
-                <w:color w:val="000000"/>
-                <w:sz w:val="18"/>
-                <w:szCs w:val="18"/>
-                <w:lang w:val="hy-AM" w:eastAsia="ru-RU"/>
-              </w:rPr>
-            </w:pPr>
-            <w:r>
-              <w:rPr>
-                <w:rFonts w:ascii="GHEA Grapalat" w:eastAsia="Times New Roman" w:hAnsi="GHEA Grapalat" w:cs="Times New Roman"/>
-                <w:color w:val="000000"/>
-                <w:sz w:val="18"/>
-                <w:szCs w:val="18"/>
-                <w:lang w:val="hy-AM" w:eastAsia="ru-RU"/>
-              </w:rPr>
-              <w:t>Առնվազն 16GB LPDDR5X</w:t>
-            </w:r>
-          </w:p>
-          <w:p>
-            <w:pPr>
-              <w:spacing w:after="0" w:line="240" w:lineRule="auto"/>
-              <w:rPr>
-                <w:rFonts w:ascii="GHEA Grapalat" w:eastAsia="Times New Roman" w:hAnsi="GHEA Grapalat" w:cs="Times New Roman"/>
-                <w:color w:val="000000"/>
-                <w:sz w:val="18"/>
-                <w:szCs w:val="18"/>
-                <w:lang w:val="hy-AM" w:eastAsia="ru-RU"/>
-              </w:rPr>
-            </w:pPr>
-            <w:r>
-              <w:rPr>
-                <w:rFonts w:ascii="GHEA Grapalat" w:eastAsia="Times New Roman" w:hAnsi="GHEA Grapalat" w:cs="Times New Roman"/>
-                <w:color w:val="000000"/>
-                <w:sz w:val="18"/>
-                <w:szCs w:val="18"/>
-                <w:lang w:val="hy-AM" w:eastAsia="ru-RU"/>
-              </w:rPr>
-              <w:t>Ներքին հիշողություն (SSD)</w:t>
-            </w:r>
-          </w:p>
-          <w:p>
-            <w:pPr>
-              <w:spacing w:after="0" w:line="240" w:lineRule="auto"/>
-              <w:rPr>
-                <w:rFonts w:ascii="GHEA Grapalat" w:eastAsia="Times New Roman" w:hAnsi="GHEA Grapalat" w:cs="Times New Roman"/>
-                <w:color w:val="000000"/>
-                <w:sz w:val="18"/>
-                <w:szCs w:val="18"/>
-                <w:lang w:val="hy-AM" w:eastAsia="ru-RU"/>
-              </w:rPr>
-            </w:pPr>
-            <w:r>
-              <w:rPr>
-                <w:rFonts w:ascii="GHEA Grapalat" w:eastAsia="Times New Roman" w:hAnsi="GHEA Grapalat" w:cs="Times New Roman"/>
-                <w:color w:val="000000"/>
-                <w:sz w:val="18"/>
-                <w:szCs w:val="18"/>
-                <w:lang w:val="hy-AM" w:eastAsia="ru-RU"/>
-              </w:rPr>
-              <w:t>256GB առնվազն</w:t>
-            </w:r>
-          </w:p>
-          <w:p>
-            <w:pPr>
-              <w:spacing w:after="0" w:line="240" w:lineRule="auto"/>
-              <w:rPr>
-                <w:rFonts w:ascii="GHEA Grapalat" w:eastAsia="Times New Roman" w:hAnsi="GHEA Grapalat" w:cs="Times New Roman"/>
-                <w:color w:val="000000"/>
-                <w:sz w:val="18"/>
-                <w:szCs w:val="18"/>
-                <w:lang w:val="hy-AM" w:eastAsia="ru-RU"/>
-              </w:rPr>
-            </w:pPr>
-            <w:r>
-              <w:rPr>
-                <w:rFonts w:ascii="GHEA Grapalat" w:eastAsia="Times New Roman" w:hAnsi="GHEA Grapalat" w:cs="Times New Roman"/>
-                <w:color w:val="000000"/>
-                <w:sz w:val="18"/>
-                <w:szCs w:val="18"/>
-                <w:lang w:val="hy-AM" w:eastAsia="ru-RU"/>
-              </w:rPr>
-              <w:t>Կապի հնարավորություններ</w:t>
-            </w:r>
-          </w:p>
-          <w:p>
-            <w:pPr>
-              <w:spacing w:after="0" w:line="240" w:lineRule="auto"/>
-              <w:rPr>
-                <w:rFonts w:ascii="GHEA Grapalat" w:eastAsia="Times New Roman" w:hAnsi="GHEA Grapalat" w:cs="Times New Roman"/>
-                <w:color w:val="000000"/>
-                <w:sz w:val="18"/>
-                <w:szCs w:val="18"/>
-                <w:lang w:val="hy-AM" w:eastAsia="ru-RU"/>
-              </w:rPr>
-            </w:pPr>
-            <w:r>
-              <w:rPr>
-                <w:rFonts w:ascii="GHEA Grapalat" w:eastAsia="Times New Roman" w:hAnsi="GHEA Grapalat" w:cs="Times New Roman"/>
-                <w:color w:val="000000"/>
-                <w:sz w:val="18"/>
-                <w:szCs w:val="18"/>
-                <w:lang w:val="hy-AM" w:eastAsia="ru-RU"/>
-              </w:rPr>
-              <w:t>Wi-Fi 7</w:t>
-            </w:r>
-          </w:p>
-          <w:p>
-            <w:pPr>
-              <w:spacing w:after="0" w:line="240" w:lineRule="auto"/>
-              <w:rPr>
-                <w:rFonts w:ascii="GHEA Grapalat" w:eastAsia="Times New Roman" w:hAnsi="GHEA Grapalat" w:cs="Times New Roman"/>
-                <w:color w:val="000000"/>
-                <w:sz w:val="18"/>
-                <w:szCs w:val="18"/>
-                <w:lang w:val="hy-AM" w:eastAsia="ru-RU"/>
-              </w:rPr>
-            </w:pPr>
-            <w:r>
-              <w:rPr>
-                <w:rFonts w:ascii="GHEA Grapalat" w:eastAsia="Times New Roman" w:hAnsi="GHEA Grapalat" w:cs="Times New Roman"/>
-                <w:color w:val="000000"/>
-                <w:sz w:val="18"/>
-                <w:szCs w:val="18"/>
-                <w:lang w:val="hy-AM" w:eastAsia="ru-RU"/>
-              </w:rPr>
-              <w:t>Bluetooth 5.4</w:t>
-            </w:r>
-          </w:p>
-          <w:p>
-            <w:pPr>
-              <w:spacing w:after="0" w:line="240" w:lineRule="auto"/>
-              <w:rPr>
-                <w:rFonts w:ascii="GHEA Grapalat" w:eastAsia="Times New Roman" w:hAnsi="GHEA Grapalat" w:cs="Times New Roman"/>
-                <w:color w:val="000000"/>
-                <w:sz w:val="18"/>
-                <w:szCs w:val="18"/>
-                <w:lang w:val="hy-AM" w:eastAsia="ru-RU"/>
-              </w:rPr>
-            </w:pPr>
-            <w:r>
-              <w:rPr>
-                <w:rFonts w:ascii="GHEA Grapalat" w:eastAsia="Times New Roman" w:hAnsi="GHEA Grapalat" w:cs="Times New Roman"/>
-                <w:color w:val="000000"/>
-                <w:sz w:val="18"/>
-                <w:szCs w:val="18"/>
-                <w:lang w:val="hy-AM" w:eastAsia="ru-RU"/>
-              </w:rPr>
-              <w:t>2 × USB-C (USB 3.2) / USB-C (Thunderbolt)</w:t>
-            </w:r>
-          </w:p>
-          <w:p>
-            <w:pPr>
-              <w:spacing w:after="0" w:line="240" w:lineRule="auto"/>
-              <w:rPr>
-                <w:rFonts w:ascii="GHEA Grapalat" w:eastAsia="Times New Roman" w:hAnsi="GHEA Grapalat" w:cs="Times New Roman"/>
-                <w:color w:val="000000"/>
-                <w:sz w:val="18"/>
-                <w:szCs w:val="18"/>
-                <w:lang w:val="hy-AM" w:eastAsia="ru-RU"/>
-              </w:rPr>
-            </w:pPr>
-            <w:r>
-              <w:rPr>
-                <w:rFonts w:ascii="GHEA Grapalat" w:eastAsia="Times New Roman" w:hAnsi="GHEA Grapalat" w:cs="Times New Roman"/>
-                <w:color w:val="000000"/>
-                <w:sz w:val="18"/>
-                <w:szCs w:val="18"/>
-                <w:lang w:val="hy-AM" w:eastAsia="ru-RU"/>
-              </w:rPr>
-              <w:t>Տեսախցիկներ</w:t>
-            </w:r>
-          </w:p>
-          <w:p>
-            <w:pPr>
-              <w:spacing w:after="0" w:line="240" w:lineRule="auto"/>
-              <w:rPr>
-                <w:rFonts w:ascii="GHEA Grapalat" w:eastAsia="Times New Roman" w:hAnsi="GHEA Grapalat" w:cs="Times New Roman"/>
-                <w:color w:val="000000"/>
-                <w:sz w:val="18"/>
-                <w:szCs w:val="18"/>
-                <w:lang w:val="hy-AM" w:eastAsia="ru-RU"/>
-              </w:rPr>
-            </w:pPr>
-            <w:r>
-              <w:rPr>
-                <w:rFonts w:ascii="GHEA Grapalat" w:eastAsia="Times New Roman" w:hAnsi="GHEA Grapalat" w:cs="Times New Roman"/>
-                <w:color w:val="000000"/>
-                <w:sz w:val="18"/>
-                <w:szCs w:val="18"/>
-                <w:lang w:val="hy-AM" w:eastAsia="ru-RU"/>
-              </w:rPr>
-              <w:t>Առջևի տեսախցիկ՝  առնվազն 8MP</w:t>
-            </w:r>
-          </w:p>
-          <w:p>
-            <w:pPr>
-              <w:spacing w:after="0" w:line="240" w:lineRule="auto"/>
-              <w:rPr>
-                <w:rFonts w:ascii="GHEA Grapalat" w:eastAsia="Times New Roman" w:hAnsi="GHEA Grapalat" w:cs="Times New Roman"/>
-                <w:color w:val="000000"/>
-                <w:sz w:val="18"/>
-                <w:szCs w:val="18"/>
-                <w:lang w:val="hy-AM" w:eastAsia="ru-RU"/>
-              </w:rPr>
-            </w:pPr>
-            <w:r>
-              <w:rPr>
-                <w:rFonts w:ascii="GHEA Grapalat" w:eastAsia="Times New Roman" w:hAnsi="GHEA Grapalat" w:cs="Times New Roman"/>
-                <w:color w:val="000000"/>
-                <w:sz w:val="18"/>
-                <w:szCs w:val="18"/>
-                <w:lang w:val="hy-AM" w:eastAsia="ru-RU"/>
-              </w:rPr>
-              <w:t>Հետևի տեսախցիկ՝ մինչև 4K</w:t>
-            </w:r>
-          </w:p>
-          <w:p>
-            <w:pPr>
-              <w:spacing w:after="0" w:line="240" w:lineRule="auto"/>
-              <w:rPr>
-                <w:rFonts w:ascii="GHEA Grapalat" w:eastAsia="Times New Roman" w:hAnsi="GHEA Grapalat" w:cs="Times New Roman"/>
-                <w:color w:val="000000"/>
-                <w:sz w:val="18"/>
-                <w:szCs w:val="18"/>
-                <w:lang w:val="hy-AM" w:eastAsia="ru-RU"/>
-              </w:rPr>
-            </w:pPr>
-            <w:r>
-              <w:rPr>
-                <w:rFonts w:ascii="GHEA Grapalat" w:eastAsia="Times New Roman" w:hAnsi="GHEA Grapalat" w:cs="Times New Roman"/>
-                <w:color w:val="000000"/>
-                <w:sz w:val="18"/>
-                <w:szCs w:val="18"/>
-                <w:lang w:val="hy-AM" w:eastAsia="ru-RU"/>
-              </w:rPr>
-              <w:t>Մարտկոց</w:t>
-            </w:r>
-          </w:p>
-          <w:p>
-            <w:pPr>
-              <w:spacing w:after="0" w:line="240" w:lineRule="auto"/>
-              <w:rPr>
-                <w:rFonts w:ascii="GHEA Grapalat" w:eastAsia="Times New Roman" w:hAnsi="GHEA Grapalat" w:cs="Times New Roman"/>
-                <w:color w:val="000000"/>
-                <w:sz w:val="18"/>
-                <w:szCs w:val="18"/>
-                <w:lang w:val="hy-AM" w:eastAsia="ru-RU"/>
-              </w:rPr>
-            </w:pPr>
-            <w:r>
-              <w:rPr>
-                <w:rFonts w:ascii="GHEA Grapalat" w:eastAsia="Times New Roman" w:hAnsi="GHEA Grapalat" w:cs="Times New Roman"/>
-                <w:color w:val="000000"/>
-                <w:sz w:val="18"/>
-                <w:szCs w:val="18"/>
-                <w:lang w:val="hy-AM" w:eastAsia="ru-RU"/>
-              </w:rPr>
-              <w:t>Մինչև 10-12 ժամ ինտերնետ օգտագործում</w:t>
-            </w:r>
-          </w:p>
-          <w:p>
-            <w:pPr>
-              <w:spacing w:after="0" w:line="240" w:lineRule="auto"/>
-              <w:rPr>
-                <w:rFonts w:ascii="GHEA Grapalat" w:eastAsia="Times New Roman" w:hAnsi="GHEA Grapalat" w:cs="Times New Roman"/>
-                <w:color w:val="000000"/>
-                <w:sz w:val="18"/>
-                <w:szCs w:val="18"/>
-                <w:lang w:val="hy-AM" w:eastAsia="ru-RU"/>
-              </w:rPr>
-            </w:pPr>
-            <w:r>
-              <w:rPr>
-                <w:rFonts w:ascii="GHEA Grapalat" w:eastAsia="Times New Roman" w:hAnsi="GHEA Grapalat" w:cs="Times New Roman"/>
-                <w:color w:val="000000"/>
-                <w:sz w:val="18"/>
-                <w:szCs w:val="18"/>
-                <w:lang w:val="hy-AM" w:eastAsia="ru-RU"/>
-              </w:rPr>
-              <w:t>Քաշ և չափեր</w:t>
-            </w:r>
-          </w:p>
-          <w:p>
-            <w:pPr>
-              <w:spacing w:after="0" w:line="240" w:lineRule="auto"/>
-              <w:rPr>
-                <w:rFonts w:ascii="GHEA Grapalat" w:eastAsia="Times New Roman" w:hAnsi="GHEA Grapalat" w:cs="Times New Roman"/>
-                <w:color w:val="000000"/>
-                <w:sz w:val="18"/>
-                <w:szCs w:val="18"/>
-                <w:lang w:val="hy-AM" w:eastAsia="ru-RU"/>
-              </w:rPr>
-            </w:pPr>
-            <w:r>
-              <w:rPr>
-                <w:rFonts w:ascii="GHEA Grapalat" w:eastAsia="Times New Roman" w:hAnsi="GHEA Grapalat" w:cs="Times New Roman"/>
-                <w:color w:val="000000"/>
-                <w:sz w:val="18"/>
-                <w:szCs w:val="18"/>
-                <w:lang w:val="hy-AM" w:eastAsia="ru-RU"/>
-              </w:rPr>
-              <w:t>Քաշ՝ մոտ 680-800 գ (առանց ստեղնաշարի)</w:t>
-            </w:r>
-          </w:p>
-          <w:p>
-            <w:pPr>
-              <w:spacing w:after="0" w:line="240" w:lineRule="auto"/>
-              <w:rPr>
-                <w:rFonts w:ascii="GHEA Grapalat" w:eastAsia="Times New Roman" w:hAnsi="GHEA Grapalat" w:cs="Times New Roman"/>
-                <w:color w:val="000000"/>
-                <w:sz w:val="18"/>
-                <w:szCs w:val="18"/>
-                <w:lang w:val="hy-AM" w:eastAsia="ru-RU"/>
-              </w:rPr>
-            </w:pPr>
-            <w:r>
-              <w:rPr>
-                <w:rFonts w:ascii="GHEA Grapalat" w:eastAsia="Times New Roman" w:hAnsi="GHEA Grapalat" w:cs="Times New Roman"/>
-                <w:color w:val="000000"/>
-                <w:sz w:val="18"/>
-                <w:szCs w:val="18"/>
-                <w:lang w:val="hy-AM" w:eastAsia="ru-RU"/>
-              </w:rPr>
-              <w:t>Բարակություն՝ մոտ 7.8-9 մմ</w:t>
-            </w:r>
-          </w:p>
-          <w:p>
-            <w:pPr>
-              <w:spacing w:after="0" w:line="240" w:lineRule="auto"/>
-              <w:rPr>
-                <w:rFonts w:ascii="GHEA Grapalat" w:eastAsia="Times New Roman" w:hAnsi="GHEA Grapalat" w:cs="Times New Roman"/>
-                <w:color w:val="000000"/>
-                <w:sz w:val="18"/>
-                <w:szCs w:val="18"/>
-                <w:lang w:val="hy-AM" w:eastAsia="ru-RU"/>
-              </w:rPr>
-            </w:pPr>
-            <w:r>
-              <w:rPr>
-                <w:rFonts w:ascii="GHEA Grapalat" w:eastAsia="Times New Roman" w:hAnsi="GHEA Grapalat" w:cs="Times New Roman"/>
-                <w:color w:val="000000"/>
-                <w:sz w:val="18"/>
-                <w:szCs w:val="18"/>
-                <w:lang w:val="hy-AM" w:eastAsia="ru-RU"/>
-              </w:rPr>
-              <w:t>Ստեղնաշար, գրիչ (համալրված)</w:t>
-            </w:r>
-          </w:p>
-          <w:p>
-            <w:pPr>
-              <w:spacing w:after="0" w:line="240" w:lineRule="auto"/>
-              <w:rPr>
-                <w:rFonts w:ascii="GHEA Grapalat" w:eastAsia="Times New Roman" w:hAnsi="GHEA Grapalat" w:cs="Times New Roman"/>
-                <w:color w:val="000000"/>
-                <w:sz w:val="18"/>
-                <w:szCs w:val="18"/>
-                <w:lang w:val="hy-AM" w:eastAsia="ru-RU"/>
-              </w:rPr>
-            </w:pPr>
-            <w:r>
-              <w:rPr>
-                <w:rFonts w:ascii="GHEA Grapalat" w:eastAsia="Times New Roman" w:hAnsi="GHEA Grapalat" w:cs="Times New Roman"/>
-                <w:color w:val="000000"/>
-                <w:sz w:val="18"/>
-                <w:szCs w:val="18"/>
-                <w:lang w:val="hy-AM" w:eastAsia="ru-RU"/>
-              </w:rPr>
-              <w:t>Մագնիսական միացում</w:t>
-            </w:r>
-          </w:p>
-          <w:p>
-            <w:pPr>
-              <w:spacing w:after="0" w:line="240" w:lineRule="auto"/>
-              <w:rPr>
-                <w:rFonts w:ascii="GHEA Grapalat" w:eastAsia="Times New Roman" w:hAnsi="GHEA Grapalat" w:cs="Times New Roman"/>
-                <w:color w:val="000000"/>
-                <w:sz w:val="18"/>
-                <w:szCs w:val="18"/>
-                <w:lang w:val="hy-AM" w:eastAsia="ru-RU"/>
-              </w:rPr>
-            </w:pPr>
-            <w:r>
-              <w:rPr>
-                <w:rFonts w:ascii="GHEA Grapalat" w:eastAsia="Times New Roman" w:hAnsi="GHEA Grapalat" w:cs="Times New Roman"/>
-                <w:color w:val="000000"/>
-                <w:sz w:val="18"/>
-                <w:szCs w:val="18"/>
-                <w:lang w:val="hy-AM" w:eastAsia="ru-RU"/>
-              </w:rPr>
-              <w:t>Touchpad</w:t>
-            </w:r>
-          </w:p>
-          <w:p>
-            <w:pPr>
-              <w:autoSpaceDE w:val="0"/>
-              <w:autoSpaceDN w:val="0"/>
-              <w:adjustRightInd w:val="0"/>
-              <w:spacing w:after="0" w:line="240" w:lineRule="auto"/>
-              <w:rPr>
-                <w:rFonts w:ascii="GHEA Grapalat" w:eastAsia="Times New Roman" w:hAnsi="GHEA Grapalat" w:cs="Times New Roman"/>
-                <w:color w:val="000000"/>
-                <w:sz w:val="18"/>
-                <w:szCs w:val="18"/>
-                <w:lang w:val="hy-AM" w:eastAsia="ru-RU"/>
-              </w:rPr>
-            </w:pPr>
-            <w:r>
-              <w:rPr>
-                <w:rFonts w:ascii="GHEA Grapalat" w:eastAsia="Times New Roman" w:hAnsi="GHEA Grapalat" w:cs="Times New Roman"/>
-                <w:color w:val="000000"/>
-                <w:sz w:val="18"/>
-                <w:szCs w:val="18"/>
-                <w:lang w:val="hy-AM" w:eastAsia="ru-RU"/>
-              </w:rPr>
-              <w:t>Երաշխիքային ժամկետը` Ապրանքն ընդունելու օրվան հաջորդող օրվանից հաշված 1 տարի</w:t>
+              <w:autoSpaceDE w:val="0"/>
+              <w:autoSpaceDN w:val="0"/>
+              <w:adjustRightInd w:val="0"/>
+              <w:spacing w:after="0" w:line="240" w:lineRule="auto"/>
+              <w:jc w:val="both"/>
+              <w:rPr>
+                <w:rFonts w:ascii="GHEA Grapalat" w:eastAsia="Times New Roman" w:hAnsi="GHEA Grapalat" w:cs="Times New Roman"/>
+                <w:color w:val="000000"/>
+                <w:sz w:val="18"/>
+                <w:szCs w:val="18"/>
+                <w:lang w:val="hy-AM" w:eastAsia="ru-RU"/>
+              </w:rPr>
+            </w:pPr>
+            <w:r>
+              <w:rPr>
+                <w:rFonts w:ascii="GHEA Grapalat" w:eastAsia="Times New Roman" w:hAnsi="GHEA Grapalat" w:cs="Times New Roman"/>
+                <w:color w:val="000000"/>
+                <w:sz w:val="18"/>
+                <w:szCs w:val="18"/>
+                <w:lang w:val="hy-AM" w:eastAsia="ru-RU"/>
+              </w:rPr>
+              <w:t xml:space="preserve">1.1 Պրոցեսորի միջուկների քանակը 4 միջուկ հիմնական 8 վիրտուալ և ավել  , հաճախականույան մաքսիմումը 3.5-4,7 GHz և ավել, քեշ հիշողույթւնը 12MB և ավել , օպերատիվ հիշողության մաքսիմալ հնարավորությունը 192 GB DDR4, </w:t>
+            </w:r>
+          </w:p>
+          <w:p>
+            <w:pPr>
+              <w:autoSpaceDE w:val="0"/>
+              <w:autoSpaceDN w:val="0"/>
+              <w:adjustRightInd w:val="0"/>
+              <w:spacing w:after="0" w:line="240" w:lineRule="auto"/>
+              <w:jc w:val="both"/>
+              <w:rPr>
+                <w:rFonts w:ascii="GHEA Grapalat" w:eastAsia="Times New Roman" w:hAnsi="GHEA Grapalat" w:cs="Times New Roman"/>
+                <w:color w:val="000000"/>
+                <w:sz w:val="18"/>
+                <w:szCs w:val="18"/>
+                <w:lang w:val="hy-AM" w:eastAsia="ru-RU"/>
+              </w:rPr>
+            </w:pPr>
+            <w:r>
+              <w:rPr>
+                <w:rFonts w:ascii="GHEA Grapalat" w:eastAsia="Times New Roman" w:hAnsi="GHEA Grapalat" w:cs="Times New Roman"/>
+                <w:color w:val="000000"/>
+                <w:sz w:val="18"/>
+                <w:szCs w:val="18"/>
+                <w:lang w:val="hy-AM" w:eastAsia="ru-RU"/>
+              </w:rPr>
+              <w:t>1.2 Մայրական սալիկ h610M-R D4 SI  տեսակի կամ համարժեք h610M-K D4 ARGB, 2 USB 3.2-GEL1 պորտերով, 2 USB 2.0 պորտորով և ավել, Sata 6gb/c և M.2 NVME  հնարավորությունով,</w:t>
+            </w:r>
+          </w:p>
+          <w:p>
+            <w:pPr>
+              <w:autoSpaceDE w:val="0"/>
+              <w:autoSpaceDN w:val="0"/>
+              <w:adjustRightInd w:val="0"/>
+              <w:spacing w:after="0" w:line="240" w:lineRule="auto"/>
+              <w:jc w:val="both"/>
+              <w:rPr>
+                <w:rFonts w:ascii="GHEA Grapalat" w:eastAsia="Times New Roman" w:hAnsi="GHEA Grapalat" w:cs="Times New Roman"/>
+                <w:color w:val="000000"/>
+                <w:sz w:val="18"/>
+                <w:szCs w:val="18"/>
+                <w:lang w:val="hy-AM" w:eastAsia="ru-RU"/>
+              </w:rPr>
+            </w:pPr>
+            <w:r>
+              <w:rPr>
+                <w:rFonts w:ascii="GHEA Grapalat" w:eastAsia="Times New Roman" w:hAnsi="GHEA Grapalat" w:cs="Times New Roman"/>
+                <w:color w:val="000000"/>
+                <w:sz w:val="18"/>
+                <w:szCs w:val="18"/>
+                <w:lang w:val="hy-AM" w:eastAsia="ru-RU"/>
+              </w:rPr>
+              <w:t>1.3 Օպերատիվ հիշողութուն- 16GB DDR 4, 3200MHz KINGSTON KVR32N22D8/16WP կամ  համարժեք GoodRam GR3200D464L22/16G</w:t>
+            </w:r>
+          </w:p>
+          <w:p>
+            <w:pPr>
+              <w:autoSpaceDE w:val="0"/>
+              <w:autoSpaceDN w:val="0"/>
+              <w:adjustRightInd w:val="0"/>
+              <w:spacing w:after="0" w:line="240" w:lineRule="auto"/>
+              <w:jc w:val="both"/>
+              <w:rPr>
+                <w:rFonts w:ascii="GHEA Grapalat" w:eastAsia="Times New Roman" w:hAnsi="GHEA Grapalat" w:cs="Times New Roman"/>
+                <w:color w:val="000000"/>
+                <w:sz w:val="18"/>
+                <w:szCs w:val="18"/>
+                <w:lang w:val="hy-AM" w:eastAsia="ru-RU"/>
+              </w:rPr>
+            </w:pPr>
+            <w:r>
+              <w:rPr>
+                <w:rFonts w:ascii="GHEA Grapalat" w:eastAsia="Times New Roman" w:hAnsi="GHEA Grapalat" w:cs="Times New Roman"/>
+                <w:color w:val="000000"/>
+                <w:sz w:val="18"/>
+                <w:szCs w:val="18"/>
+                <w:lang w:val="hy-AM" w:eastAsia="ru-RU"/>
+              </w:rPr>
+              <w:t>1.4 Կոշտ սկավառակ  – 512GB , տեսակը SSD M.2 PCLE NVME տիպի,  գրելու և կարդալու արագությունը 4000ՄB/s-7000GB/s</w:t>
+            </w:r>
+          </w:p>
+          <w:p>
+            <w:pPr>
+              <w:autoSpaceDE w:val="0"/>
+              <w:autoSpaceDN w:val="0"/>
+              <w:adjustRightInd w:val="0"/>
+              <w:spacing w:after="0" w:line="240" w:lineRule="auto"/>
+              <w:jc w:val="both"/>
+              <w:rPr>
+                <w:rFonts w:ascii="GHEA Grapalat" w:eastAsia="Times New Roman" w:hAnsi="GHEA Grapalat" w:cs="Times New Roman"/>
+                <w:color w:val="000000"/>
+                <w:sz w:val="18"/>
+                <w:szCs w:val="18"/>
+                <w:lang w:val="hy-AM" w:eastAsia="ru-RU"/>
+              </w:rPr>
+            </w:pPr>
+            <w:r>
+              <w:rPr>
+                <w:rFonts w:ascii="GHEA Grapalat" w:eastAsia="Times New Roman" w:hAnsi="GHEA Grapalat" w:cs="Times New Roman"/>
+                <w:color w:val="000000"/>
+                <w:sz w:val="18"/>
+                <w:szCs w:val="18"/>
+                <w:lang w:val="hy-AM" w:eastAsia="ru-RU"/>
+              </w:rPr>
+              <w:t xml:space="preserve">1.5 Պրոցեսորի հովացուցիչ – 65w- և ավել, </w:t>
+            </w:r>
+          </w:p>
+          <w:p>
+            <w:pPr>
+              <w:autoSpaceDE w:val="0"/>
+              <w:autoSpaceDN w:val="0"/>
+              <w:adjustRightInd w:val="0"/>
+              <w:spacing w:after="0" w:line="240" w:lineRule="auto"/>
+              <w:jc w:val="both"/>
+              <w:rPr>
+                <w:rFonts w:ascii="GHEA Grapalat" w:eastAsia="Times New Roman" w:hAnsi="GHEA Grapalat" w:cs="Times New Roman"/>
+                <w:color w:val="000000"/>
+                <w:sz w:val="18"/>
+                <w:szCs w:val="18"/>
+                <w:lang w:val="hy-AM" w:eastAsia="ru-RU"/>
+              </w:rPr>
+            </w:pPr>
+            <w:r>
+              <w:rPr>
+                <w:rFonts w:ascii="GHEA Grapalat" w:eastAsia="Times New Roman" w:hAnsi="GHEA Grapalat" w:cs="Times New Roman"/>
+                <w:color w:val="000000"/>
+                <w:sz w:val="18"/>
+                <w:szCs w:val="18"/>
+                <w:lang w:val="hy-AM" w:eastAsia="ru-RU"/>
+              </w:rPr>
+              <w:t>1.6 Հոսանքի սնուցման բլոկ-500-600w-և ավել 80+ սերտիֆիկատի առկայություն</w:t>
+            </w:r>
+          </w:p>
+          <w:p>
+            <w:pPr>
+              <w:autoSpaceDE w:val="0"/>
+              <w:autoSpaceDN w:val="0"/>
+              <w:adjustRightInd w:val="0"/>
+              <w:spacing w:after="0" w:line="240" w:lineRule="auto"/>
+              <w:jc w:val="both"/>
+              <w:rPr>
+                <w:rFonts w:ascii="GHEA Grapalat" w:eastAsia="Times New Roman" w:hAnsi="GHEA Grapalat" w:cs="Times New Roman"/>
+                <w:color w:val="000000"/>
+                <w:sz w:val="18"/>
+                <w:szCs w:val="18"/>
+                <w:lang w:val="hy-AM" w:eastAsia="ru-RU"/>
+              </w:rPr>
+            </w:pPr>
+            <w:r>
+              <w:rPr>
+                <w:rFonts w:ascii="GHEA Grapalat" w:eastAsia="Times New Roman" w:hAnsi="GHEA Grapalat" w:cs="Times New Roman"/>
+                <w:color w:val="000000"/>
+                <w:sz w:val="18"/>
+                <w:szCs w:val="18"/>
+                <w:lang w:val="hy-AM" w:eastAsia="ru-RU"/>
+              </w:rPr>
+              <w:t xml:space="preserve">1.7 Համակարգչի իրան USB 3.0 – գույնը՝ սև </w:t>
             </w:r>
           </w:p>
         </w:tc>
@@ -1251,7 +770,7 @@
                 <w:szCs w:val="18"/>
                 <w:lang w:val="hy-AM" w:eastAsia="ru-RU"/>
               </w:rPr>
-              <w:t>580 000</w:t>
+              <w:t>260 000</w:t>
             </w:r>
           </w:p>
         </w:tc>
@@ -1283,17 +802,37 @@
                 <w:szCs w:val="18"/>
                 <w:lang w:val="hy-AM" w:eastAsia="ru-RU"/>
               </w:rPr>
-              <w:t>2 320</w:t>
-            </w:r>
-            <w:r>
-              <w:rPr>
-                <w:rFonts w:ascii="Calibri" w:eastAsia="Times New Roman" w:hAnsi="Calibri" w:cs="Calibri"/>
-                <w:color w:val="000000"/>
-                <w:sz w:val="18"/>
-                <w:szCs w:val="18"/>
-                <w:lang w:val="hy-AM" w:eastAsia="ru-RU"/>
-              </w:rPr>
-              <w:t> </w:t>
+              <w:t>5</w:t>
+            </w:r>
+            <w:r>
+              <w:rPr>
+                <w:rFonts w:ascii="GHEA Grapalat" w:eastAsia="Times New Roman" w:hAnsi="GHEA Grapalat" w:cs="Times New Roman"/>
+                <w:color w:val="000000"/>
+                <w:sz w:val="18"/>
+                <w:szCs w:val="18"/>
+                <w:lang w:val="hy-AM" w:eastAsia="ru-RU"/>
+              </w:rPr>
+              <w:t xml:space="preserve"> </w:t>
+            </w:r>
+            <w:r>
+              <w:rPr>
+                <w:rFonts w:ascii="GHEA Grapalat" w:eastAsia="Times New Roman" w:hAnsi="GHEA Grapalat" w:cs="Times New Roman"/>
+                <w:color w:val="000000"/>
+                <w:sz w:val="18"/>
+                <w:szCs w:val="18"/>
+                <w:lang w:val="hy-AM" w:eastAsia="ru-RU"/>
+              </w:rPr>
+              <w:t>200</w:t>
+            </w:r>
+            <w:r>
+              <w:rPr>
+                <w:rFonts w:ascii="GHEA Grapalat" w:eastAsia="Times New Roman" w:hAnsi="GHEA Grapalat" w:cs="Times New Roman"/>
+                <w:color w:val="000000"/>
+                <w:sz w:val="18"/>
+                <w:szCs w:val="18"/>
+                <w:lang w:val="hy-AM" w:eastAsia="ru-RU"/>
+              </w:rPr>
+              <w:t xml:space="preserve"> </w:t>
             </w:r>
             <w:r>
               <w:rPr>
@@ -1335,7 +874,7 @@
                 <w:szCs w:val="18"/>
                 <w:lang w:val="hy-AM" w:eastAsia="ru-RU"/>
               </w:rPr>
-              <w:t>4</w:t>
+              <w:t>20</w:t>
             </w:r>
           </w:p>
         </w:tc>
@@ -1367,7 +906,7 @@
                 <w:szCs w:val="18"/>
                 <w:lang w:val="hy-AM" w:eastAsia="ru-RU"/>
               </w:rPr>
-              <w:t>Պայմանագրին ուժի մեջ մտնելու օրվանից հաշված` 60 օրվա ընթացքում</w:t>
+              <w:t>համաձայնագրի կնքման օրվանից 20 օր</w:t>
             </w:r>
           </w:p>
         </w:tc>
@@ -1429,6 +968,16 @@
                 <w:lang w:val="hy-AM" w:eastAsia="ru-RU"/>
               </w:rPr>
             </w:pPr>
+            <w:r>
+              <w:rPr>
+                <w:rFonts w:ascii="GHEA Grapalat" w:eastAsia="Times New Roman" w:hAnsi="GHEA Grapalat" w:cs="Times New Roman"/>
+                <w:color w:val="000000"/>
+                <w:sz w:val="18"/>
+                <w:szCs w:val="18"/>
+                <w:lang w:val="hy-AM" w:eastAsia="ru-RU"/>
+              </w:rPr>
+              <w:t>համակարգչային մոնիտոր</w:t>
+            </w:r>
           </w:p>
         </w:tc>
         <w:tc>
@@ -1442,14 +991,51 @@
               <w:autoSpaceDN w:val="0"/>
               <w:adjustRightInd w:val="0"/>
               <w:spacing w:after="0" w:line="240" w:lineRule="auto"/>
-              <w:rPr>
-                <w:rFonts w:ascii="GHEA Grapalat" w:eastAsia="Times New Roman" w:hAnsi="GHEA Grapalat" w:cs="Times New Roman"/>
-                <w:color w:val="000000"/>
-                <w:sz w:val="18"/>
-                <w:szCs w:val="18"/>
-                <w:lang w:val="hy-AM" w:eastAsia="ru-RU"/>
-              </w:rPr>
-            </w:pPr>
+              <w:jc w:val="both"/>
+              <w:rPr>
+                <w:rFonts w:ascii="GHEA Grapalat" w:eastAsia="Times New Roman" w:hAnsi="GHEA Grapalat" w:cs="Times New Roman"/>
+                <w:color w:val="000000"/>
+                <w:sz w:val="18"/>
+                <w:szCs w:val="18"/>
+                <w:lang w:val="hy-AM" w:eastAsia="ru-RU"/>
+              </w:rPr>
+            </w:pPr>
+            <w:r>
+              <w:rPr>
+                <w:rFonts w:ascii="GHEA Grapalat" w:eastAsia="Times New Roman" w:hAnsi="GHEA Grapalat" w:cs="Times New Roman"/>
+                <w:color w:val="000000"/>
+                <w:sz w:val="18"/>
+                <w:szCs w:val="18"/>
+                <w:lang w:val="hy-AM" w:eastAsia="ru-RU"/>
+              </w:rPr>
+              <w:t>անկյունագիծը՝ 23.8-24.0”դույմ,արձագանքման ժամանակը՝ 5ms և քիչ, FHD 1080*1920 հնարավորությամբ , IPS կամ VA մատրիցա , իրանի  գույնը՝ սև Philips 243V7QDSB</w:t>
+            </w:r>
+          </w:p>
+          <w:p>
+            <w:pPr>
+              <w:autoSpaceDE w:val="0"/>
+              <w:autoSpaceDN w:val="0"/>
+              <w:adjustRightInd w:val="0"/>
+              <w:spacing w:after="0" w:line="240" w:lineRule="auto"/>
+              <w:jc w:val="both"/>
+              <w:rPr>
+                <w:rFonts w:ascii="GHEA Grapalat" w:eastAsia="Times New Roman" w:hAnsi="GHEA Grapalat" w:cs="Times New Roman"/>
+                <w:color w:val="000000"/>
+                <w:sz w:val="18"/>
+                <w:szCs w:val="18"/>
+                <w:lang w:val="hy-AM" w:eastAsia="ru-RU"/>
+              </w:rPr>
+            </w:pPr>
+            <w:r>
+              <w:rPr>
+                <w:rFonts w:ascii="GHEA Grapalat" w:eastAsia="Times New Roman" w:hAnsi="GHEA Grapalat" w:cs="Times New Roman"/>
+                <w:color w:val="000000"/>
+                <w:sz w:val="18"/>
+                <w:szCs w:val="18"/>
+                <w:lang w:val="hy-AM" w:eastAsia="ru-RU"/>
+              </w:rPr>
+              <w:t>կամ համաիժեք Dahua DHI-LM24-A221Y</w:t>
+            </w:r>
           </w:p>
         </w:tc>
         <w:tc>
@@ -1472,6 +1058,16 @@
                 <w:lang w:val="hy-AM" w:eastAsia="ru-RU"/>
               </w:rPr>
             </w:pPr>
+            <w:r>
+              <w:rPr>
+                <w:rFonts w:ascii="GHEA Grapalat" w:eastAsia="Times New Roman" w:hAnsi="GHEA Grapalat" w:cs="Times New Roman"/>
+                <w:color w:val="000000"/>
+                <w:sz w:val="18"/>
+                <w:szCs w:val="18"/>
+                <w:lang w:val="hy-AM" w:eastAsia="ru-RU"/>
+              </w:rPr>
+              <w:t>հատ</w:t>
+            </w:r>
           </w:p>
         </w:tc>
         <w:tc>
@@ -1494,6 +1090,16 @@
                 <w:lang w:val="hy-AM" w:eastAsia="ru-RU"/>
               </w:rPr>
             </w:pPr>
+            <w:r>
+              <w:rPr>
+                <w:rFonts w:ascii="GHEA Grapalat" w:eastAsia="Times New Roman" w:hAnsi="GHEA Grapalat" w:cs="Times New Roman"/>
+                <w:color w:val="000000"/>
+                <w:sz w:val="18"/>
+                <w:szCs w:val="18"/>
+                <w:lang w:val="hy-AM" w:eastAsia="ru-RU"/>
+              </w:rPr>
+              <w:t>40 000</w:t>
+            </w:r>
           </w:p>
         </w:tc>
         <w:tc>
@@ -1516,6 +1122,36 @@
                 <w:lang w:val="hy-AM" w:eastAsia="ru-RU"/>
               </w:rPr>
             </w:pPr>
+            <w:r>
+              <w:rPr>
+                <w:rFonts w:ascii="GHEA Grapalat" w:eastAsia="Times New Roman" w:hAnsi="GHEA Grapalat" w:cs="Times New Roman"/>
+                <w:color w:val="000000"/>
+                <w:sz w:val="18"/>
+                <w:szCs w:val="18"/>
+                <w:lang w:val="hy-AM" w:eastAsia="ru-RU"/>
+              </w:rPr>
+              <w:t>800</w:t>
+            </w:r>
+            <w:r>
+              <w:rPr>
+                <w:rFonts w:ascii="GHEA Grapalat" w:eastAsia="Times New Roman" w:hAnsi="GHEA Grapalat" w:cs="Times New Roman"/>
+                <w:color w:val="000000"/>
+                <w:sz w:val="18"/>
+                <w:szCs w:val="18"/>
+                <w:lang w:val="hy-AM" w:eastAsia="ru-RU"/>
+              </w:rPr>
+              <w:t xml:space="preserve"> </w:t>
+            </w:r>
+            <w:r>
+              <w:rPr>
+                <w:rFonts w:ascii="GHEA Grapalat" w:eastAsia="Times New Roman" w:hAnsi="GHEA Grapalat" w:cs="Times New Roman"/>
+                <w:color w:val="000000"/>
+                <w:sz w:val="18"/>
+                <w:szCs w:val="18"/>
+                <w:lang w:val="hy-AM" w:eastAsia="ru-RU"/>
+              </w:rPr>
+              <w:t>000</w:t>
+            </w:r>
           </w:p>
         </w:tc>
         <w:tc>
@@ -1538,6 +1174,16 @@
                 <w:lang w:val="hy-AM" w:eastAsia="ru-RU"/>
               </w:rPr>
             </w:pPr>
+            <w:r>
+              <w:rPr>
+                <w:rFonts w:ascii="GHEA Grapalat" w:eastAsia="Times New Roman" w:hAnsi="GHEA Grapalat" w:cs="Times New Roman"/>
+                <w:color w:val="000000"/>
+                <w:sz w:val="18"/>
+                <w:szCs w:val="18"/>
+                <w:lang w:val="hy-AM" w:eastAsia="ru-RU"/>
+              </w:rPr>
+              <w:t>20</w:t>
+            </w:r>
           </w:p>
         </w:tc>
         <w:tc>
@@ -1560,18 +1206,2574 @@
                 <w:lang w:val="hy-AM" w:eastAsia="ru-RU"/>
               </w:rPr>
             </w:pPr>
+            <w:r>
+              <w:rPr>
+                <w:rFonts w:ascii="GHEA Grapalat" w:eastAsia="Times New Roman" w:hAnsi="GHEA Grapalat" w:cs="Times New Roman"/>
+                <w:color w:val="000000"/>
+                <w:sz w:val="18"/>
+                <w:szCs w:val="18"/>
+                <w:lang w:val="hy-AM" w:eastAsia="ru-RU"/>
+              </w:rPr>
+              <w:t>համաձայնագրի կնքման օրվանից 20 օր</w:t>
+            </w:r>
+          </w:p>
+        </w:tc>
+      </w:tr>
+      <w:tr>
+        <w:trPr>
+          <w:trHeight w:val="246"/>
+          <w:jc w:val="center"/>
+        </w:trPr>
+        <w:tc>
+          <w:tcPr>
+            <w:tcW w:w="531" w:type="dxa"/>
+            <w:vAlign w:val="center"/>
+          </w:tcPr>
+          <w:p>
+            <w:pPr>
+              <w:autoSpaceDE w:val="0"/>
+              <w:autoSpaceDN w:val="0"/>
+              <w:adjustRightInd w:val="0"/>
+              <w:spacing w:after="0" w:line="240" w:lineRule="auto"/>
+              <w:jc w:val="center"/>
+              <w:rPr>
+                <w:rFonts w:ascii="GHEA Grapalat" w:eastAsia="Times New Roman" w:hAnsi="GHEA Grapalat" w:cs="Times New Roman"/>
+                <w:color w:val="000000"/>
+                <w:sz w:val="18"/>
+                <w:szCs w:val="18"/>
+                <w:lang w:val="hy-AM" w:eastAsia="ru-RU"/>
+              </w:rPr>
+            </w:pPr>
+            <w:r>
+              <w:rPr>
+                <w:rFonts w:ascii="GHEA Grapalat" w:eastAsia="Times New Roman" w:hAnsi="GHEA Grapalat" w:cs="Times New Roman"/>
+                <w:color w:val="000000"/>
+                <w:sz w:val="18"/>
+                <w:szCs w:val="18"/>
+                <w:lang w:val="hy-AM" w:eastAsia="ru-RU"/>
+              </w:rPr>
+              <w:t>3</w:t>
+            </w:r>
+          </w:p>
+        </w:tc>
+        <w:tc>
+          <w:tcPr>
+            <w:tcW w:w="2016" w:type="dxa"/>
+            <w:vAlign w:val="center"/>
+          </w:tcPr>
+          <w:p>
+            <w:pPr>
+              <w:autoSpaceDE w:val="0"/>
+              <w:autoSpaceDN w:val="0"/>
+              <w:adjustRightInd w:val="0"/>
+              <w:spacing w:after="0" w:line="240" w:lineRule="auto"/>
+              <w:jc w:val="center"/>
+              <w:rPr>
+                <w:rFonts w:ascii="GHEA Grapalat" w:eastAsia="Times New Roman" w:hAnsi="GHEA Grapalat" w:cs="Times New Roman"/>
+                <w:color w:val="000000"/>
+                <w:sz w:val="18"/>
+                <w:szCs w:val="18"/>
+                <w:lang w:val="hy-AM" w:eastAsia="ru-RU"/>
+              </w:rPr>
+            </w:pPr>
+            <w:r>
+              <w:rPr>
+                <w:rFonts w:ascii="GHEA Grapalat" w:eastAsia="Times New Roman" w:hAnsi="GHEA Grapalat" w:cs="Times New Roman"/>
+                <w:color w:val="000000"/>
+                <w:sz w:val="18"/>
+                <w:szCs w:val="18"/>
+                <w:lang w:val="hy-AM" w:eastAsia="ru-RU"/>
+              </w:rPr>
+              <w:t>համակարգիչների մասեր</w:t>
+            </w:r>
+          </w:p>
+        </w:tc>
+        <w:tc>
+          <w:tcPr>
+            <w:tcW w:w="7371" w:type="dxa"/>
+            <w:vAlign w:val="center"/>
+          </w:tcPr>
+          <w:p>
+            <w:pPr>
+              <w:autoSpaceDE w:val="0"/>
+              <w:autoSpaceDN w:val="0"/>
+              <w:adjustRightInd w:val="0"/>
+              <w:spacing w:after="0" w:line="240" w:lineRule="auto"/>
+              <w:jc w:val="both"/>
+              <w:rPr>
+                <w:rFonts w:ascii="GHEA Grapalat" w:eastAsia="Times New Roman" w:hAnsi="GHEA Grapalat" w:cs="Times New Roman"/>
+                <w:color w:val="000000"/>
+                <w:sz w:val="18"/>
+                <w:szCs w:val="18"/>
+                <w:lang w:val="hy-AM" w:eastAsia="ru-RU"/>
+              </w:rPr>
+            </w:pPr>
+            <w:r>
+              <w:rPr>
+                <w:rFonts w:ascii="GHEA Grapalat" w:eastAsia="Times New Roman" w:hAnsi="GHEA Grapalat" w:cs="Times New Roman"/>
+                <w:color w:val="000000"/>
+                <w:sz w:val="18"/>
+                <w:szCs w:val="18"/>
+                <w:lang w:val="hy-AM" w:eastAsia="ru-RU"/>
+              </w:rPr>
+              <w:t>երկարությունը՝ 1,8մ:  5 և ավել վարդակով, հողանցումով: Անվտանգության աստիճան-IP20: Հզորությունը 2.2ԿՎտ: Նախատեսված 220վ-ի համար: լարը՝ 3х0.75 мм²</w:t>
+            </w:r>
+          </w:p>
+        </w:tc>
+        <w:tc>
+          <w:tcPr>
+            <w:tcW w:w="850" w:type="dxa"/>
+            <w:vAlign w:val="center"/>
+          </w:tcPr>
+          <w:p>
+            <w:pPr>
+              <w:autoSpaceDE w:val="0"/>
+              <w:autoSpaceDN w:val="0"/>
+              <w:adjustRightInd w:val="0"/>
+              <w:spacing w:after="0" w:line="240" w:lineRule="auto"/>
+              <w:jc w:val="center"/>
+              <w:rPr>
+                <w:rFonts w:ascii="GHEA Grapalat" w:eastAsia="Times New Roman" w:hAnsi="GHEA Grapalat" w:cs="Times New Roman"/>
+                <w:color w:val="000000"/>
+                <w:sz w:val="18"/>
+                <w:szCs w:val="18"/>
+                <w:lang w:val="hy-AM" w:eastAsia="ru-RU"/>
+              </w:rPr>
+            </w:pPr>
+            <w:r>
+              <w:rPr>
+                <w:rFonts w:ascii="GHEA Grapalat" w:eastAsia="Times New Roman" w:hAnsi="GHEA Grapalat" w:cs="Times New Roman"/>
+                <w:color w:val="000000"/>
+                <w:sz w:val="18"/>
+                <w:szCs w:val="18"/>
+                <w:lang w:val="hy-AM" w:eastAsia="ru-RU"/>
+              </w:rPr>
+              <w:t>հատ</w:t>
+            </w:r>
+          </w:p>
+        </w:tc>
+        <w:tc>
+          <w:tcPr>
+            <w:tcW w:w="993" w:type="dxa"/>
+            <w:vAlign w:val="center"/>
+          </w:tcPr>
+          <w:p>
+            <w:pPr>
+              <w:autoSpaceDE w:val="0"/>
+              <w:autoSpaceDN w:val="0"/>
+              <w:adjustRightInd w:val="0"/>
+              <w:spacing w:after="0" w:line="240" w:lineRule="auto"/>
+              <w:jc w:val="center"/>
+              <w:rPr>
+                <w:rFonts w:ascii="GHEA Grapalat" w:eastAsia="Times New Roman" w:hAnsi="GHEA Grapalat" w:cs="Times New Roman"/>
+                <w:color w:val="000000"/>
+                <w:sz w:val="18"/>
+                <w:szCs w:val="18"/>
+                <w:lang w:val="hy-AM" w:eastAsia="ru-RU"/>
+              </w:rPr>
+            </w:pPr>
+            <w:r>
+              <w:rPr>
+                <w:rFonts w:ascii="GHEA Grapalat" w:eastAsia="Times New Roman" w:hAnsi="GHEA Grapalat" w:cs="Times New Roman"/>
+                <w:color w:val="000000"/>
+                <w:sz w:val="18"/>
+                <w:szCs w:val="18"/>
+                <w:lang w:val="hy-AM" w:eastAsia="ru-RU"/>
+              </w:rPr>
+              <w:t>2 500</w:t>
+            </w:r>
+          </w:p>
+        </w:tc>
+        <w:tc>
+          <w:tcPr>
+            <w:tcW w:w="1275" w:type="dxa"/>
+            <w:vAlign w:val="center"/>
+          </w:tcPr>
+          <w:p>
+            <w:pPr>
+              <w:autoSpaceDE w:val="0"/>
+              <w:autoSpaceDN w:val="0"/>
+              <w:adjustRightInd w:val="0"/>
+              <w:spacing w:after="0" w:line="240" w:lineRule="auto"/>
+              <w:jc w:val="center"/>
+              <w:rPr>
+                <w:rFonts w:ascii="GHEA Grapalat" w:eastAsia="Times New Roman" w:hAnsi="GHEA Grapalat" w:cs="Times New Roman"/>
+                <w:color w:val="000000"/>
+                <w:sz w:val="18"/>
+                <w:szCs w:val="18"/>
+                <w:lang w:val="hy-AM" w:eastAsia="ru-RU"/>
+              </w:rPr>
+            </w:pPr>
+            <w:r>
+              <w:rPr>
+                <w:rFonts w:ascii="GHEA Grapalat" w:eastAsia="Times New Roman" w:hAnsi="GHEA Grapalat" w:cs="Times New Roman"/>
+                <w:color w:val="000000"/>
+                <w:sz w:val="18"/>
+                <w:szCs w:val="18"/>
+                <w:lang w:val="hy-AM" w:eastAsia="ru-RU"/>
+              </w:rPr>
+              <w:t>50</w:t>
+            </w:r>
+            <w:r>
+              <w:rPr>
+                <w:rFonts w:ascii="GHEA Grapalat" w:eastAsia="Times New Roman" w:hAnsi="GHEA Grapalat" w:cs="Times New Roman"/>
+                <w:color w:val="000000"/>
+                <w:sz w:val="18"/>
+                <w:szCs w:val="18"/>
+                <w:lang w:val="hy-AM" w:eastAsia="ru-RU"/>
+              </w:rPr>
+              <w:t xml:space="preserve"> </w:t>
+            </w:r>
+            <w:r>
+              <w:rPr>
+                <w:rFonts w:ascii="GHEA Grapalat" w:eastAsia="Times New Roman" w:hAnsi="GHEA Grapalat" w:cs="Times New Roman"/>
+                <w:color w:val="000000"/>
+                <w:sz w:val="18"/>
+                <w:szCs w:val="18"/>
+                <w:lang w:val="hy-AM" w:eastAsia="ru-RU"/>
+              </w:rPr>
+              <w:t>000</w:t>
+            </w:r>
+          </w:p>
+        </w:tc>
+        <w:tc>
+          <w:tcPr>
+            <w:tcW w:w="1134" w:type="dxa"/>
+            <w:vAlign w:val="center"/>
+          </w:tcPr>
+          <w:p>
+            <w:pPr>
+              <w:autoSpaceDE w:val="0"/>
+              <w:autoSpaceDN w:val="0"/>
+              <w:adjustRightInd w:val="0"/>
+              <w:spacing w:after="0" w:line="240" w:lineRule="auto"/>
+              <w:jc w:val="center"/>
+              <w:rPr>
+                <w:rFonts w:ascii="GHEA Grapalat" w:eastAsia="Times New Roman" w:hAnsi="GHEA Grapalat" w:cs="Times New Roman"/>
+                <w:color w:val="000000"/>
+                <w:sz w:val="18"/>
+                <w:szCs w:val="18"/>
+                <w:lang w:val="hy-AM" w:eastAsia="ru-RU"/>
+              </w:rPr>
+            </w:pPr>
+            <w:r>
+              <w:rPr>
+                <w:rFonts w:ascii="GHEA Grapalat" w:eastAsia="Times New Roman" w:hAnsi="GHEA Grapalat" w:cs="Times New Roman"/>
+                <w:color w:val="000000"/>
+                <w:sz w:val="18"/>
+                <w:szCs w:val="18"/>
+                <w:lang w:val="hy-AM" w:eastAsia="ru-RU"/>
+              </w:rPr>
+              <w:t>20</w:t>
+            </w:r>
+          </w:p>
+        </w:tc>
+        <w:tc>
+          <w:tcPr>
+            <w:tcW w:w="1985" w:type="dxa"/>
+            <w:vAlign w:val="center"/>
+          </w:tcPr>
+          <w:p>
+            <w:pPr>
+              <w:autoSpaceDE w:val="0"/>
+              <w:autoSpaceDN w:val="0"/>
+              <w:adjustRightInd w:val="0"/>
+              <w:spacing w:after="0" w:line="240" w:lineRule="auto"/>
+              <w:jc w:val="center"/>
+              <w:rPr>
+                <w:rFonts w:ascii="GHEA Grapalat" w:eastAsia="Times New Roman" w:hAnsi="GHEA Grapalat" w:cs="Times New Roman"/>
+                <w:color w:val="000000"/>
+                <w:sz w:val="18"/>
+                <w:szCs w:val="18"/>
+                <w:lang w:val="hy-AM" w:eastAsia="ru-RU"/>
+              </w:rPr>
+            </w:pPr>
+            <w:r>
+              <w:rPr>
+                <w:rFonts w:ascii="GHEA Grapalat" w:eastAsia="Times New Roman" w:hAnsi="GHEA Grapalat" w:cs="Times New Roman"/>
+                <w:color w:val="000000"/>
+                <w:sz w:val="18"/>
+                <w:szCs w:val="18"/>
+                <w:lang w:val="hy-AM" w:eastAsia="ru-RU"/>
+              </w:rPr>
+              <w:t>համաձայնագրի կնքման օրվանից 20 օր</w:t>
+            </w:r>
+          </w:p>
+        </w:tc>
+      </w:tr>
+      <w:tr>
+        <w:trPr>
+          <w:trHeight w:val="246"/>
+          <w:jc w:val="center"/>
+        </w:trPr>
+        <w:tc>
+          <w:tcPr>
+            <w:tcW w:w="531" w:type="dxa"/>
+            <w:vAlign w:val="center"/>
+          </w:tcPr>
+          <w:p>
+            <w:pPr>
+              <w:autoSpaceDE w:val="0"/>
+              <w:autoSpaceDN w:val="0"/>
+              <w:adjustRightInd w:val="0"/>
+              <w:spacing w:after="0" w:line="240" w:lineRule="auto"/>
+              <w:jc w:val="center"/>
+              <w:rPr>
+                <w:rFonts w:ascii="GHEA Grapalat" w:eastAsia="Times New Roman" w:hAnsi="GHEA Grapalat" w:cs="Times New Roman"/>
+                <w:color w:val="000000"/>
+                <w:sz w:val="18"/>
+                <w:szCs w:val="18"/>
+                <w:lang w:val="hy-AM" w:eastAsia="ru-RU"/>
+              </w:rPr>
+            </w:pPr>
+            <w:r>
+              <w:rPr>
+                <w:rFonts w:ascii="GHEA Grapalat" w:eastAsia="Times New Roman" w:hAnsi="GHEA Grapalat" w:cs="Times New Roman"/>
+                <w:color w:val="000000"/>
+                <w:sz w:val="18"/>
+                <w:szCs w:val="18"/>
+                <w:lang w:val="hy-AM" w:eastAsia="ru-RU"/>
+              </w:rPr>
+              <w:t>4</w:t>
+            </w:r>
+          </w:p>
+        </w:tc>
+        <w:tc>
+          <w:tcPr>
+            <w:tcW w:w="2016" w:type="dxa"/>
+            <w:vAlign w:val="center"/>
+          </w:tcPr>
+          <w:p>
+            <w:pPr>
+              <w:autoSpaceDE w:val="0"/>
+              <w:autoSpaceDN w:val="0"/>
+              <w:adjustRightInd w:val="0"/>
+              <w:spacing w:after="0" w:line="240" w:lineRule="auto"/>
+              <w:jc w:val="center"/>
+              <w:rPr>
+                <w:rFonts w:ascii="GHEA Grapalat" w:eastAsia="Times New Roman" w:hAnsi="GHEA Grapalat" w:cs="Times New Roman"/>
+                <w:color w:val="000000"/>
+                <w:sz w:val="18"/>
+                <w:szCs w:val="18"/>
+                <w:lang w:val="hy-AM" w:eastAsia="ru-RU"/>
+              </w:rPr>
+            </w:pPr>
+            <w:r>
+              <w:rPr>
+                <w:rFonts w:ascii="GHEA Grapalat" w:eastAsia="Times New Roman" w:hAnsi="GHEA Grapalat" w:cs="Times New Roman"/>
+                <w:color w:val="000000"/>
+                <w:sz w:val="18"/>
+                <w:szCs w:val="18"/>
+                <w:lang w:val="hy-AM" w:eastAsia="ru-RU"/>
+              </w:rPr>
+              <w:t>տպիչ սարք, բազմաֆունկցիոնալ, A4, 35 էջ/րոպե արագության</w:t>
+            </w:r>
+          </w:p>
+        </w:tc>
+        <w:tc>
+          <w:tcPr>
+            <w:tcW w:w="7371" w:type="dxa"/>
+            <w:vAlign w:val="center"/>
+          </w:tcPr>
+          <w:p>
+            <w:pPr>
+              <w:autoSpaceDE w:val="0"/>
+              <w:autoSpaceDN w:val="0"/>
+              <w:adjustRightInd w:val="0"/>
+              <w:spacing w:after="0" w:line="240" w:lineRule="auto"/>
+              <w:jc w:val="both"/>
+              <w:rPr>
+                <w:rFonts w:ascii="GHEA Grapalat" w:eastAsia="Times New Roman" w:hAnsi="GHEA Grapalat" w:cs="Times New Roman"/>
+                <w:color w:val="000000"/>
+                <w:sz w:val="18"/>
+                <w:szCs w:val="18"/>
+                <w:lang w:val="hy-AM" w:eastAsia="ru-RU"/>
+              </w:rPr>
+            </w:pPr>
+            <w:r>
+              <w:rPr>
+                <w:rFonts w:ascii="GHEA Grapalat" w:eastAsia="Times New Roman" w:hAnsi="GHEA Grapalat" w:cs="Times New Roman"/>
+                <w:color w:val="000000"/>
+                <w:sz w:val="18"/>
+                <w:szCs w:val="18"/>
+                <w:lang w:val="hy-AM" w:eastAsia="ru-RU"/>
+              </w:rPr>
+              <w:t>Canon MF 275Dw կամ համարժեք Brother MFC-L2860DW: Լազերային, սեվ և սպիտակ, երկկողմանի տպագրության հնարավորությունով (Duplex), մաքսիմալ չափը A4 , քարթրիջ՝ 071, մեկ կտորից, առանց չիպի, գույնը սև: Արտադրողականությունը 20</w:t>
+            </w:r>
+            <w:r>
+              <w:rPr>
+                <w:rFonts w:ascii="Calibri" w:eastAsia="Times New Roman" w:hAnsi="Calibri" w:cs="Calibri"/>
+                <w:color w:val="000000"/>
+                <w:sz w:val="18"/>
+                <w:szCs w:val="18"/>
+                <w:lang w:val="hy-AM" w:eastAsia="ru-RU"/>
+              </w:rPr>
+              <w:t> </w:t>
+            </w:r>
+            <w:r>
+              <w:rPr>
+                <w:rFonts w:ascii="GHEA Grapalat" w:eastAsia="Times New Roman" w:hAnsi="GHEA Grapalat" w:cs="Times New Roman"/>
+                <w:color w:val="000000"/>
+                <w:sz w:val="18"/>
+                <w:szCs w:val="18"/>
+                <w:lang w:val="hy-AM" w:eastAsia="ru-RU"/>
+              </w:rPr>
+              <w:t>000 թերթ ամսում, սկանավորման արագությունը 2.7 վրկ/թ, սկանավորման աուտոմատ մատակարարման հնարավորությամբ:</w:t>
+            </w:r>
+          </w:p>
+        </w:tc>
+        <w:tc>
+          <w:tcPr>
+            <w:tcW w:w="850" w:type="dxa"/>
+            <w:vAlign w:val="center"/>
+          </w:tcPr>
+          <w:p>
+            <w:pPr>
+              <w:autoSpaceDE w:val="0"/>
+              <w:autoSpaceDN w:val="0"/>
+              <w:adjustRightInd w:val="0"/>
+              <w:spacing w:after="0" w:line="240" w:lineRule="auto"/>
+              <w:jc w:val="center"/>
+              <w:rPr>
+                <w:rFonts w:ascii="GHEA Grapalat" w:eastAsia="Times New Roman" w:hAnsi="GHEA Grapalat" w:cs="Times New Roman"/>
+                <w:color w:val="000000"/>
+                <w:sz w:val="18"/>
+                <w:szCs w:val="18"/>
+                <w:lang w:val="hy-AM" w:eastAsia="ru-RU"/>
+              </w:rPr>
+            </w:pPr>
+            <w:r>
+              <w:rPr>
+                <w:rFonts w:ascii="GHEA Grapalat" w:eastAsia="Times New Roman" w:hAnsi="GHEA Grapalat" w:cs="Times New Roman"/>
+                <w:color w:val="000000"/>
+                <w:sz w:val="18"/>
+                <w:szCs w:val="18"/>
+                <w:lang w:val="hy-AM" w:eastAsia="ru-RU"/>
+              </w:rPr>
+              <w:t>հատ</w:t>
+            </w:r>
+          </w:p>
+        </w:tc>
+        <w:tc>
+          <w:tcPr>
+            <w:tcW w:w="993" w:type="dxa"/>
+            <w:vAlign w:val="center"/>
+          </w:tcPr>
+          <w:p>
+            <w:pPr>
+              <w:autoSpaceDE w:val="0"/>
+              <w:autoSpaceDN w:val="0"/>
+              <w:adjustRightInd w:val="0"/>
+              <w:spacing w:after="0" w:line="240" w:lineRule="auto"/>
+              <w:jc w:val="center"/>
+              <w:rPr>
+                <w:rFonts w:ascii="GHEA Grapalat" w:eastAsia="Times New Roman" w:hAnsi="GHEA Grapalat" w:cs="Times New Roman"/>
+                <w:color w:val="000000"/>
+                <w:sz w:val="18"/>
+                <w:szCs w:val="18"/>
+                <w:lang w:val="hy-AM" w:eastAsia="ru-RU"/>
+              </w:rPr>
+            </w:pPr>
+            <w:r>
+              <w:rPr>
+                <w:rFonts w:ascii="GHEA Grapalat" w:eastAsia="Times New Roman" w:hAnsi="GHEA Grapalat" w:cs="Times New Roman"/>
+                <w:color w:val="000000"/>
+                <w:sz w:val="18"/>
+                <w:szCs w:val="18"/>
+                <w:lang w:val="hy-AM" w:eastAsia="ru-RU"/>
+              </w:rPr>
+              <w:t>140 000</w:t>
+            </w:r>
+          </w:p>
+        </w:tc>
+        <w:tc>
+          <w:tcPr>
+            <w:tcW w:w="1275" w:type="dxa"/>
+            <w:vAlign w:val="center"/>
+          </w:tcPr>
+          <w:p>
+            <w:pPr>
+              <w:autoSpaceDE w:val="0"/>
+              <w:autoSpaceDN w:val="0"/>
+              <w:adjustRightInd w:val="0"/>
+              <w:spacing w:after="0" w:line="240" w:lineRule="auto"/>
+              <w:jc w:val="center"/>
+              <w:rPr>
+                <w:rFonts w:ascii="GHEA Grapalat" w:eastAsia="Times New Roman" w:hAnsi="GHEA Grapalat" w:cs="Times New Roman"/>
+                <w:color w:val="000000"/>
+                <w:sz w:val="18"/>
+                <w:szCs w:val="18"/>
+                <w:lang w:val="hy-AM" w:eastAsia="ru-RU"/>
+              </w:rPr>
+            </w:pPr>
+            <w:r>
+              <w:rPr>
+                <w:rFonts w:ascii="GHEA Grapalat" w:eastAsia="Times New Roman" w:hAnsi="GHEA Grapalat" w:cs="Times New Roman"/>
+                <w:color w:val="000000"/>
+                <w:sz w:val="18"/>
+                <w:szCs w:val="18"/>
+                <w:lang w:val="hy-AM" w:eastAsia="ru-RU"/>
+              </w:rPr>
+              <w:t>2</w:t>
+            </w:r>
+            <w:r>
+              <w:rPr>
+                <w:rFonts w:ascii="GHEA Grapalat" w:eastAsia="Times New Roman" w:hAnsi="GHEA Grapalat" w:cs="Times New Roman"/>
+                <w:color w:val="000000"/>
+                <w:sz w:val="18"/>
+                <w:szCs w:val="18"/>
+                <w:lang w:val="hy-AM" w:eastAsia="ru-RU"/>
+              </w:rPr>
+              <w:t xml:space="preserve"> </w:t>
+            </w:r>
+            <w:r>
+              <w:rPr>
+                <w:rFonts w:ascii="GHEA Grapalat" w:eastAsia="Times New Roman" w:hAnsi="GHEA Grapalat" w:cs="Times New Roman"/>
+                <w:color w:val="000000"/>
+                <w:sz w:val="18"/>
+                <w:szCs w:val="18"/>
+                <w:lang w:val="hy-AM" w:eastAsia="ru-RU"/>
+              </w:rPr>
+              <w:t>100</w:t>
+            </w:r>
+            <w:r>
+              <w:rPr>
+                <w:rFonts w:ascii="GHEA Grapalat" w:eastAsia="Times New Roman" w:hAnsi="GHEA Grapalat" w:cs="Times New Roman"/>
+                <w:color w:val="000000"/>
+                <w:sz w:val="18"/>
+                <w:szCs w:val="18"/>
+                <w:lang w:val="hy-AM" w:eastAsia="ru-RU"/>
+              </w:rPr>
+              <w:t xml:space="preserve"> </w:t>
+            </w:r>
+            <w:r>
+              <w:rPr>
+                <w:rFonts w:ascii="GHEA Grapalat" w:eastAsia="Times New Roman" w:hAnsi="GHEA Grapalat" w:cs="Times New Roman"/>
+                <w:color w:val="000000"/>
+                <w:sz w:val="18"/>
+                <w:szCs w:val="18"/>
+                <w:lang w:val="hy-AM" w:eastAsia="ru-RU"/>
+              </w:rPr>
+              <w:t>000</w:t>
+            </w:r>
+          </w:p>
+        </w:tc>
+        <w:tc>
+          <w:tcPr>
+            <w:tcW w:w="1134" w:type="dxa"/>
+            <w:vAlign w:val="center"/>
+          </w:tcPr>
+          <w:p>
+            <w:pPr>
+              <w:autoSpaceDE w:val="0"/>
+              <w:autoSpaceDN w:val="0"/>
+              <w:adjustRightInd w:val="0"/>
+              <w:spacing w:after="0" w:line="240" w:lineRule="auto"/>
+              <w:jc w:val="center"/>
+              <w:rPr>
+                <w:rFonts w:ascii="GHEA Grapalat" w:eastAsia="Times New Roman" w:hAnsi="GHEA Grapalat" w:cs="Times New Roman"/>
+                <w:color w:val="000000"/>
+                <w:sz w:val="18"/>
+                <w:szCs w:val="18"/>
+                <w:lang w:val="hy-AM" w:eastAsia="ru-RU"/>
+              </w:rPr>
+            </w:pPr>
+            <w:r>
+              <w:rPr>
+                <w:rFonts w:ascii="GHEA Grapalat" w:eastAsia="Times New Roman" w:hAnsi="GHEA Grapalat" w:cs="Times New Roman"/>
+                <w:color w:val="000000"/>
+                <w:sz w:val="18"/>
+                <w:szCs w:val="18"/>
+                <w:lang w:val="hy-AM" w:eastAsia="ru-RU"/>
+              </w:rPr>
+              <w:t>2</w:t>
+            </w:r>
+          </w:p>
+        </w:tc>
+        <w:tc>
+          <w:tcPr>
+            <w:tcW w:w="1985" w:type="dxa"/>
+            <w:vAlign w:val="center"/>
+          </w:tcPr>
+          <w:p>
+            <w:pPr>
+              <w:autoSpaceDE w:val="0"/>
+              <w:autoSpaceDN w:val="0"/>
+              <w:adjustRightInd w:val="0"/>
+              <w:spacing w:after="0" w:line="240" w:lineRule="auto"/>
+              <w:jc w:val="center"/>
+              <w:rPr>
+                <w:rFonts w:ascii="GHEA Grapalat" w:eastAsia="Times New Roman" w:hAnsi="GHEA Grapalat" w:cs="Times New Roman"/>
+                <w:color w:val="000000"/>
+                <w:sz w:val="18"/>
+                <w:szCs w:val="18"/>
+                <w:lang w:val="hy-AM" w:eastAsia="ru-RU"/>
+              </w:rPr>
+            </w:pPr>
+            <w:r>
+              <w:rPr>
+                <w:rFonts w:ascii="GHEA Grapalat" w:eastAsia="Times New Roman" w:hAnsi="GHEA Grapalat" w:cs="Times New Roman"/>
+                <w:color w:val="000000"/>
+                <w:sz w:val="18"/>
+                <w:szCs w:val="18"/>
+                <w:lang w:val="hy-AM" w:eastAsia="ru-RU"/>
+              </w:rPr>
+              <w:t>համաձայնագրի կնքման օրվանից 20 օր</w:t>
+            </w:r>
+          </w:p>
+        </w:tc>
+      </w:tr>
+      <w:tr>
+        <w:trPr>
+          <w:trHeight w:val="246"/>
+          <w:jc w:val="center"/>
+        </w:trPr>
+        <w:tc>
+          <w:tcPr>
+            <w:tcW w:w="531" w:type="dxa"/>
+            <w:vAlign w:val="center"/>
+          </w:tcPr>
+          <w:p>
+            <w:pPr>
+              <w:autoSpaceDE w:val="0"/>
+              <w:autoSpaceDN w:val="0"/>
+              <w:adjustRightInd w:val="0"/>
+              <w:spacing w:after="0" w:line="240" w:lineRule="auto"/>
+              <w:jc w:val="center"/>
+              <w:rPr>
+                <w:rFonts w:ascii="GHEA Grapalat" w:eastAsia="Times New Roman" w:hAnsi="GHEA Grapalat" w:cs="Times New Roman"/>
+                <w:color w:val="000000"/>
+                <w:sz w:val="18"/>
+                <w:szCs w:val="18"/>
+                <w:lang w:val="hy-AM" w:eastAsia="ru-RU"/>
+              </w:rPr>
+            </w:pPr>
+            <w:r>
+              <w:rPr>
+                <w:rFonts w:ascii="GHEA Grapalat" w:eastAsia="Times New Roman" w:hAnsi="GHEA Grapalat" w:cs="Times New Roman"/>
+                <w:color w:val="000000"/>
+                <w:sz w:val="18"/>
+                <w:szCs w:val="18"/>
+                <w:lang w:val="hy-AM" w:eastAsia="ru-RU"/>
+              </w:rPr>
+              <w:t>5</w:t>
+            </w:r>
+          </w:p>
+        </w:tc>
+        <w:tc>
+          <w:tcPr>
+            <w:tcW w:w="2016" w:type="dxa"/>
+            <w:vAlign w:val="center"/>
+          </w:tcPr>
+          <w:p>
+            <w:pPr>
+              <w:autoSpaceDE w:val="0"/>
+              <w:autoSpaceDN w:val="0"/>
+              <w:adjustRightInd w:val="0"/>
+              <w:spacing w:after="0" w:line="240" w:lineRule="auto"/>
+              <w:jc w:val="center"/>
+              <w:rPr>
+                <w:rFonts w:ascii="GHEA Grapalat" w:eastAsia="Times New Roman" w:hAnsi="GHEA Grapalat" w:cs="Times New Roman"/>
+                <w:color w:val="000000"/>
+                <w:sz w:val="18"/>
+                <w:szCs w:val="18"/>
+                <w:lang w:val="hy-AM" w:eastAsia="ru-RU"/>
+              </w:rPr>
+            </w:pPr>
+            <w:r>
+              <w:rPr>
+                <w:rFonts w:ascii="GHEA Grapalat" w:eastAsia="Times New Roman" w:hAnsi="GHEA Grapalat" w:cs="Times New Roman"/>
+                <w:color w:val="000000"/>
+                <w:sz w:val="18"/>
+                <w:szCs w:val="18"/>
+                <w:lang w:val="hy-AM" w:eastAsia="ru-RU"/>
+              </w:rPr>
+              <w:t>թվային բազմակողմանի սկավառակներ (dvd) կարդացող եւ (կամ) ձայնագրող սարքեր</w:t>
+            </w:r>
+          </w:p>
+        </w:tc>
+        <w:tc>
+          <w:tcPr>
+            <w:tcW w:w="7371" w:type="dxa"/>
+            <w:vAlign w:val="center"/>
+          </w:tcPr>
+          <w:p>
+            <w:pPr>
+              <w:autoSpaceDE w:val="0"/>
+              <w:autoSpaceDN w:val="0"/>
+              <w:adjustRightInd w:val="0"/>
+              <w:spacing w:after="0" w:line="240" w:lineRule="auto"/>
+              <w:jc w:val="both"/>
+              <w:rPr>
+                <w:rFonts w:ascii="GHEA Grapalat" w:eastAsia="Times New Roman" w:hAnsi="GHEA Grapalat" w:cs="Times New Roman"/>
+                <w:sz w:val="18"/>
+                <w:szCs w:val="18"/>
+                <w:lang w:val="hy-AM" w:eastAsia="ru-RU"/>
+              </w:rPr>
+            </w:pPr>
+            <w:r>
+              <w:rPr>
+                <w:rFonts w:ascii="GHEA Grapalat" w:eastAsia="Times New Roman" w:hAnsi="GHEA Grapalat" w:cs="Times New Roman"/>
+                <w:color w:val="000000"/>
+                <w:sz w:val="18"/>
+                <w:szCs w:val="18"/>
+                <w:lang w:val="hy-AM" w:eastAsia="ru-RU"/>
+              </w:rPr>
+              <w:t xml:space="preserve">գրող և կարդացող, կորպորատիվ համակարգչի համար, ներկառուցվող, SATA </w:t>
+            </w:r>
+            <w:r>
+              <w:rPr>
+                <w:rFonts w:ascii="GHEA Grapalat" w:eastAsia="Times New Roman" w:hAnsi="GHEA Grapalat" w:cs="Times New Roman"/>
+                <w:color w:val="000000"/>
+                <w:sz w:val="18"/>
+                <w:szCs w:val="18"/>
+                <w:lang w:val="hy-AM" w:eastAsia="ru-RU"/>
+              </w:rPr>
+              <w:fldChar w:fldCharType="begin"/>
+            </w:r>
+            <w:r>
+              <w:rPr>
+                <w:rFonts w:ascii="GHEA Grapalat" w:eastAsia="Times New Roman" w:hAnsi="GHEA Grapalat" w:cs="Times New Roman"/>
+                <w:color w:val="000000"/>
+                <w:sz w:val="18"/>
+                <w:szCs w:val="18"/>
+                <w:lang w:val="hy-AM" w:eastAsia="ru-RU"/>
+              </w:rPr>
+              <w:instrText xml:space="preserve"> HYPERLINK "https://am.ozon.com/product/vnutrenniy-opticheskiy-privod-dvd-rw-lg-gh24nsd-sata-chernyy-novyy-1634418719/?at=1ruj1VAeyD_xeGOCCZjKxy7aN37u5QnG" \t "_blank" </w:instrText>
+            </w:r>
+            <w:r>
+              <w:rPr>
+                <w:rFonts w:ascii="GHEA Grapalat" w:eastAsia="Times New Roman" w:hAnsi="GHEA Grapalat" w:cs="Times New Roman"/>
+                <w:color w:val="000000"/>
+                <w:sz w:val="18"/>
+                <w:szCs w:val="18"/>
+                <w:lang w:val="hy-AM" w:eastAsia="ru-RU"/>
+              </w:rPr>
+              <w:fldChar w:fldCharType="separate"/>
+            </w:r>
+          </w:p>
+          <w:p>
+            <w:pPr>
+              <w:autoSpaceDE w:val="0"/>
+              <w:autoSpaceDN w:val="0"/>
+              <w:adjustRightInd w:val="0"/>
+              <w:spacing w:after="0" w:line="240" w:lineRule="auto"/>
+              <w:jc w:val="both"/>
+              <w:rPr>
+                <w:rFonts w:ascii="GHEA Grapalat" w:eastAsia="Times New Roman" w:hAnsi="GHEA Grapalat" w:cs="Times New Roman"/>
+                <w:color w:val="000000"/>
+                <w:sz w:val="18"/>
+                <w:szCs w:val="18"/>
+                <w:lang w:val="hy-AM" w:eastAsia="ru-RU"/>
+              </w:rPr>
+            </w:pPr>
+            <w:r>
+              <w:rPr>
+                <w:rFonts w:ascii="GHEA Grapalat" w:eastAsia="Times New Roman" w:hAnsi="GHEA Grapalat" w:cs="Times New Roman"/>
+                <w:sz w:val="18"/>
+                <w:szCs w:val="18"/>
+                <w:lang w:val="hy-AM" w:eastAsia="ru-RU"/>
+              </w:rPr>
+              <w:t>DVD-RW LG GH24NSD</w:t>
+            </w:r>
+            <w:r>
+              <w:rPr>
+                <w:rFonts w:ascii="GHEA Grapalat" w:eastAsia="Times New Roman" w:hAnsi="GHEA Grapalat" w:cs="Times New Roman"/>
+                <w:color w:val="000000"/>
+                <w:sz w:val="18"/>
+                <w:szCs w:val="18"/>
+                <w:lang w:val="hy-AM" w:eastAsia="ru-RU"/>
+              </w:rPr>
+              <w:fldChar w:fldCharType="end"/>
+            </w:r>
+            <w:r>
+              <w:rPr>
+                <w:rFonts w:ascii="GHEA Grapalat" w:eastAsia="Times New Roman" w:hAnsi="GHEA Grapalat" w:cs="Times New Roman"/>
+                <w:color w:val="000000"/>
+                <w:sz w:val="18"/>
+                <w:szCs w:val="18"/>
+                <w:lang w:val="hy-AM" w:eastAsia="ru-RU"/>
+              </w:rPr>
+              <w:t xml:space="preserve"> Կամ համարժեք Liteon</w:t>
+            </w:r>
+          </w:p>
+          <w:p>
+            <w:pPr>
+              <w:autoSpaceDE w:val="0"/>
+              <w:autoSpaceDN w:val="0"/>
+              <w:adjustRightInd w:val="0"/>
+              <w:spacing w:after="0" w:line="240" w:lineRule="auto"/>
+              <w:jc w:val="both"/>
+              <w:rPr>
+                <w:rFonts w:ascii="GHEA Grapalat" w:eastAsia="Times New Roman" w:hAnsi="GHEA Grapalat" w:cs="Times New Roman"/>
+                <w:color w:val="000000"/>
+                <w:sz w:val="18"/>
+                <w:szCs w:val="18"/>
+                <w:lang w:val="hy-AM" w:eastAsia="ru-RU"/>
+              </w:rPr>
+            </w:pPr>
+          </w:p>
+          <w:p>
+            <w:pPr>
+              <w:autoSpaceDE w:val="0"/>
+              <w:autoSpaceDN w:val="0"/>
+              <w:adjustRightInd w:val="0"/>
+              <w:spacing w:after="0" w:line="240" w:lineRule="auto"/>
+              <w:jc w:val="both"/>
+              <w:rPr>
+                <w:rFonts w:ascii="GHEA Grapalat" w:eastAsia="Times New Roman" w:hAnsi="GHEA Grapalat" w:cs="Times New Roman"/>
+                <w:color w:val="000000"/>
+                <w:sz w:val="18"/>
+                <w:szCs w:val="18"/>
+                <w:lang w:val="hy-AM" w:eastAsia="ru-RU"/>
+              </w:rPr>
+            </w:pPr>
+          </w:p>
+        </w:tc>
+        <w:tc>
+          <w:tcPr>
+            <w:tcW w:w="850" w:type="dxa"/>
+            <w:vAlign w:val="center"/>
+          </w:tcPr>
+          <w:p>
+            <w:pPr>
+              <w:autoSpaceDE w:val="0"/>
+              <w:autoSpaceDN w:val="0"/>
+              <w:adjustRightInd w:val="0"/>
+              <w:spacing w:after="0" w:line="240" w:lineRule="auto"/>
+              <w:jc w:val="center"/>
+              <w:rPr>
+                <w:rFonts w:ascii="GHEA Grapalat" w:eastAsia="Times New Roman" w:hAnsi="GHEA Grapalat" w:cs="Times New Roman"/>
+                <w:color w:val="000000"/>
+                <w:sz w:val="18"/>
+                <w:szCs w:val="18"/>
+                <w:lang w:val="hy-AM" w:eastAsia="ru-RU"/>
+              </w:rPr>
+            </w:pPr>
+            <w:r>
+              <w:rPr>
+                <w:rFonts w:ascii="GHEA Grapalat" w:eastAsia="Times New Roman" w:hAnsi="GHEA Grapalat" w:cs="Times New Roman"/>
+                <w:color w:val="000000"/>
+                <w:sz w:val="18"/>
+                <w:szCs w:val="18"/>
+                <w:lang w:val="hy-AM" w:eastAsia="ru-RU"/>
+              </w:rPr>
+              <w:t>հատ</w:t>
+            </w:r>
+          </w:p>
+        </w:tc>
+        <w:tc>
+          <w:tcPr>
+            <w:tcW w:w="993" w:type="dxa"/>
+            <w:vAlign w:val="center"/>
+          </w:tcPr>
+          <w:p>
+            <w:pPr>
+              <w:autoSpaceDE w:val="0"/>
+              <w:autoSpaceDN w:val="0"/>
+              <w:adjustRightInd w:val="0"/>
+              <w:spacing w:after="0" w:line="240" w:lineRule="auto"/>
+              <w:jc w:val="center"/>
+              <w:rPr>
+                <w:rFonts w:ascii="GHEA Grapalat" w:eastAsia="Times New Roman" w:hAnsi="GHEA Grapalat" w:cs="Times New Roman"/>
+                <w:color w:val="000000"/>
+                <w:sz w:val="18"/>
+                <w:szCs w:val="18"/>
+                <w:lang w:val="hy-AM" w:eastAsia="ru-RU"/>
+              </w:rPr>
+            </w:pPr>
+            <w:r>
+              <w:rPr>
+                <w:rFonts w:ascii="GHEA Grapalat" w:eastAsia="Times New Roman" w:hAnsi="GHEA Grapalat" w:cs="Times New Roman"/>
+                <w:color w:val="000000"/>
+                <w:sz w:val="18"/>
+                <w:szCs w:val="18"/>
+                <w:lang w:val="hy-AM" w:eastAsia="ru-RU"/>
+              </w:rPr>
+              <w:t>25 000</w:t>
+            </w:r>
+          </w:p>
+        </w:tc>
+        <w:tc>
+          <w:tcPr>
+            <w:tcW w:w="1275" w:type="dxa"/>
+            <w:vAlign w:val="center"/>
+          </w:tcPr>
+          <w:p>
+            <w:pPr>
+              <w:autoSpaceDE w:val="0"/>
+              <w:autoSpaceDN w:val="0"/>
+              <w:adjustRightInd w:val="0"/>
+              <w:spacing w:after="0" w:line="240" w:lineRule="auto"/>
+              <w:jc w:val="center"/>
+              <w:rPr>
+                <w:rFonts w:ascii="GHEA Grapalat" w:eastAsia="Times New Roman" w:hAnsi="GHEA Grapalat" w:cs="Times New Roman"/>
+                <w:color w:val="000000"/>
+                <w:sz w:val="18"/>
+                <w:szCs w:val="18"/>
+                <w:lang w:val="hy-AM" w:eastAsia="ru-RU"/>
+              </w:rPr>
+            </w:pPr>
+            <w:r>
+              <w:rPr>
+                <w:rFonts w:ascii="GHEA Grapalat" w:eastAsia="Times New Roman" w:hAnsi="GHEA Grapalat" w:cs="Times New Roman"/>
+                <w:color w:val="000000"/>
+                <w:sz w:val="18"/>
+                <w:szCs w:val="18"/>
+                <w:lang w:val="hy-AM" w:eastAsia="ru-RU"/>
+              </w:rPr>
+              <w:t>250</w:t>
+            </w:r>
+            <w:r>
+              <w:rPr>
+                <w:rFonts w:ascii="GHEA Grapalat" w:eastAsia="Times New Roman" w:hAnsi="GHEA Grapalat" w:cs="Times New Roman"/>
+                <w:color w:val="000000"/>
+                <w:sz w:val="18"/>
+                <w:szCs w:val="18"/>
+                <w:lang w:val="hy-AM" w:eastAsia="ru-RU"/>
+              </w:rPr>
+              <w:t xml:space="preserve"> </w:t>
+            </w:r>
+            <w:r>
+              <w:rPr>
+                <w:rFonts w:ascii="GHEA Grapalat" w:eastAsia="Times New Roman" w:hAnsi="GHEA Grapalat" w:cs="Times New Roman"/>
+                <w:color w:val="000000"/>
+                <w:sz w:val="18"/>
+                <w:szCs w:val="18"/>
+                <w:lang w:val="hy-AM" w:eastAsia="ru-RU"/>
+              </w:rPr>
+              <w:t>000</w:t>
+            </w:r>
+          </w:p>
+        </w:tc>
+        <w:tc>
+          <w:tcPr>
+            <w:tcW w:w="1134" w:type="dxa"/>
+            <w:vAlign w:val="center"/>
+          </w:tcPr>
+          <w:p>
+            <w:pPr>
+              <w:autoSpaceDE w:val="0"/>
+              <w:autoSpaceDN w:val="0"/>
+              <w:adjustRightInd w:val="0"/>
+              <w:spacing w:after="0" w:line="240" w:lineRule="auto"/>
+              <w:jc w:val="center"/>
+              <w:rPr>
+                <w:rFonts w:ascii="GHEA Grapalat" w:eastAsia="Times New Roman" w:hAnsi="GHEA Grapalat" w:cs="Times New Roman"/>
+                <w:color w:val="000000"/>
+                <w:sz w:val="18"/>
+                <w:szCs w:val="18"/>
+                <w:lang w:val="hy-AM" w:eastAsia="ru-RU"/>
+              </w:rPr>
+            </w:pPr>
+            <w:r>
+              <w:rPr>
+                <w:rFonts w:ascii="GHEA Grapalat" w:eastAsia="Times New Roman" w:hAnsi="GHEA Grapalat" w:cs="Times New Roman"/>
+                <w:color w:val="000000"/>
+                <w:sz w:val="18"/>
+                <w:szCs w:val="18"/>
+                <w:lang w:val="hy-AM" w:eastAsia="ru-RU"/>
+              </w:rPr>
+              <w:t>10</w:t>
+            </w:r>
+          </w:p>
+        </w:tc>
+        <w:tc>
+          <w:tcPr>
+            <w:tcW w:w="1985" w:type="dxa"/>
+            <w:vAlign w:val="center"/>
+          </w:tcPr>
+          <w:p>
+            <w:pPr>
+              <w:autoSpaceDE w:val="0"/>
+              <w:autoSpaceDN w:val="0"/>
+              <w:adjustRightInd w:val="0"/>
+              <w:spacing w:after="0" w:line="240" w:lineRule="auto"/>
+              <w:jc w:val="center"/>
+              <w:rPr>
+                <w:rFonts w:ascii="GHEA Grapalat" w:eastAsia="Times New Roman" w:hAnsi="GHEA Grapalat" w:cs="Times New Roman"/>
+                <w:color w:val="000000"/>
+                <w:sz w:val="18"/>
+                <w:szCs w:val="18"/>
+                <w:lang w:val="hy-AM" w:eastAsia="ru-RU"/>
+              </w:rPr>
+            </w:pPr>
+            <w:r>
+              <w:rPr>
+                <w:rFonts w:ascii="GHEA Grapalat" w:eastAsia="Times New Roman" w:hAnsi="GHEA Grapalat" w:cs="Times New Roman"/>
+                <w:color w:val="000000"/>
+                <w:sz w:val="18"/>
+                <w:szCs w:val="18"/>
+                <w:lang w:val="hy-AM" w:eastAsia="ru-RU"/>
+              </w:rPr>
+              <w:t>համաձայնագրի կնքման օրվանից 20 օր</w:t>
+            </w:r>
+          </w:p>
+        </w:tc>
+      </w:tr>
+      <w:tr>
+        <w:trPr>
+          <w:trHeight w:val="246"/>
+          <w:jc w:val="center"/>
+        </w:trPr>
+        <w:tc>
+          <w:tcPr>
+            <w:tcW w:w="531" w:type="dxa"/>
+            <w:vAlign w:val="center"/>
+          </w:tcPr>
+          <w:p>
+            <w:pPr>
+              <w:autoSpaceDE w:val="0"/>
+              <w:autoSpaceDN w:val="0"/>
+              <w:adjustRightInd w:val="0"/>
+              <w:spacing w:after="0" w:line="240" w:lineRule="auto"/>
+              <w:jc w:val="center"/>
+              <w:rPr>
+                <w:rFonts w:ascii="GHEA Grapalat" w:eastAsia="Times New Roman" w:hAnsi="GHEA Grapalat" w:cs="Times New Roman"/>
+                <w:color w:val="000000"/>
+                <w:sz w:val="18"/>
+                <w:szCs w:val="18"/>
+                <w:lang w:val="hy-AM" w:eastAsia="ru-RU"/>
+              </w:rPr>
+            </w:pPr>
+            <w:r>
+              <w:rPr>
+                <w:rFonts w:ascii="GHEA Grapalat" w:eastAsia="Times New Roman" w:hAnsi="GHEA Grapalat" w:cs="Times New Roman"/>
+                <w:color w:val="000000"/>
+                <w:sz w:val="18"/>
+                <w:szCs w:val="18"/>
+                <w:lang w:val="hy-AM" w:eastAsia="ru-RU"/>
+              </w:rPr>
+              <w:t>6</w:t>
+            </w:r>
+          </w:p>
+        </w:tc>
+        <w:tc>
+          <w:tcPr>
+            <w:tcW w:w="2016" w:type="dxa"/>
+            <w:vAlign w:val="center"/>
+          </w:tcPr>
+          <w:p>
+            <w:pPr>
+              <w:autoSpaceDE w:val="0"/>
+              <w:autoSpaceDN w:val="0"/>
+              <w:adjustRightInd w:val="0"/>
+              <w:spacing w:after="0" w:line="240" w:lineRule="auto"/>
+              <w:jc w:val="center"/>
+              <w:rPr>
+                <w:rFonts w:ascii="GHEA Grapalat" w:eastAsia="Times New Roman" w:hAnsi="GHEA Grapalat" w:cs="Times New Roman"/>
+                <w:color w:val="000000"/>
+                <w:sz w:val="18"/>
+                <w:szCs w:val="18"/>
+                <w:lang w:val="hy-AM" w:eastAsia="ru-RU"/>
+              </w:rPr>
+            </w:pPr>
+            <w:r>
+              <w:rPr>
+                <w:rFonts w:ascii="GHEA Grapalat" w:eastAsia="Times New Roman" w:hAnsi="GHEA Grapalat" w:cs="Times New Roman"/>
+                <w:color w:val="000000"/>
+                <w:sz w:val="18"/>
+                <w:szCs w:val="18"/>
+                <w:lang w:val="hy-AM" w:eastAsia="ru-RU"/>
+              </w:rPr>
+              <w:t>անլար հեռախոսներ</w:t>
+            </w:r>
+          </w:p>
+        </w:tc>
+        <w:tc>
+          <w:tcPr>
+            <w:tcW w:w="7371" w:type="dxa"/>
+            <w:vAlign w:val="center"/>
+          </w:tcPr>
+          <w:p>
+            <w:pPr>
+              <w:autoSpaceDE w:val="0"/>
+              <w:autoSpaceDN w:val="0"/>
+              <w:adjustRightInd w:val="0"/>
+              <w:spacing w:after="0" w:line="240" w:lineRule="auto"/>
+              <w:jc w:val="both"/>
+              <w:rPr>
+                <w:rFonts w:ascii="GHEA Grapalat" w:eastAsia="Times New Roman" w:hAnsi="GHEA Grapalat" w:cs="Times New Roman"/>
+                <w:color w:val="000000"/>
+                <w:sz w:val="18"/>
+                <w:szCs w:val="18"/>
+                <w:lang w:val="hy-AM" w:eastAsia="ru-RU"/>
+              </w:rPr>
+            </w:pPr>
+            <w:r>
+              <w:rPr>
+                <w:rFonts w:ascii="GHEA Grapalat" w:eastAsia="Times New Roman" w:hAnsi="GHEA Grapalat" w:cs="Times New Roman"/>
+                <w:color w:val="000000"/>
+                <w:sz w:val="18"/>
+                <w:szCs w:val="18"/>
+                <w:lang w:val="hy-AM" w:eastAsia="ru-RU"/>
+              </w:rPr>
+              <w:t>4G հնարավորություն: Nokia 105 կամ համարժեք</w:t>
+            </w:r>
+          </w:p>
+        </w:tc>
+        <w:tc>
+          <w:tcPr>
+            <w:tcW w:w="850" w:type="dxa"/>
+            <w:vAlign w:val="center"/>
+          </w:tcPr>
+          <w:p>
+            <w:pPr>
+              <w:autoSpaceDE w:val="0"/>
+              <w:autoSpaceDN w:val="0"/>
+              <w:adjustRightInd w:val="0"/>
+              <w:spacing w:after="0" w:line="240" w:lineRule="auto"/>
+              <w:jc w:val="center"/>
+              <w:rPr>
+                <w:rFonts w:ascii="GHEA Grapalat" w:eastAsia="Times New Roman" w:hAnsi="GHEA Grapalat" w:cs="Times New Roman"/>
+                <w:color w:val="000000"/>
+                <w:sz w:val="18"/>
+                <w:szCs w:val="18"/>
+                <w:lang w:val="hy-AM" w:eastAsia="ru-RU"/>
+              </w:rPr>
+            </w:pPr>
+            <w:r>
+              <w:rPr>
+                <w:rFonts w:ascii="GHEA Grapalat" w:eastAsia="Times New Roman" w:hAnsi="GHEA Grapalat" w:cs="Times New Roman"/>
+                <w:color w:val="000000"/>
+                <w:sz w:val="18"/>
+                <w:szCs w:val="18"/>
+                <w:lang w:val="hy-AM" w:eastAsia="ru-RU"/>
+              </w:rPr>
+              <w:t>հատ</w:t>
+            </w:r>
+          </w:p>
+        </w:tc>
+        <w:tc>
+          <w:tcPr>
+            <w:tcW w:w="993" w:type="dxa"/>
+            <w:vAlign w:val="center"/>
+          </w:tcPr>
+          <w:p>
+            <w:pPr>
+              <w:autoSpaceDE w:val="0"/>
+              <w:autoSpaceDN w:val="0"/>
+              <w:adjustRightInd w:val="0"/>
+              <w:spacing w:after="0" w:line="240" w:lineRule="auto"/>
+              <w:jc w:val="center"/>
+              <w:rPr>
+                <w:rFonts w:ascii="GHEA Grapalat" w:eastAsia="Times New Roman" w:hAnsi="GHEA Grapalat" w:cs="Times New Roman"/>
+                <w:color w:val="000000"/>
+                <w:sz w:val="18"/>
+                <w:szCs w:val="18"/>
+                <w:lang w:val="hy-AM" w:eastAsia="ru-RU"/>
+              </w:rPr>
+            </w:pPr>
+            <w:r>
+              <w:rPr>
+                <w:rFonts w:ascii="GHEA Grapalat" w:eastAsia="Times New Roman" w:hAnsi="GHEA Grapalat" w:cs="Times New Roman"/>
+                <w:color w:val="000000"/>
+                <w:sz w:val="18"/>
+                <w:szCs w:val="18"/>
+                <w:lang w:val="hy-AM" w:eastAsia="ru-RU"/>
+              </w:rPr>
+              <w:t>20 000</w:t>
+            </w:r>
+          </w:p>
+        </w:tc>
+        <w:tc>
+          <w:tcPr>
+            <w:tcW w:w="1275" w:type="dxa"/>
+            <w:vAlign w:val="center"/>
+          </w:tcPr>
+          <w:p>
+            <w:pPr>
+              <w:autoSpaceDE w:val="0"/>
+              <w:autoSpaceDN w:val="0"/>
+              <w:adjustRightInd w:val="0"/>
+              <w:spacing w:after="0" w:line="240" w:lineRule="auto"/>
+              <w:jc w:val="center"/>
+              <w:rPr>
+                <w:rFonts w:ascii="GHEA Grapalat" w:eastAsia="Times New Roman" w:hAnsi="GHEA Grapalat" w:cs="Times New Roman"/>
+                <w:color w:val="000000"/>
+                <w:sz w:val="18"/>
+                <w:szCs w:val="18"/>
+                <w:lang w:val="hy-AM" w:eastAsia="ru-RU"/>
+              </w:rPr>
+            </w:pPr>
+            <w:r>
+              <w:rPr>
+                <w:rFonts w:ascii="GHEA Grapalat" w:eastAsia="Times New Roman" w:hAnsi="GHEA Grapalat" w:cs="Times New Roman"/>
+                <w:color w:val="000000"/>
+                <w:sz w:val="18"/>
+                <w:szCs w:val="18"/>
+                <w:lang w:val="hy-AM" w:eastAsia="ru-RU"/>
+              </w:rPr>
+              <w:t>100</w:t>
+            </w:r>
+            <w:r>
+              <w:rPr>
+                <w:rFonts w:ascii="GHEA Grapalat" w:eastAsia="Times New Roman" w:hAnsi="GHEA Grapalat" w:cs="Times New Roman"/>
+                <w:color w:val="000000"/>
+                <w:sz w:val="18"/>
+                <w:szCs w:val="18"/>
+                <w:lang w:val="hy-AM" w:eastAsia="ru-RU"/>
+              </w:rPr>
+              <w:t xml:space="preserve"> </w:t>
+            </w:r>
+            <w:r>
+              <w:rPr>
+                <w:rFonts w:ascii="GHEA Grapalat" w:eastAsia="Times New Roman" w:hAnsi="GHEA Grapalat" w:cs="Times New Roman"/>
+                <w:color w:val="000000"/>
+                <w:sz w:val="18"/>
+                <w:szCs w:val="18"/>
+                <w:lang w:val="hy-AM" w:eastAsia="ru-RU"/>
+              </w:rPr>
+              <w:t>000</w:t>
+            </w:r>
+          </w:p>
+        </w:tc>
+        <w:tc>
+          <w:tcPr>
+            <w:tcW w:w="1134" w:type="dxa"/>
+            <w:vAlign w:val="center"/>
+          </w:tcPr>
+          <w:p>
+            <w:pPr>
+              <w:autoSpaceDE w:val="0"/>
+              <w:autoSpaceDN w:val="0"/>
+              <w:adjustRightInd w:val="0"/>
+              <w:spacing w:after="0" w:line="240" w:lineRule="auto"/>
+              <w:jc w:val="center"/>
+              <w:rPr>
+                <w:rFonts w:ascii="GHEA Grapalat" w:eastAsia="Times New Roman" w:hAnsi="GHEA Grapalat" w:cs="Times New Roman"/>
+                <w:color w:val="000000"/>
+                <w:sz w:val="18"/>
+                <w:szCs w:val="18"/>
+                <w:lang w:val="hy-AM" w:eastAsia="ru-RU"/>
+              </w:rPr>
+            </w:pPr>
+            <w:r>
+              <w:rPr>
+                <w:rFonts w:ascii="GHEA Grapalat" w:eastAsia="Times New Roman" w:hAnsi="GHEA Grapalat" w:cs="Times New Roman"/>
+                <w:color w:val="000000"/>
+                <w:sz w:val="18"/>
+                <w:szCs w:val="18"/>
+                <w:lang w:val="hy-AM" w:eastAsia="ru-RU"/>
+              </w:rPr>
+              <w:t>5</w:t>
+            </w:r>
+          </w:p>
+        </w:tc>
+        <w:tc>
+          <w:tcPr>
+            <w:tcW w:w="1985" w:type="dxa"/>
+            <w:vAlign w:val="center"/>
+          </w:tcPr>
+          <w:p>
+            <w:pPr>
+              <w:autoSpaceDE w:val="0"/>
+              <w:autoSpaceDN w:val="0"/>
+              <w:adjustRightInd w:val="0"/>
+              <w:spacing w:after="0" w:line="240" w:lineRule="auto"/>
+              <w:jc w:val="center"/>
+              <w:rPr>
+                <w:rFonts w:ascii="GHEA Grapalat" w:eastAsia="Times New Roman" w:hAnsi="GHEA Grapalat" w:cs="Times New Roman"/>
+                <w:color w:val="000000"/>
+                <w:sz w:val="18"/>
+                <w:szCs w:val="18"/>
+                <w:lang w:val="hy-AM" w:eastAsia="ru-RU"/>
+              </w:rPr>
+            </w:pPr>
+            <w:r>
+              <w:rPr>
+                <w:rFonts w:ascii="GHEA Grapalat" w:eastAsia="Times New Roman" w:hAnsi="GHEA Grapalat" w:cs="Times New Roman"/>
+                <w:color w:val="000000"/>
+                <w:sz w:val="18"/>
+                <w:szCs w:val="18"/>
+                <w:lang w:val="hy-AM" w:eastAsia="ru-RU"/>
+              </w:rPr>
+              <w:t>համաձայնագրի կնքման օրվանից 20 օր</w:t>
+            </w:r>
+          </w:p>
+        </w:tc>
+      </w:tr>
+      <w:tr>
+        <w:trPr>
+          <w:trHeight w:val="246"/>
+          <w:jc w:val="center"/>
+        </w:trPr>
+        <w:tc>
+          <w:tcPr>
+            <w:tcW w:w="531" w:type="dxa"/>
+            <w:vAlign w:val="center"/>
+          </w:tcPr>
+          <w:p>
+            <w:pPr>
+              <w:autoSpaceDE w:val="0"/>
+              <w:autoSpaceDN w:val="0"/>
+              <w:adjustRightInd w:val="0"/>
+              <w:spacing w:after="0" w:line="240" w:lineRule="auto"/>
+              <w:jc w:val="center"/>
+              <w:rPr>
+                <w:rFonts w:ascii="GHEA Grapalat" w:eastAsia="Times New Roman" w:hAnsi="GHEA Grapalat" w:cs="Times New Roman"/>
+                <w:color w:val="000000"/>
+                <w:sz w:val="18"/>
+                <w:szCs w:val="18"/>
+                <w:lang w:val="hy-AM" w:eastAsia="ru-RU"/>
+              </w:rPr>
+            </w:pPr>
+            <w:r>
+              <w:rPr>
+                <w:rFonts w:ascii="GHEA Grapalat" w:eastAsia="Times New Roman" w:hAnsi="GHEA Grapalat" w:cs="Times New Roman"/>
+                <w:color w:val="000000"/>
+                <w:sz w:val="18"/>
+                <w:szCs w:val="18"/>
+                <w:lang w:val="hy-AM" w:eastAsia="ru-RU"/>
+              </w:rPr>
+              <w:t>7</w:t>
+            </w:r>
+          </w:p>
+        </w:tc>
+        <w:tc>
+          <w:tcPr>
+            <w:tcW w:w="2016" w:type="dxa"/>
+            <w:vAlign w:val="center"/>
+          </w:tcPr>
+          <w:p>
+            <w:pPr>
+              <w:autoSpaceDE w:val="0"/>
+              <w:autoSpaceDN w:val="0"/>
+              <w:adjustRightInd w:val="0"/>
+              <w:spacing w:after="0" w:line="240" w:lineRule="auto"/>
+              <w:jc w:val="center"/>
+              <w:rPr>
+                <w:rFonts w:ascii="GHEA Grapalat" w:eastAsia="Times New Roman" w:hAnsi="GHEA Grapalat" w:cs="Times New Roman"/>
+                <w:color w:val="000000"/>
+                <w:sz w:val="18"/>
+                <w:szCs w:val="18"/>
+                <w:lang w:val="hy-AM" w:eastAsia="ru-RU"/>
+              </w:rPr>
+            </w:pPr>
+            <w:r>
+              <w:rPr>
+                <w:rFonts w:ascii="GHEA Grapalat" w:eastAsia="Times New Roman" w:hAnsi="GHEA Grapalat" w:cs="Times New Roman"/>
+                <w:color w:val="000000"/>
+                <w:sz w:val="18"/>
+                <w:szCs w:val="18"/>
+                <w:lang w:val="hy-AM" w:eastAsia="ru-RU"/>
+              </w:rPr>
+              <w:t>մկնիկ, համակարգչային, լարով</w:t>
+            </w:r>
+          </w:p>
+        </w:tc>
+        <w:tc>
+          <w:tcPr>
+            <w:tcW w:w="7371" w:type="dxa"/>
+            <w:vAlign w:val="center"/>
+          </w:tcPr>
+          <w:p>
+            <w:pPr>
+              <w:autoSpaceDE w:val="0"/>
+              <w:autoSpaceDN w:val="0"/>
+              <w:adjustRightInd w:val="0"/>
+              <w:spacing w:after="0" w:line="240" w:lineRule="auto"/>
+              <w:jc w:val="both"/>
+              <w:rPr>
+                <w:rFonts w:ascii="GHEA Grapalat" w:eastAsia="Times New Roman" w:hAnsi="GHEA Grapalat" w:cs="Times New Roman"/>
+                <w:color w:val="000000"/>
+                <w:sz w:val="18"/>
+                <w:szCs w:val="18"/>
+                <w:lang w:val="hy-AM" w:eastAsia="ru-RU"/>
+              </w:rPr>
+            </w:pPr>
+            <w:r>
+              <w:rPr>
+                <w:rFonts w:ascii="GHEA Grapalat" w:eastAsia="Times New Roman" w:hAnsi="GHEA Grapalat" w:cs="Times New Roman"/>
+                <w:color w:val="000000"/>
+                <w:sz w:val="18"/>
+                <w:szCs w:val="18"/>
+                <w:lang w:val="hy-AM" w:eastAsia="ru-RU"/>
+              </w:rPr>
+              <w:t>Մկնիկ, համակարգչային, լարով, usb ծայրակալով, գույնը՝ սև, Genius dx125 կամ համարժեք Logitech M100</w:t>
+            </w:r>
+          </w:p>
+        </w:tc>
+        <w:tc>
+          <w:tcPr>
+            <w:tcW w:w="850" w:type="dxa"/>
+            <w:vAlign w:val="center"/>
+          </w:tcPr>
+          <w:p>
+            <w:pPr>
+              <w:autoSpaceDE w:val="0"/>
+              <w:autoSpaceDN w:val="0"/>
+              <w:adjustRightInd w:val="0"/>
+              <w:spacing w:after="0" w:line="240" w:lineRule="auto"/>
+              <w:jc w:val="center"/>
+              <w:rPr>
+                <w:rFonts w:ascii="GHEA Grapalat" w:eastAsia="Times New Roman" w:hAnsi="GHEA Grapalat" w:cs="Times New Roman"/>
+                <w:color w:val="000000"/>
+                <w:sz w:val="18"/>
+                <w:szCs w:val="18"/>
+                <w:lang w:val="hy-AM" w:eastAsia="ru-RU"/>
+              </w:rPr>
+            </w:pPr>
+            <w:r>
+              <w:rPr>
+                <w:rFonts w:ascii="GHEA Grapalat" w:eastAsia="Times New Roman" w:hAnsi="GHEA Grapalat" w:cs="Times New Roman"/>
+                <w:color w:val="000000"/>
+                <w:sz w:val="18"/>
+                <w:szCs w:val="18"/>
+                <w:lang w:val="hy-AM" w:eastAsia="ru-RU"/>
+              </w:rPr>
+              <w:t>հատ</w:t>
+            </w:r>
+          </w:p>
+        </w:tc>
+        <w:tc>
+          <w:tcPr>
+            <w:tcW w:w="993" w:type="dxa"/>
+            <w:vAlign w:val="center"/>
+          </w:tcPr>
+          <w:p>
+            <w:pPr>
+              <w:autoSpaceDE w:val="0"/>
+              <w:autoSpaceDN w:val="0"/>
+              <w:adjustRightInd w:val="0"/>
+              <w:spacing w:after="0" w:line="240" w:lineRule="auto"/>
+              <w:jc w:val="center"/>
+              <w:rPr>
+                <w:rFonts w:ascii="GHEA Grapalat" w:eastAsia="Times New Roman" w:hAnsi="GHEA Grapalat" w:cs="Times New Roman"/>
+                <w:color w:val="000000"/>
+                <w:sz w:val="18"/>
+                <w:szCs w:val="18"/>
+                <w:lang w:val="hy-AM" w:eastAsia="ru-RU"/>
+              </w:rPr>
+            </w:pPr>
+            <w:r>
+              <w:rPr>
+                <w:rFonts w:ascii="GHEA Grapalat" w:eastAsia="Times New Roman" w:hAnsi="GHEA Grapalat" w:cs="Times New Roman"/>
+                <w:color w:val="000000"/>
+                <w:sz w:val="18"/>
+                <w:szCs w:val="18"/>
+                <w:lang w:val="hy-AM" w:eastAsia="ru-RU"/>
+              </w:rPr>
+              <w:t>2 500</w:t>
+            </w:r>
+          </w:p>
+        </w:tc>
+        <w:tc>
+          <w:tcPr>
+            <w:tcW w:w="1275" w:type="dxa"/>
+            <w:vAlign w:val="center"/>
+          </w:tcPr>
+          <w:p>
+            <w:pPr>
+              <w:autoSpaceDE w:val="0"/>
+              <w:autoSpaceDN w:val="0"/>
+              <w:adjustRightInd w:val="0"/>
+              <w:spacing w:after="0" w:line="240" w:lineRule="auto"/>
+              <w:jc w:val="center"/>
+              <w:rPr>
+                <w:rFonts w:ascii="GHEA Grapalat" w:eastAsia="Times New Roman" w:hAnsi="GHEA Grapalat" w:cs="Times New Roman"/>
+                <w:color w:val="000000"/>
+                <w:sz w:val="18"/>
+                <w:szCs w:val="18"/>
+                <w:lang w:val="hy-AM" w:eastAsia="ru-RU"/>
+              </w:rPr>
+            </w:pPr>
+            <w:r>
+              <w:rPr>
+                <w:rFonts w:ascii="GHEA Grapalat" w:eastAsia="Times New Roman" w:hAnsi="GHEA Grapalat" w:cs="Times New Roman"/>
+                <w:color w:val="000000"/>
+                <w:sz w:val="18"/>
+                <w:szCs w:val="18"/>
+                <w:lang w:val="hy-AM" w:eastAsia="ru-RU"/>
+              </w:rPr>
+              <w:t>75</w:t>
+            </w:r>
+            <w:r>
+              <w:rPr>
+                <w:rFonts w:ascii="GHEA Grapalat" w:eastAsia="Times New Roman" w:hAnsi="GHEA Grapalat" w:cs="Times New Roman"/>
+                <w:color w:val="000000"/>
+                <w:sz w:val="18"/>
+                <w:szCs w:val="18"/>
+                <w:lang w:val="hy-AM" w:eastAsia="ru-RU"/>
+              </w:rPr>
+              <w:t xml:space="preserve"> </w:t>
+            </w:r>
+            <w:r>
+              <w:rPr>
+                <w:rFonts w:ascii="GHEA Grapalat" w:eastAsia="Times New Roman" w:hAnsi="GHEA Grapalat" w:cs="Times New Roman"/>
+                <w:color w:val="000000"/>
+                <w:sz w:val="18"/>
+                <w:szCs w:val="18"/>
+                <w:lang w:val="hy-AM" w:eastAsia="ru-RU"/>
+              </w:rPr>
+              <w:t>000</w:t>
+            </w:r>
+          </w:p>
+        </w:tc>
+        <w:tc>
+          <w:tcPr>
+            <w:tcW w:w="1134" w:type="dxa"/>
+            <w:vAlign w:val="center"/>
+          </w:tcPr>
+          <w:p>
+            <w:pPr>
+              <w:autoSpaceDE w:val="0"/>
+              <w:autoSpaceDN w:val="0"/>
+              <w:adjustRightInd w:val="0"/>
+              <w:spacing w:after="0" w:line="240" w:lineRule="auto"/>
+              <w:jc w:val="center"/>
+              <w:rPr>
+                <w:rFonts w:ascii="GHEA Grapalat" w:eastAsia="Times New Roman" w:hAnsi="GHEA Grapalat" w:cs="Times New Roman"/>
+                <w:color w:val="000000"/>
+                <w:sz w:val="18"/>
+                <w:szCs w:val="18"/>
+                <w:lang w:val="hy-AM" w:eastAsia="ru-RU"/>
+              </w:rPr>
+            </w:pPr>
+            <w:r>
+              <w:rPr>
+                <w:rFonts w:ascii="GHEA Grapalat" w:eastAsia="Times New Roman" w:hAnsi="GHEA Grapalat" w:cs="Times New Roman"/>
+                <w:color w:val="000000"/>
+                <w:sz w:val="18"/>
+                <w:szCs w:val="18"/>
+                <w:lang w:val="hy-AM" w:eastAsia="ru-RU"/>
+              </w:rPr>
+              <w:t>30</w:t>
+            </w:r>
+          </w:p>
+        </w:tc>
+        <w:tc>
+          <w:tcPr>
+            <w:tcW w:w="1985" w:type="dxa"/>
+            <w:vAlign w:val="center"/>
+          </w:tcPr>
+          <w:p>
+            <w:pPr>
+              <w:autoSpaceDE w:val="0"/>
+              <w:autoSpaceDN w:val="0"/>
+              <w:adjustRightInd w:val="0"/>
+              <w:spacing w:after="0" w:line="240" w:lineRule="auto"/>
+              <w:jc w:val="center"/>
+              <w:rPr>
+                <w:rFonts w:ascii="GHEA Grapalat" w:eastAsia="Times New Roman" w:hAnsi="GHEA Grapalat" w:cs="Times New Roman"/>
+                <w:color w:val="000000"/>
+                <w:sz w:val="18"/>
+                <w:szCs w:val="18"/>
+                <w:lang w:val="hy-AM" w:eastAsia="ru-RU"/>
+              </w:rPr>
+            </w:pPr>
+            <w:r>
+              <w:rPr>
+                <w:rFonts w:ascii="GHEA Grapalat" w:eastAsia="Times New Roman" w:hAnsi="GHEA Grapalat" w:cs="Times New Roman"/>
+                <w:color w:val="000000"/>
+                <w:sz w:val="18"/>
+                <w:szCs w:val="18"/>
+                <w:lang w:val="hy-AM" w:eastAsia="ru-RU"/>
+              </w:rPr>
+              <w:t>համաձայնագրի կնքման օրվանից 20 օր</w:t>
+            </w:r>
+          </w:p>
+        </w:tc>
+      </w:tr>
+      <w:tr>
+        <w:trPr>
+          <w:trHeight w:val="246"/>
+          <w:jc w:val="center"/>
+        </w:trPr>
+        <w:tc>
+          <w:tcPr>
+            <w:tcW w:w="531" w:type="dxa"/>
+            <w:vAlign w:val="center"/>
+          </w:tcPr>
+          <w:p>
+            <w:pPr>
+              <w:autoSpaceDE w:val="0"/>
+              <w:autoSpaceDN w:val="0"/>
+              <w:adjustRightInd w:val="0"/>
+              <w:spacing w:after="0" w:line="240" w:lineRule="auto"/>
+              <w:jc w:val="center"/>
+              <w:rPr>
+                <w:rFonts w:ascii="GHEA Grapalat" w:eastAsia="Times New Roman" w:hAnsi="GHEA Grapalat" w:cs="Times New Roman"/>
+                <w:color w:val="000000"/>
+                <w:sz w:val="18"/>
+                <w:szCs w:val="18"/>
+                <w:lang w:val="hy-AM" w:eastAsia="ru-RU"/>
+              </w:rPr>
+            </w:pPr>
+            <w:r>
+              <w:rPr>
+                <w:rFonts w:ascii="GHEA Grapalat" w:eastAsia="Times New Roman" w:hAnsi="GHEA Grapalat" w:cs="Times New Roman"/>
+                <w:color w:val="000000"/>
+                <w:sz w:val="18"/>
+                <w:szCs w:val="18"/>
+                <w:lang w:val="hy-AM" w:eastAsia="ru-RU"/>
+              </w:rPr>
+              <w:t>8</w:t>
+            </w:r>
+          </w:p>
+        </w:tc>
+        <w:tc>
+          <w:tcPr>
+            <w:tcW w:w="2016" w:type="dxa"/>
+            <w:vAlign w:val="center"/>
+          </w:tcPr>
+          <w:p>
+            <w:pPr>
+              <w:autoSpaceDE w:val="0"/>
+              <w:autoSpaceDN w:val="0"/>
+              <w:adjustRightInd w:val="0"/>
+              <w:spacing w:after="0" w:line="240" w:lineRule="auto"/>
+              <w:jc w:val="center"/>
+              <w:rPr>
+                <w:rFonts w:ascii="GHEA Grapalat" w:eastAsia="Times New Roman" w:hAnsi="GHEA Grapalat" w:cs="Times New Roman"/>
+                <w:color w:val="000000"/>
+                <w:sz w:val="18"/>
+                <w:szCs w:val="18"/>
+                <w:lang w:val="hy-AM" w:eastAsia="ru-RU"/>
+              </w:rPr>
+            </w:pPr>
+            <w:r>
+              <w:rPr>
+                <w:rFonts w:ascii="GHEA Grapalat" w:eastAsia="Times New Roman" w:hAnsi="GHEA Grapalat" w:cs="Times New Roman"/>
+                <w:color w:val="000000"/>
+                <w:sz w:val="18"/>
+                <w:szCs w:val="18"/>
+                <w:lang w:val="hy-AM" w:eastAsia="ru-RU"/>
+              </w:rPr>
+              <w:t>համակարգչային ստեղնաշարեր</w:t>
+            </w:r>
+          </w:p>
+        </w:tc>
+        <w:tc>
+          <w:tcPr>
+            <w:tcW w:w="7371" w:type="dxa"/>
+            <w:vAlign w:val="center"/>
+          </w:tcPr>
+          <w:p>
+            <w:pPr>
+              <w:autoSpaceDE w:val="0"/>
+              <w:autoSpaceDN w:val="0"/>
+              <w:adjustRightInd w:val="0"/>
+              <w:spacing w:after="0" w:line="240" w:lineRule="auto"/>
+              <w:jc w:val="both"/>
+              <w:rPr>
+                <w:rFonts w:ascii="GHEA Grapalat" w:eastAsia="Times New Roman" w:hAnsi="GHEA Grapalat" w:cs="Times New Roman"/>
+                <w:color w:val="000000"/>
+                <w:sz w:val="18"/>
+                <w:szCs w:val="18"/>
+                <w:lang w:val="hy-AM" w:eastAsia="ru-RU"/>
+              </w:rPr>
+            </w:pPr>
+            <w:r>
+              <w:rPr>
+                <w:rFonts w:ascii="GHEA Grapalat" w:eastAsia="Times New Roman" w:hAnsi="GHEA Grapalat" w:cs="Times New Roman"/>
+                <w:color w:val="000000"/>
+                <w:sz w:val="18"/>
+                <w:szCs w:val="18"/>
+                <w:lang w:val="hy-AM" w:eastAsia="ru-RU"/>
+              </w:rPr>
+              <w:t>Համակարգչային ստեղնաշար, usb ծայրակալով, գույնը՝ սև: Genius slimstar 126 կամ համարժեք Logitech k120</w:t>
+            </w:r>
+          </w:p>
+          <w:p>
+            <w:pPr>
+              <w:autoSpaceDE w:val="0"/>
+              <w:autoSpaceDN w:val="0"/>
+              <w:adjustRightInd w:val="0"/>
+              <w:spacing w:after="0" w:line="240" w:lineRule="auto"/>
+              <w:jc w:val="both"/>
+              <w:rPr>
+                <w:rFonts w:ascii="GHEA Grapalat" w:eastAsia="Times New Roman" w:hAnsi="GHEA Grapalat" w:cs="Times New Roman"/>
+                <w:color w:val="000000"/>
+                <w:sz w:val="18"/>
+                <w:szCs w:val="18"/>
+                <w:lang w:val="hy-AM" w:eastAsia="ru-RU"/>
+              </w:rPr>
+            </w:pPr>
+          </w:p>
+        </w:tc>
+        <w:tc>
+          <w:tcPr>
+            <w:tcW w:w="850" w:type="dxa"/>
+            <w:vAlign w:val="center"/>
+          </w:tcPr>
+          <w:p>
+            <w:pPr>
+              <w:autoSpaceDE w:val="0"/>
+              <w:autoSpaceDN w:val="0"/>
+              <w:adjustRightInd w:val="0"/>
+              <w:spacing w:after="0" w:line="240" w:lineRule="auto"/>
+              <w:jc w:val="center"/>
+              <w:rPr>
+                <w:rFonts w:ascii="GHEA Grapalat" w:eastAsia="Times New Roman" w:hAnsi="GHEA Grapalat" w:cs="Times New Roman"/>
+                <w:color w:val="000000"/>
+                <w:sz w:val="18"/>
+                <w:szCs w:val="18"/>
+                <w:lang w:val="hy-AM" w:eastAsia="ru-RU"/>
+              </w:rPr>
+            </w:pPr>
+            <w:r>
+              <w:rPr>
+                <w:rFonts w:ascii="GHEA Grapalat" w:eastAsia="Times New Roman" w:hAnsi="GHEA Grapalat" w:cs="Times New Roman"/>
+                <w:color w:val="000000"/>
+                <w:sz w:val="18"/>
+                <w:szCs w:val="18"/>
+                <w:lang w:val="hy-AM" w:eastAsia="ru-RU"/>
+              </w:rPr>
+              <w:t>հատ</w:t>
+            </w:r>
+          </w:p>
+        </w:tc>
+        <w:tc>
+          <w:tcPr>
+            <w:tcW w:w="993" w:type="dxa"/>
+            <w:vAlign w:val="center"/>
+          </w:tcPr>
+          <w:p>
+            <w:pPr>
+              <w:autoSpaceDE w:val="0"/>
+              <w:autoSpaceDN w:val="0"/>
+              <w:adjustRightInd w:val="0"/>
+              <w:spacing w:after="0" w:line="240" w:lineRule="auto"/>
+              <w:jc w:val="center"/>
+              <w:rPr>
+                <w:rFonts w:ascii="GHEA Grapalat" w:eastAsia="Times New Roman" w:hAnsi="GHEA Grapalat" w:cs="Times New Roman"/>
+                <w:color w:val="000000"/>
+                <w:sz w:val="18"/>
+                <w:szCs w:val="18"/>
+                <w:lang w:val="hy-AM" w:eastAsia="ru-RU"/>
+              </w:rPr>
+            </w:pPr>
+            <w:r>
+              <w:rPr>
+                <w:rFonts w:ascii="GHEA Grapalat" w:eastAsia="Times New Roman" w:hAnsi="GHEA Grapalat" w:cs="Times New Roman"/>
+                <w:color w:val="000000"/>
+                <w:sz w:val="18"/>
+                <w:szCs w:val="18"/>
+                <w:lang w:val="hy-AM" w:eastAsia="ru-RU"/>
+              </w:rPr>
+              <w:t>5 000</w:t>
+            </w:r>
+          </w:p>
+        </w:tc>
+        <w:tc>
+          <w:tcPr>
+            <w:tcW w:w="1275" w:type="dxa"/>
+            <w:vAlign w:val="center"/>
+          </w:tcPr>
+          <w:p>
+            <w:pPr>
+              <w:autoSpaceDE w:val="0"/>
+              <w:autoSpaceDN w:val="0"/>
+              <w:adjustRightInd w:val="0"/>
+              <w:spacing w:after="0" w:line="240" w:lineRule="auto"/>
+              <w:jc w:val="center"/>
+              <w:rPr>
+                <w:rFonts w:ascii="GHEA Grapalat" w:eastAsia="Times New Roman" w:hAnsi="GHEA Grapalat" w:cs="Times New Roman"/>
+                <w:color w:val="000000"/>
+                <w:sz w:val="18"/>
+                <w:szCs w:val="18"/>
+                <w:lang w:val="hy-AM" w:eastAsia="ru-RU"/>
+              </w:rPr>
+            </w:pPr>
+            <w:r>
+              <w:rPr>
+                <w:rFonts w:ascii="GHEA Grapalat" w:eastAsia="Times New Roman" w:hAnsi="GHEA Grapalat" w:cs="Times New Roman"/>
+                <w:color w:val="000000"/>
+                <w:sz w:val="18"/>
+                <w:szCs w:val="18"/>
+                <w:lang w:val="hy-AM" w:eastAsia="ru-RU"/>
+              </w:rPr>
+              <w:t>150</w:t>
+            </w:r>
+            <w:r>
+              <w:rPr>
+                <w:rFonts w:ascii="GHEA Grapalat" w:eastAsia="Times New Roman" w:hAnsi="GHEA Grapalat" w:cs="Times New Roman"/>
+                <w:color w:val="000000"/>
+                <w:sz w:val="18"/>
+                <w:szCs w:val="18"/>
+                <w:lang w:val="hy-AM" w:eastAsia="ru-RU"/>
+              </w:rPr>
+              <w:t xml:space="preserve"> </w:t>
+            </w:r>
+            <w:r>
+              <w:rPr>
+                <w:rFonts w:ascii="GHEA Grapalat" w:eastAsia="Times New Roman" w:hAnsi="GHEA Grapalat" w:cs="Times New Roman"/>
+                <w:color w:val="000000"/>
+                <w:sz w:val="18"/>
+                <w:szCs w:val="18"/>
+                <w:lang w:val="hy-AM" w:eastAsia="ru-RU"/>
+              </w:rPr>
+              <w:t>000</w:t>
+            </w:r>
+          </w:p>
+        </w:tc>
+        <w:tc>
+          <w:tcPr>
+            <w:tcW w:w="1134" w:type="dxa"/>
+            <w:vAlign w:val="center"/>
+          </w:tcPr>
+          <w:p>
+            <w:pPr>
+              <w:autoSpaceDE w:val="0"/>
+              <w:autoSpaceDN w:val="0"/>
+              <w:adjustRightInd w:val="0"/>
+              <w:spacing w:after="0" w:line="240" w:lineRule="auto"/>
+              <w:jc w:val="center"/>
+              <w:rPr>
+                <w:rFonts w:ascii="GHEA Grapalat" w:eastAsia="Times New Roman" w:hAnsi="GHEA Grapalat" w:cs="Times New Roman"/>
+                <w:color w:val="000000"/>
+                <w:sz w:val="18"/>
+                <w:szCs w:val="18"/>
+                <w:lang w:val="hy-AM" w:eastAsia="ru-RU"/>
+              </w:rPr>
+            </w:pPr>
+            <w:r>
+              <w:rPr>
+                <w:rFonts w:ascii="GHEA Grapalat" w:eastAsia="Times New Roman" w:hAnsi="GHEA Grapalat" w:cs="Times New Roman"/>
+                <w:color w:val="000000"/>
+                <w:sz w:val="18"/>
+                <w:szCs w:val="18"/>
+                <w:lang w:val="hy-AM" w:eastAsia="ru-RU"/>
+              </w:rPr>
+              <w:t>30</w:t>
+            </w:r>
+          </w:p>
+        </w:tc>
+        <w:tc>
+          <w:tcPr>
+            <w:tcW w:w="1985" w:type="dxa"/>
+            <w:vAlign w:val="center"/>
+          </w:tcPr>
+          <w:p>
+            <w:pPr>
+              <w:autoSpaceDE w:val="0"/>
+              <w:autoSpaceDN w:val="0"/>
+              <w:adjustRightInd w:val="0"/>
+              <w:spacing w:after="0" w:line="240" w:lineRule="auto"/>
+              <w:jc w:val="center"/>
+              <w:rPr>
+                <w:rFonts w:ascii="GHEA Grapalat" w:eastAsia="Times New Roman" w:hAnsi="GHEA Grapalat" w:cs="Times New Roman"/>
+                <w:color w:val="000000"/>
+                <w:sz w:val="18"/>
+                <w:szCs w:val="18"/>
+                <w:lang w:val="hy-AM" w:eastAsia="ru-RU"/>
+              </w:rPr>
+            </w:pPr>
+            <w:r>
+              <w:rPr>
+                <w:rFonts w:ascii="GHEA Grapalat" w:eastAsia="Times New Roman" w:hAnsi="GHEA Grapalat" w:cs="Times New Roman"/>
+                <w:color w:val="000000"/>
+                <w:sz w:val="18"/>
+                <w:szCs w:val="18"/>
+                <w:lang w:val="hy-AM" w:eastAsia="ru-RU"/>
+              </w:rPr>
+              <w:t>համաձայնագրի կնքման օրվանից 20 օր</w:t>
+            </w:r>
+          </w:p>
+        </w:tc>
+      </w:tr>
+      <w:tr>
+        <w:trPr>
+          <w:trHeight w:val="246"/>
+          <w:jc w:val="center"/>
+        </w:trPr>
+        <w:tc>
+          <w:tcPr>
+            <w:tcW w:w="531" w:type="dxa"/>
+            <w:vAlign w:val="center"/>
+          </w:tcPr>
+          <w:p>
+            <w:pPr>
+              <w:autoSpaceDE w:val="0"/>
+              <w:autoSpaceDN w:val="0"/>
+              <w:adjustRightInd w:val="0"/>
+              <w:spacing w:after="0" w:line="240" w:lineRule="auto"/>
+              <w:jc w:val="center"/>
+              <w:rPr>
+                <w:rFonts w:ascii="GHEA Grapalat" w:eastAsia="Times New Roman" w:hAnsi="GHEA Grapalat" w:cs="Times New Roman"/>
+                <w:color w:val="000000"/>
+                <w:sz w:val="18"/>
+                <w:szCs w:val="18"/>
+                <w:lang w:val="hy-AM" w:eastAsia="ru-RU"/>
+              </w:rPr>
+            </w:pPr>
+            <w:r>
+              <w:rPr>
+                <w:rFonts w:ascii="GHEA Grapalat" w:eastAsia="Times New Roman" w:hAnsi="GHEA Grapalat" w:cs="Times New Roman"/>
+                <w:color w:val="000000"/>
+                <w:sz w:val="18"/>
+                <w:szCs w:val="18"/>
+                <w:lang w:val="hy-AM" w:eastAsia="ru-RU"/>
+              </w:rPr>
+              <w:lastRenderedPageBreak/>
+              <w:t>9</w:t>
+            </w:r>
+          </w:p>
+        </w:tc>
+        <w:tc>
+          <w:tcPr>
+            <w:tcW w:w="2016" w:type="dxa"/>
+            <w:vAlign w:val="center"/>
+          </w:tcPr>
+          <w:p>
+            <w:pPr>
+              <w:autoSpaceDE w:val="0"/>
+              <w:autoSpaceDN w:val="0"/>
+              <w:adjustRightInd w:val="0"/>
+              <w:spacing w:after="0" w:line="240" w:lineRule="auto"/>
+              <w:jc w:val="center"/>
+              <w:rPr>
+                <w:rFonts w:ascii="GHEA Grapalat" w:eastAsia="Times New Roman" w:hAnsi="GHEA Grapalat" w:cs="Times New Roman"/>
+                <w:color w:val="000000"/>
+                <w:sz w:val="18"/>
+                <w:szCs w:val="18"/>
+                <w:lang w:val="hy-AM" w:eastAsia="ru-RU"/>
+              </w:rPr>
+            </w:pPr>
+            <w:r>
+              <w:rPr>
+                <w:rFonts w:ascii="GHEA Grapalat" w:eastAsia="Times New Roman" w:hAnsi="GHEA Grapalat" w:cs="Times New Roman"/>
+                <w:color w:val="000000"/>
+                <w:sz w:val="18"/>
+                <w:szCs w:val="18"/>
+                <w:lang w:val="hy-AM" w:eastAsia="ru-RU"/>
+              </w:rPr>
+              <w:t>համակարգիչների մասեր</w:t>
+            </w:r>
+          </w:p>
+        </w:tc>
+        <w:tc>
+          <w:tcPr>
+            <w:tcW w:w="7371" w:type="dxa"/>
+          </w:tcPr>
+          <w:p>
+            <w:pPr>
+              <w:autoSpaceDE w:val="0"/>
+              <w:autoSpaceDN w:val="0"/>
+              <w:adjustRightInd w:val="0"/>
+              <w:spacing w:after="0" w:line="240" w:lineRule="auto"/>
+              <w:jc w:val="both"/>
+              <w:rPr>
+                <w:rFonts w:ascii="GHEA Grapalat" w:eastAsia="Times New Roman" w:hAnsi="GHEA Grapalat" w:cs="Times New Roman"/>
+                <w:color w:val="000000"/>
+                <w:sz w:val="18"/>
+                <w:szCs w:val="18"/>
+                <w:lang w:val="hy-AM" w:eastAsia="ru-RU"/>
+              </w:rPr>
+            </w:pPr>
+            <w:r>
+              <w:rPr>
+                <w:rFonts w:ascii="GHEA Grapalat" w:eastAsia="Times New Roman" w:hAnsi="GHEA Grapalat" w:cs="Times New Roman"/>
+                <w:color w:val="000000"/>
+                <w:sz w:val="18"/>
+                <w:szCs w:val="18"/>
+                <w:lang w:val="hy-AM" w:eastAsia="ru-RU"/>
+              </w:rPr>
+              <w:t xml:space="preserve">480w և ավելի, մարտկոցի հզորությունը 9Ah և ավելի, LINE ինտերակտիվ տիպի:  800VA </w:t>
+            </w:r>
+          </w:p>
+        </w:tc>
+        <w:tc>
+          <w:tcPr>
+            <w:tcW w:w="850" w:type="dxa"/>
+            <w:vAlign w:val="center"/>
+          </w:tcPr>
+          <w:p>
+            <w:pPr>
+              <w:autoSpaceDE w:val="0"/>
+              <w:autoSpaceDN w:val="0"/>
+              <w:adjustRightInd w:val="0"/>
+              <w:spacing w:after="0" w:line="240" w:lineRule="auto"/>
+              <w:jc w:val="center"/>
+              <w:rPr>
+                <w:rFonts w:ascii="GHEA Grapalat" w:eastAsia="Times New Roman" w:hAnsi="GHEA Grapalat" w:cs="Times New Roman"/>
+                <w:color w:val="000000"/>
+                <w:sz w:val="18"/>
+                <w:szCs w:val="18"/>
+                <w:lang w:val="hy-AM" w:eastAsia="ru-RU"/>
+              </w:rPr>
+            </w:pPr>
+            <w:r>
+              <w:rPr>
+                <w:rFonts w:ascii="GHEA Grapalat" w:eastAsia="Times New Roman" w:hAnsi="GHEA Grapalat" w:cs="Times New Roman"/>
+                <w:color w:val="000000"/>
+                <w:sz w:val="18"/>
+                <w:szCs w:val="18"/>
+                <w:lang w:val="hy-AM" w:eastAsia="ru-RU"/>
+              </w:rPr>
+              <w:t>հատ</w:t>
+            </w:r>
+          </w:p>
+        </w:tc>
+        <w:tc>
+          <w:tcPr>
+            <w:tcW w:w="993" w:type="dxa"/>
+            <w:vAlign w:val="center"/>
+          </w:tcPr>
+          <w:p>
+            <w:pPr>
+              <w:autoSpaceDE w:val="0"/>
+              <w:autoSpaceDN w:val="0"/>
+              <w:adjustRightInd w:val="0"/>
+              <w:spacing w:after="0" w:line="240" w:lineRule="auto"/>
+              <w:jc w:val="center"/>
+              <w:rPr>
+                <w:rFonts w:ascii="GHEA Grapalat" w:eastAsia="Times New Roman" w:hAnsi="GHEA Grapalat" w:cs="Times New Roman"/>
+                <w:color w:val="000000"/>
+                <w:sz w:val="18"/>
+                <w:szCs w:val="18"/>
+                <w:lang w:val="hy-AM" w:eastAsia="ru-RU"/>
+              </w:rPr>
+            </w:pPr>
+            <w:r>
+              <w:rPr>
+                <w:rFonts w:ascii="GHEA Grapalat" w:eastAsia="Times New Roman" w:hAnsi="GHEA Grapalat" w:cs="Times New Roman"/>
+                <w:color w:val="000000"/>
+                <w:sz w:val="18"/>
+                <w:szCs w:val="18"/>
+                <w:lang w:val="hy-AM" w:eastAsia="ru-RU"/>
+              </w:rPr>
+              <w:t>28 500</w:t>
+            </w:r>
+          </w:p>
+        </w:tc>
+        <w:tc>
+          <w:tcPr>
+            <w:tcW w:w="1275" w:type="dxa"/>
+            <w:vAlign w:val="center"/>
+          </w:tcPr>
+          <w:p>
+            <w:pPr>
+              <w:autoSpaceDE w:val="0"/>
+              <w:autoSpaceDN w:val="0"/>
+              <w:adjustRightInd w:val="0"/>
+              <w:spacing w:after="0" w:line="240" w:lineRule="auto"/>
+              <w:jc w:val="center"/>
+              <w:rPr>
+                <w:rFonts w:ascii="GHEA Grapalat" w:eastAsia="Times New Roman" w:hAnsi="GHEA Grapalat" w:cs="Times New Roman"/>
+                <w:color w:val="000000"/>
+                <w:sz w:val="18"/>
+                <w:szCs w:val="18"/>
+                <w:lang w:val="hy-AM" w:eastAsia="ru-RU"/>
+              </w:rPr>
+            </w:pPr>
+            <w:r>
+              <w:rPr>
+                <w:rFonts w:ascii="GHEA Grapalat" w:eastAsia="Times New Roman" w:hAnsi="GHEA Grapalat" w:cs="Times New Roman"/>
+                <w:color w:val="000000"/>
+                <w:sz w:val="18"/>
+                <w:szCs w:val="18"/>
+                <w:lang w:val="hy-AM" w:eastAsia="ru-RU"/>
+              </w:rPr>
+              <w:t>855</w:t>
+            </w:r>
+            <w:r>
+              <w:rPr>
+                <w:rFonts w:ascii="GHEA Grapalat" w:eastAsia="Times New Roman" w:hAnsi="GHEA Grapalat" w:cs="Times New Roman"/>
+                <w:color w:val="000000"/>
+                <w:sz w:val="18"/>
+                <w:szCs w:val="18"/>
+                <w:lang w:val="hy-AM" w:eastAsia="ru-RU"/>
+              </w:rPr>
+              <w:t xml:space="preserve"> </w:t>
+            </w:r>
+            <w:r>
+              <w:rPr>
+                <w:rFonts w:ascii="GHEA Grapalat" w:eastAsia="Times New Roman" w:hAnsi="GHEA Grapalat" w:cs="Times New Roman"/>
+                <w:color w:val="000000"/>
+                <w:sz w:val="18"/>
+                <w:szCs w:val="18"/>
+                <w:lang w:val="hy-AM" w:eastAsia="ru-RU"/>
+              </w:rPr>
+              <w:t>000</w:t>
+            </w:r>
+          </w:p>
+        </w:tc>
+        <w:tc>
+          <w:tcPr>
+            <w:tcW w:w="1134" w:type="dxa"/>
+            <w:vAlign w:val="center"/>
+          </w:tcPr>
+          <w:p>
+            <w:pPr>
+              <w:autoSpaceDE w:val="0"/>
+              <w:autoSpaceDN w:val="0"/>
+              <w:adjustRightInd w:val="0"/>
+              <w:spacing w:after="0" w:line="240" w:lineRule="auto"/>
+              <w:jc w:val="center"/>
+              <w:rPr>
+                <w:rFonts w:ascii="GHEA Grapalat" w:eastAsia="Times New Roman" w:hAnsi="GHEA Grapalat" w:cs="Times New Roman"/>
+                <w:color w:val="000000"/>
+                <w:sz w:val="18"/>
+                <w:szCs w:val="18"/>
+                <w:lang w:val="hy-AM" w:eastAsia="ru-RU"/>
+              </w:rPr>
+            </w:pPr>
+            <w:r>
+              <w:rPr>
+                <w:rFonts w:ascii="GHEA Grapalat" w:eastAsia="Times New Roman" w:hAnsi="GHEA Grapalat" w:cs="Times New Roman"/>
+                <w:color w:val="000000"/>
+                <w:sz w:val="18"/>
+                <w:szCs w:val="18"/>
+                <w:lang w:val="hy-AM" w:eastAsia="ru-RU"/>
+              </w:rPr>
+              <w:t>30</w:t>
+            </w:r>
+          </w:p>
+        </w:tc>
+        <w:tc>
+          <w:tcPr>
+            <w:tcW w:w="1985" w:type="dxa"/>
+            <w:vAlign w:val="center"/>
+          </w:tcPr>
+          <w:p>
+            <w:pPr>
+              <w:autoSpaceDE w:val="0"/>
+              <w:autoSpaceDN w:val="0"/>
+              <w:adjustRightInd w:val="0"/>
+              <w:spacing w:after="0" w:line="240" w:lineRule="auto"/>
+              <w:jc w:val="center"/>
+              <w:rPr>
+                <w:rFonts w:ascii="GHEA Grapalat" w:eastAsia="Times New Roman" w:hAnsi="GHEA Grapalat" w:cs="Times New Roman"/>
+                <w:color w:val="000000"/>
+                <w:sz w:val="18"/>
+                <w:szCs w:val="18"/>
+                <w:lang w:val="hy-AM" w:eastAsia="ru-RU"/>
+              </w:rPr>
+            </w:pPr>
+            <w:r>
+              <w:rPr>
+                <w:rFonts w:ascii="GHEA Grapalat" w:eastAsia="Times New Roman" w:hAnsi="GHEA Grapalat" w:cs="Times New Roman"/>
+                <w:color w:val="000000"/>
+                <w:sz w:val="18"/>
+                <w:szCs w:val="18"/>
+                <w:lang w:val="hy-AM" w:eastAsia="ru-RU"/>
+              </w:rPr>
+              <w:t>համաձայնագրի կնքման օրվանից 20 օր</w:t>
+            </w:r>
+          </w:p>
+        </w:tc>
+      </w:tr>
+      <w:tr>
+        <w:trPr>
+          <w:trHeight w:val="246"/>
+          <w:jc w:val="center"/>
+        </w:trPr>
+        <w:tc>
+          <w:tcPr>
+            <w:tcW w:w="531" w:type="dxa"/>
+            <w:vAlign w:val="center"/>
+          </w:tcPr>
+          <w:p>
+            <w:pPr>
+              <w:autoSpaceDE w:val="0"/>
+              <w:autoSpaceDN w:val="0"/>
+              <w:adjustRightInd w:val="0"/>
+              <w:spacing w:after="0" w:line="240" w:lineRule="auto"/>
+              <w:jc w:val="center"/>
+              <w:rPr>
+                <w:rFonts w:ascii="GHEA Grapalat" w:eastAsia="Times New Roman" w:hAnsi="GHEA Grapalat" w:cs="Times New Roman"/>
+                <w:color w:val="000000"/>
+                <w:sz w:val="18"/>
+                <w:szCs w:val="18"/>
+                <w:lang w:val="hy-AM" w:eastAsia="ru-RU"/>
+              </w:rPr>
+            </w:pPr>
+            <w:r>
+              <w:rPr>
+                <w:rFonts w:ascii="GHEA Grapalat" w:eastAsia="Times New Roman" w:hAnsi="GHEA Grapalat" w:cs="Times New Roman"/>
+                <w:color w:val="000000"/>
+                <w:sz w:val="18"/>
+                <w:szCs w:val="18"/>
+                <w:lang w:val="hy-AM" w:eastAsia="ru-RU"/>
+              </w:rPr>
+              <w:t>10</w:t>
+            </w:r>
+          </w:p>
+        </w:tc>
+        <w:tc>
+          <w:tcPr>
+            <w:tcW w:w="2016" w:type="dxa"/>
+            <w:vAlign w:val="center"/>
+          </w:tcPr>
+          <w:p>
+            <w:pPr>
+              <w:autoSpaceDE w:val="0"/>
+              <w:autoSpaceDN w:val="0"/>
+              <w:adjustRightInd w:val="0"/>
+              <w:spacing w:after="0" w:line="240" w:lineRule="auto"/>
+              <w:jc w:val="center"/>
+              <w:rPr>
+                <w:rFonts w:ascii="GHEA Grapalat" w:eastAsia="Times New Roman" w:hAnsi="GHEA Grapalat" w:cs="Times New Roman"/>
+                <w:color w:val="000000"/>
+                <w:sz w:val="18"/>
+                <w:szCs w:val="18"/>
+                <w:lang w:val="hy-AM" w:eastAsia="ru-RU"/>
+              </w:rPr>
+            </w:pPr>
+            <w:r>
+              <w:rPr>
+                <w:rFonts w:ascii="GHEA Grapalat" w:eastAsia="Times New Roman" w:hAnsi="GHEA Grapalat" w:cs="Times New Roman"/>
+                <w:color w:val="000000"/>
+                <w:sz w:val="18"/>
+                <w:szCs w:val="18"/>
+                <w:lang w:val="hy-AM" w:eastAsia="ru-RU"/>
+              </w:rPr>
+              <w:t>սառնարան-սառցարաններ</w:t>
+            </w:r>
+          </w:p>
+        </w:tc>
+        <w:tc>
+          <w:tcPr>
+            <w:tcW w:w="7371" w:type="dxa"/>
+            <w:vAlign w:val="center"/>
+          </w:tcPr>
+          <w:p>
+            <w:pPr>
+              <w:autoSpaceDE w:val="0"/>
+              <w:autoSpaceDN w:val="0"/>
+              <w:adjustRightInd w:val="0"/>
+              <w:spacing w:after="0" w:line="240" w:lineRule="auto"/>
+              <w:jc w:val="both"/>
+              <w:rPr>
+                <w:rFonts w:ascii="GHEA Grapalat" w:eastAsia="Times New Roman" w:hAnsi="GHEA Grapalat" w:cs="Times New Roman"/>
+                <w:color w:val="000000"/>
+                <w:sz w:val="18"/>
+                <w:szCs w:val="18"/>
+                <w:lang w:val="hy-AM" w:eastAsia="ru-RU"/>
+              </w:rPr>
+            </w:pPr>
+            <w:r>
+              <w:rPr>
+                <w:rFonts w:ascii="GHEA Grapalat" w:eastAsia="Times New Roman" w:hAnsi="GHEA Grapalat" w:cs="Times New Roman"/>
+                <w:color w:val="000000"/>
+                <w:sz w:val="18"/>
+                <w:szCs w:val="18"/>
+                <w:lang w:val="hy-AM" w:eastAsia="ru-RU"/>
+              </w:rPr>
+              <w:t>Սառնարան, սառցարանով, ընդհանուր ծավալը՝ 120լ, էներգիախնայողության դաս՝ A+, գույնը՝ սպիտակ: HISENSE կամ համարժեք indesit: Երաշխիքը մինիմալ 2 տարի:</w:t>
+            </w:r>
+          </w:p>
+          <w:p>
+            <w:pPr>
+              <w:autoSpaceDE w:val="0"/>
+              <w:autoSpaceDN w:val="0"/>
+              <w:adjustRightInd w:val="0"/>
+              <w:spacing w:after="0" w:line="240" w:lineRule="auto"/>
+              <w:jc w:val="both"/>
+              <w:rPr>
+                <w:rFonts w:ascii="GHEA Grapalat" w:eastAsia="Times New Roman" w:hAnsi="GHEA Grapalat" w:cs="Times New Roman"/>
+                <w:color w:val="000000"/>
+                <w:sz w:val="18"/>
+                <w:szCs w:val="18"/>
+                <w:lang w:val="hy-AM" w:eastAsia="ru-RU"/>
+              </w:rPr>
+            </w:pPr>
+            <w:r>
+              <w:rPr>
+                <w:rFonts w:ascii="GHEA Grapalat" w:eastAsia="Times New Roman" w:hAnsi="GHEA Grapalat" w:cs="Times New Roman"/>
+                <w:color w:val="000000"/>
+                <w:sz w:val="18"/>
+                <w:szCs w:val="18"/>
+                <w:lang w:val="hy-AM" w:eastAsia="ru-RU"/>
+              </w:rPr>
+              <w:pict w14:anchorId="03667481">
+                <v:rect id="_x0000_s1028" style="position:absolute;left:0;text-align:left;margin-left:96.8pt;margin-top:30.3pt;width:24pt;height:8.4pt;z-index:251661312" fillcolor="#a5a5a5" strokecolor="#f2f2f2" strokeweight="3pt">
+                  <v:shadow on="t" type="perspective" color="#525252" opacity=".5" offset="1pt" offset2="-1pt"/>
+                </v:rect>
+              </w:pict>
+            </w:r>
+            <w:r>
+              <w:rPr>
+                <w:rFonts w:ascii="GHEA Grapalat" w:eastAsia="Times New Roman" w:hAnsi="GHEA Grapalat" w:cs="Times New Roman"/>
+                <w:color w:val="000000"/>
+                <w:sz w:val="18"/>
+                <w:szCs w:val="18"/>
+                <w:lang w:val="hy-AM" w:eastAsia="ru-RU"/>
+              </w:rPr>
+              <w:fldChar w:fldCharType="begin"/>
+            </w:r>
+            <w:r>
+              <w:rPr>
+                <w:rFonts w:ascii="GHEA Grapalat" w:eastAsia="Times New Roman" w:hAnsi="GHEA Grapalat" w:cs="Times New Roman"/>
+                <w:color w:val="000000"/>
+                <w:sz w:val="18"/>
+                <w:szCs w:val="18"/>
+                <w:lang w:val="hy-AM" w:eastAsia="ru-RU"/>
+              </w:rPr>
+              <w:instrText xml:space="preserve"> INCLUDEPICTURE "https://vlv.am/public/uploads/images/04-07-2023/64a431b2247ac.webp" \* MERGEFORMATINET </w:instrText>
+            </w:r>
+            <w:r>
+              <w:rPr>
+                <w:rFonts w:ascii="GHEA Grapalat" w:eastAsia="Times New Roman" w:hAnsi="GHEA Grapalat" w:cs="Times New Roman"/>
+                <w:color w:val="000000"/>
+                <w:sz w:val="18"/>
+                <w:szCs w:val="18"/>
+                <w:lang w:val="hy-AM" w:eastAsia="ru-RU"/>
+              </w:rPr>
+              <w:fldChar w:fldCharType="separate"/>
+            </w:r>
+            <w:r>
+              <w:rPr>
+                <w:rFonts w:ascii="GHEA Grapalat" w:eastAsia="Times New Roman" w:hAnsi="GHEA Grapalat" w:cs="Times New Roman"/>
+                <w:color w:val="000000"/>
+                <w:sz w:val="18"/>
+                <w:szCs w:val="18"/>
+                <w:lang w:val="hy-AM" w:eastAsia="ru-RU"/>
+              </w:rPr>
+              <w:pict w14:anchorId="0C901DBB">
+                <v:shapetype id="_x0000_t75" coordsize="21600,21600" o:spt="75" o:preferrelative="t" path="m@4@5l@4@11@9@11@9@5xe" filled="f" stroked="f">
+                  <v:stroke joinstyle="miter"/>
+                  <v:formulas>
+                    <v:f eqn="if lineDrawn pixelLineWidth 0"/>
+                    <v:f eqn="sum @0 1 0"/>
+                    <v:f eqn="sum 0 0 @1"/>
+                    <v:f eqn="prod @2 1 2"/>
+                    <v:f eqn="prod @3 21600 pixelWidth"/>
+                    <v:f eqn="prod @3 21600 pixelHeight"/>
+                    <v:f eqn="sum @0 0 1"/>
+                    <v:f eqn="prod @6 1 2"/>
+                    <v:f eqn="prod @7 21600 pixelWidth"/>
+                    <v:f eqn="sum @8 21600 0"/>
+                    <v:f eqn="prod @7 21600 pixelHeight"/>
+                    <v:f eqn="sum @10 21600 0"/>
+                  </v:formulas>
+                  <v:path o:extrusionok="f" gradientshapeok="t" o:connecttype="rect"/>
+                  <o:lock v:ext="edit" aspectratio="t"/>
+                </v:shapetype>
+                <v:shape id="_x0000_i1039" type="#_x0000_t75" style="width:24pt;height:24pt"/>
+              </w:pict>
+            </w:r>
+            <w:r>
+              <w:rPr>
+                <w:rFonts w:ascii="GHEA Grapalat" w:eastAsia="Times New Roman" w:hAnsi="GHEA Grapalat" w:cs="Times New Roman"/>
+                <w:color w:val="000000"/>
+                <w:sz w:val="18"/>
+                <w:szCs w:val="18"/>
+                <w:lang w:val="hy-AM" w:eastAsia="ru-RU"/>
+              </w:rPr>
+              <w:fldChar w:fldCharType="end"/>
+            </w:r>
+            <w:r>
+              <w:rPr>
+                <w:rFonts w:ascii="GHEA Grapalat" w:eastAsia="Times New Roman" w:hAnsi="GHEA Grapalat" w:cs="Times New Roman"/>
+                <w:color w:val="000000"/>
+                <w:sz w:val="18"/>
+                <w:szCs w:val="18"/>
+                <w:lang w:val="hy-AM" w:eastAsia="ru-RU"/>
+              </w:rPr>
+              <w:t xml:space="preserve"> </w:t>
+            </w:r>
+            <w:r>
+              <w:rPr>
+                <w:rFonts w:ascii="GHEA Grapalat" w:eastAsia="Times New Roman" w:hAnsi="GHEA Grapalat" w:cs="Times New Roman"/>
+                <w:color w:val="000000"/>
+                <w:sz w:val="18"/>
+                <w:szCs w:val="18"/>
+                <w:lang w:val="hy-AM" w:eastAsia="ru-RU"/>
+              </w:rPr>
+              <w:pict w14:anchorId="0FD15080">
+                <v:shape id="Рисунок 1" o:spid="_x0000_i1040" type="#_x0000_t75" style="width:158.4pt;height:184.2pt;visibility:visible">
+                  <v:imagedata r:id="rId4" o:title=""/>
+                </v:shape>
+              </w:pict>
+            </w:r>
+          </w:p>
+        </w:tc>
+        <w:tc>
+          <w:tcPr>
+            <w:tcW w:w="850" w:type="dxa"/>
+            <w:vAlign w:val="center"/>
+          </w:tcPr>
+          <w:p>
+            <w:pPr>
+              <w:autoSpaceDE w:val="0"/>
+              <w:autoSpaceDN w:val="0"/>
+              <w:adjustRightInd w:val="0"/>
+              <w:spacing w:after="0" w:line="240" w:lineRule="auto"/>
+              <w:jc w:val="center"/>
+              <w:rPr>
+                <w:rFonts w:ascii="GHEA Grapalat" w:eastAsia="Times New Roman" w:hAnsi="GHEA Grapalat" w:cs="Times New Roman"/>
+                <w:color w:val="000000"/>
+                <w:sz w:val="18"/>
+                <w:szCs w:val="18"/>
+                <w:lang w:val="hy-AM" w:eastAsia="ru-RU"/>
+              </w:rPr>
+            </w:pPr>
+            <w:r>
+              <w:rPr>
+                <w:rFonts w:ascii="GHEA Grapalat" w:eastAsia="Times New Roman" w:hAnsi="GHEA Grapalat" w:cs="Times New Roman"/>
+                <w:color w:val="000000"/>
+                <w:sz w:val="18"/>
+                <w:szCs w:val="18"/>
+                <w:lang w:val="hy-AM" w:eastAsia="ru-RU"/>
+              </w:rPr>
+              <w:t>հատ</w:t>
+            </w:r>
+          </w:p>
+        </w:tc>
+        <w:tc>
+          <w:tcPr>
+            <w:tcW w:w="993" w:type="dxa"/>
+            <w:vAlign w:val="center"/>
+          </w:tcPr>
+          <w:p>
+            <w:pPr>
+              <w:autoSpaceDE w:val="0"/>
+              <w:autoSpaceDN w:val="0"/>
+              <w:adjustRightInd w:val="0"/>
+              <w:spacing w:after="0" w:line="240" w:lineRule="auto"/>
+              <w:jc w:val="center"/>
+              <w:rPr>
+                <w:rFonts w:ascii="GHEA Grapalat" w:eastAsia="Times New Roman" w:hAnsi="GHEA Grapalat" w:cs="Times New Roman"/>
+                <w:color w:val="000000"/>
+                <w:sz w:val="18"/>
+                <w:szCs w:val="18"/>
+                <w:lang w:val="hy-AM" w:eastAsia="ru-RU"/>
+              </w:rPr>
+            </w:pPr>
+            <w:r>
+              <w:rPr>
+                <w:rFonts w:ascii="GHEA Grapalat" w:eastAsia="Times New Roman" w:hAnsi="GHEA Grapalat" w:cs="Times New Roman"/>
+                <w:color w:val="000000"/>
+                <w:sz w:val="18"/>
+                <w:szCs w:val="18"/>
+                <w:lang w:val="hy-AM" w:eastAsia="ru-RU"/>
+              </w:rPr>
+              <w:t>100 000</w:t>
+            </w:r>
+          </w:p>
+        </w:tc>
+        <w:tc>
+          <w:tcPr>
+            <w:tcW w:w="1275" w:type="dxa"/>
+            <w:vAlign w:val="center"/>
+          </w:tcPr>
+          <w:p>
+            <w:pPr>
+              <w:autoSpaceDE w:val="0"/>
+              <w:autoSpaceDN w:val="0"/>
+              <w:adjustRightInd w:val="0"/>
+              <w:spacing w:after="0" w:line="240" w:lineRule="auto"/>
+              <w:jc w:val="center"/>
+              <w:rPr>
+                <w:rFonts w:ascii="GHEA Grapalat" w:eastAsia="Times New Roman" w:hAnsi="GHEA Grapalat" w:cs="Times New Roman"/>
+                <w:color w:val="000000"/>
+                <w:sz w:val="18"/>
+                <w:szCs w:val="18"/>
+                <w:lang w:val="hy-AM" w:eastAsia="ru-RU"/>
+              </w:rPr>
+            </w:pPr>
+            <w:r>
+              <w:rPr>
+                <w:rFonts w:ascii="GHEA Grapalat" w:eastAsia="Times New Roman" w:hAnsi="GHEA Grapalat" w:cs="Times New Roman"/>
+                <w:color w:val="000000"/>
+                <w:sz w:val="18"/>
+                <w:szCs w:val="18"/>
+                <w:lang w:val="hy-AM" w:eastAsia="ru-RU"/>
+              </w:rPr>
+              <w:t>300</w:t>
+            </w:r>
+            <w:r>
+              <w:rPr>
+                <w:rFonts w:ascii="GHEA Grapalat" w:eastAsia="Times New Roman" w:hAnsi="GHEA Grapalat" w:cs="Times New Roman"/>
+                <w:color w:val="000000"/>
+                <w:sz w:val="18"/>
+                <w:szCs w:val="18"/>
+                <w:lang w:val="hy-AM" w:eastAsia="ru-RU"/>
+              </w:rPr>
+              <w:t xml:space="preserve"> </w:t>
+            </w:r>
+            <w:r>
+              <w:rPr>
+                <w:rFonts w:ascii="GHEA Grapalat" w:eastAsia="Times New Roman" w:hAnsi="GHEA Grapalat" w:cs="Times New Roman"/>
+                <w:color w:val="000000"/>
+                <w:sz w:val="18"/>
+                <w:szCs w:val="18"/>
+                <w:lang w:val="hy-AM" w:eastAsia="ru-RU"/>
+              </w:rPr>
+              <w:t>000</w:t>
+            </w:r>
+          </w:p>
+        </w:tc>
+        <w:tc>
+          <w:tcPr>
+            <w:tcW w:w="1134" w:type="dxa"/>
+            <w:vAlign w:val="center"/>
+          </w:tcPr>
+          <w:p>
+            <w:pPr>
+              <w:autoSpaceDE w:val="0"/>
+              <w:autoSpaceDN w:val="0"/>
+              <w:adjustRightInd w:val="0"/>
+              <w:spacing w:after="0" w:line="240" w:lineRule="auto"/>
+              <w:jc w:val="center"/>
+              <w:rPr>
+                <w:rFonts w:ascii="GHEA Grapalat" w:eastAsia="Times New Roman" w:hAnsi="GHEA Grapalat" w:cs="Times New Roman"/>
+                <w:color w:val="000000"/>
+                <w:sz w:val="18"/>
+                <w:szCs w:val="18"/>
+                <w:lang w:val="hy-AM" w:eastAsia="ru-RU"/>
+              </w:rPr>
+            </w:pPr>
+            <w:r>
+              <w:rPr>
+                <w:rFonts w:ascii="GHEA Grapalat" w:eastAsia="Times New Roman" w:hAnsi="GHEA Grapalat" w:cs="Times New Roman"/>
+                <w:color w:val="000000"/>
+                <w:sz w:val="18"/>
+                <w:szCs w:val="18"/>
+                <w:lang w:val="hy-AM" w:eastAsia="ru-RU"/>
+              </w:rPr>
+              <w:t>3</w:t>
+            </w:r>
+          </w:p>
+        </w:tc>
+        <w:tc>
+          <w:tcPr>
+            <w:tcW w:w="1985" w:type="dxa"/>
+            <w:vAlign w:val="center"/>
+          </w:tcPr>
+          <w:p>
+            <w:pPr>
+              <w:autoSpaceDE w:val="0"/>
+              <w:autoSpaceDN w:val="0"/>
+              <w:adjustRightInd w:val="0"/>
+              <w:spacing w:after="0" w:line="240" w:lineRule="auto"/>
+              <w:jc w:val="center"/>
+              <w:rPr>
+                <w:rFonts w:ascii="GHEA Grapalat" w:eastAsia="Times New Roman" w:hAnsi="GHEA Grapalat" w:cs="Times New Roman"/>
+                <w:color w:val="000000"/>
+                <w:sz w:val="18"/>
+                <w:szCs w:val="18"/>
+                <w:lang w:val="hy-AM" w:eastAsia="ru-RU"/>
+              </w:rPr>
+            </w:pPr>
+            <w:r>
+              <w:rPr>
+                <w:rFonts w:ascii="GHEA Grapalat" w:eastAsia="Times New Roman" w:hAnsi="GHEA Grapalat" w:cs="Times New Roman"/>
+                <w:color w:val="000000"/>
+                <w:sz w:val="18"/>
+                <w:szCs w:val="18"/>
+                <w:lang w:val="hy-AM" w:eastAsia="ru-RU"/>
+              </w:rPr>
+              <w:t>համաձայնագրի կնքման օրվանից 20 օր</w:t>
+            </w:r>
           </w:p>
         </w:tc>
       </w:tr>
     </w:tbl>
     <w:p>
       <w:pPr>
+        <w:autoSpaceDE w:val="0"/>
+        <w:autoSpaceDN w:val="0"/>
+        <w:adjustRightInd w:val="0"/>
         <w:spacing w:after="0" w:line="240" w:lineRule="auto"/>
-        <w:contextualSpacing/>
         <w:jc w:val="both"/>
         <w:rPr>
-          <w:rFonts w:ascii="GHEA Grapalat" w:eastAsia="Times New Roman" w:hAnsi="GHEA Grapalat" w:cs="Times New Roman"/>
-          <w:color w:val="000000"/>
+          <w:rFonts w:ascii="GHEA Grapalat" w:eastAsia="Times New Roman" w:hAnsi="GHEA Grapalat" w:cs="Times Armenian"/>
+          <w:bCs/>
+          <w:iCs/>
           <w:sz w:val="18"/>
           <w:szCs w:val="18"/>
           <w:lang w:val="hy-AM" w:eastAsia="ru-RU"/>
@@ -1579,33 +3781,65 @@
       </w:pPr>
       <w:r>
         <w:rPr>
-          <w:rFonts w:ascii="GHEA Grapalat" w:eastAsia="Times New Roman" w:hAnsi="GHEA Grapalat" w:cs="Times New Roman"/>
-          <w:color w:val="000000"/>
+          <w:rFonts w:ascii="GHEA Grapalat" w:eastAsia="Times New Roman" w:hAnsi="GHEA Grapalat" w:cs="Times Armenian"/>
+          <w:bCs/>
+          <w:iCs/>
           <w:sz w:val="18"/>
           <w:szCs w:val="18"/>
           <w:lang w:val="hy-AM" w:eastAsia="ru-RU"/>
         </w:rPr>
-        <w:t xml:space="preserve">1. Ապրանքատեսակները պետք է մատակարարվեն </w:t>
-      </w:r>
-      <w:r>
-        <w:rPr>
-          <w:rFonts w:ascii="GHEA Grapalat" w:eastAsia="Times New Roman" w:hAnsi="GHEA Grapalat" w:cs="Times New Roman"/>
-          <w:color w:val="000000"/>
-          <w:sz w:val="18"/>
-          <w:szCs w:val="18"/>
+        <w:t xml:space="preserve">1. Ապրանքատեսակները պետք է մատակարարվեն ՀՀ, </w:t>
+      </w:r>
+      <w:r>
+        <w:rPr>
+          <w:rFonts w:ascii="GHEA Grapalat" w:eastAsia="Times New Roman" w:hAnsi="GHEA Grapalat" w:cs="Times Armenian"/>
+          <w:bCs/>
+          <w:iCs/>
+          <w:sz w:val="18"/>
+          <w:szCs w:val="18"/>
+          <w:highlight w:val="yellow"/>
           <w:lang w:val="hy-AM" w:eastAsia="ru-RU"/>
         </w:rPr>
-        <w:t>ք. Երևան, Կ. Ուլնեցի 68</w:t>
-      </w:r>
-      <w:r>
-        <w:rPr>
-          <w:rFonts w:ascii="GHEA Grapalat" w:eastAsia="Times New Roman" w:hAnsi="GHEA Grapalat" w:cs="Times New Roman"/>
-          <w:color w:val="000000"/>
+        <w:t>ք Վանաձոր Գարեգին Նժդեհի 2/42</w:t>
+      </w:r>
+      <w:r>
+        <w:rPr>
+          <w:rFonts w:ascii="GHEA Grapalat" w:eastAsia="Times New Roman" w:hAnsi="GHEA Grapalat" w:cs="Times Armenian"/>
+          <w:bCs/>
+          <w:iCs/>
           <w:sz w:val="18"/>
           <w:szCs w:val="18"/>
           <w:lang w:val="hy-AM" w:eastAsia="ru-RU"/>
         </w:rPr>
         <w:t>։</w:t>
+      </w:r>
+    </w:p>
+    <w:p>
+      <w:pPr>
+        <w:autoSpaceDE w:val="0"/>
+        <w:autoSpaceDN w:val="0"/>
+        <w:adjustRightInd w:val="0"/>
+        <w:spacing w:after="0" w:line="240" w:lineRule="auto"/>
+        <w:jc w:val="both"/>
+        <w:rPr>
+          <w:rFonts w:ascii="GHEA Grapalat" w:eastAsia="Times New Roman" w:hAnsi="GHEA Grapalat" w:cs="Times Armenian"/>
+          <w:bCs/>
+          <w:iCs/>
+          <w:sz w:val="18"/>
+          <w:szCs w:val="18"/>
+          <w:lang w:val="hy-AM" w:eastAsia="ru-RU"/>
+        </w:rPr>
+      </w:pPr>
+      <w:r>
+        <w:rPr>
+          <w:rFonts w:ascii="GHEA Grapalat" w:eastAsia="Times New Roman" w:hAnsi="GHEA Grapalat" w:cs="Times Armenian"/>
+          <w:bCs/>
+          <w:iCs/>
+          <w:sz w:val="18"/>
+          <w:szCs w:val="18"/>
+          <w:lang w:val="hy-AM" w:eastAsia="ru-RU"/>
+        </w:rPr>
+        <w:t>2. Պայմանագրով նախատեսված դեպքում Վաճառողը Գնորդին ներկայացնում է նաև ապրանքն արտադրողից կամ վերջինիս ներկայացուցչից երաշխիքային նամակի կամ համապատասխանության սերտիֆիկատ:</w:t>
       </w:r>
     </w:p>
     <w:p>
@@ -1715,7 +3949,7 @@
           <w:szCs w:val="18"/>
           <w:lang w:val="hy-AM"/>
         </w:rPr>
-        <w:t>առկա ֆինանսկան միջոցներվ</w:t>
+        <w:t>պայմանով</w:t>
       </w:r>
       <w:r>
         <w:rPr>
@@ -1859,58 +4093,17 @@
           <w:szCs w:val="18"/>
           <w:lang w:val="hy-AM"/>
         </w:rPr>
-        <w:lastRenderedPageBreak/>
-        <w:t xml:space="preserve">4. </w:t>
-      </w:r>
-      <w:r>
-        <w:rPr>
-          <w:rFonts w:ascii="GHEA Grapalat" w:eastAsia="Calibri" w:hAnsi="GHEA Grapalat" w:cs="Times New Roman"/>
-          <w:iCs/>
-          <w:sz w:val="18"/>
-          <w:szCs w:val="18"/>
-          <w:lang w:val="hy-AM"/>
-        </w:rPr>
-        <w:t xml:space="preserve">Մատակարարման </w:t>
-      </w:r>
-      <w:r>
-        <w:rPr>
-          <w:rFonts w:ascii="GHEA Grapalat" w:eastAsia="Calibri" w:hAnsi="GHEA Grapalat" w:cs="Times New Roman"/>
-          <w:iCs/>
-          <w:sz w:val="18"/>
-          <w:szCs w:val="18"/>
-          <w:lang w:val="hy-AM"/>
-        </w:rPr>
-        <w:t xml:space="preserve">ամենամոտ </w:t>
-      </w:r>
-      <w:r>
-        <w:rPr>
-          <w:rFonts w:ascii="GHEA Grapalat" w:eastAsia="Calibri" w:hAnsi="GHEA Grapalat" w:cs="Times New Roman"/>
-          <w:iCs/>
-          <w:sz w:val="18"/>
-          <w:szCs w:val="18"/>
-          <w:lang w:val="hy-AM"/>
-        </w:rPr>
-        <w:t xml:space="preserve">ժամկետ սույն թվականի </w:t>
-      </w:r>
-      <w:r>
-        <w:rPr>
-          <w:rFonts w:ascii="GHEA Grapalat" w:eastAsia="Calibri" w:hAnsi="GHEA Grapalat" w:cs="Times New Roman"/>
-          <w:iCs/>
-          <w:sz w:val="18"/>
-          <w:szCs w:val="18"/>
-          <w:lang w:val="hy-AM"/>
-        </w:rPr>
-        <w:t>նոյեմբերի 21</w:t>
-      </w:r>
-      <w:r>
-        <w:rPr>
-          <w:rFonts w:ascii="GHEA Grapalat" w:eastAsia="Calibri" w:hAnsi="GHEA Grapalat" w:cs="Times New Roman"/>
-          <w:iCs/>
-          <w:sz w:val="18"/>
-          <w:szCs w:val="18"/>
-          <w:lang w:val="hy-AM"/>
-        </w:rPr>
-        <w:t>։</w:t>
+        <w:t>4.</w:t>
+      </w:r>
+      <w:r>
+        <w:rPr>
+          <w:rFonts w:ascii="GHEA Grapalat" w:eastAsia="Calibri" w:hAnsi="GHEA Grapalat" w:cs="Times New Roman"/>
+          <w:iCs/>
+          <w:sz w:val="18"/>
+          <w:szCs w:val="18"/>
+          <w:lang w:val="hy-AM"/>
+        </w:rPr>
+        <w:t xml:space="preserve"> Մատակարարման վերջնաժամկետ այս պահին հնարավոր չէ կանխատեսել, քանի որ Գնորդը՝</w:t>
       </w:r>
     </w:p>
     <w:p>
@@ -1934,7 +4127,7 @@
           <w:szCs w:val="18"/>
           <w:lang w:val="hy-AM"/>
         </w:rPr>
-        <w:t>Կարող ենք՝</w:t>
+        <w:t>կամ կնախատեսի ֆինանսական միջոցներ ամբողջ քանակի համար,</w:t>
       </w:r>
     </w:p>
     <w:p>
@@ -1958,247 +4151,7 @@
           <w:szCs w:val="18"/>
           <w:lang w:val="hy-AM"/>
         </w:rPr>
-        <w:t>Ա) խնդրել երկարաձգել մեկ</w:t>
-      </w:r>
-      <w:r>
-        <w:rPr>
-          <w:rFonts w:ascii="GHEA Grapalat" w:eastAsia="Calibri" w:hAnsi="GHEA Grapalat" w:cs="Times New Roman"/>
-          <w:iCs/>
-          <w:sz w:val="18"/>
-          <w:szCs w:val="18"/>
-          <w:lang w:val="pt-BR"/>
-        </w:rPr>
-        <w:t xml:space="preserve"> </w:t>
-      </w:r>
-      <w:r>
-        <w:rPr>
-          <w:rFonts w:ascii="GHEA Grapalat" w:eastAsia="Calibri" w:hAnsi="GHEA Grapalat" w:cs="Times New Roman"/>
-          <w:iCs/>
-          <w:sz w:val="18"/>
-          <w:szCs w:val="18"/>
-          <w:lang w:val="hy-AM"/>
-        </w:rPr>
-        <w:t>անգամ</w:t>
-      </w:r>
-      <w:r>
-        <w:rPr>
-          <w:rFonts w:ascii="GHEA Grapalat" w:eastAsia="Calibri" w:hAnsi="GHEA Grapalat" w:cs="Times New Roman"/>
-          <w:iCs/>
-          <w:sz w:val="18"/>
-          <w:szCs w:val="18"/>
-          <w:lang w:val="pt-BR"/>
-        </w:rPr>
-        <w:t xml:space="preserve"> </w:t>
-      </w:r>
-      <w:r>
-        <w:rPr>
-          <w:rFonts w:ascii="GHEA Grapalat" w:eastAsia="Calibri" w:hAnsi="GHEA Grapalat" w:cs="Times New Roman"/>
-          <w:iCs/>
-          <w:sz w:val="18"/>
-          <w:szCs w:val="18"/>
-          <w:lang w:val="hy-AM"/>
-        </w:rPr>
-        <w:t>մինչև</w:t>
-      </w:r>
-      <w:r>
-        <w:rPr>
-          <w:rFonts w:ascii="GHEA Grapalat" w:eastAsia="Calibri" w:hAnsi="GHEA Grapalat" w:cs="Times New Roman"/>
-          <w:iCs/>
-          <w:sz w:val="18"/>
-          <w:szCs w:val="18"/>
-          <w:lang w:val="pt-BR"/>
-        </w:rPr>
-        <w:t xml:space="preserve"> 30 </w:t>
-      </w:r>
-      <w:r>
-        <w:rPr>
-          <w:rFonts w:ascii="GHEA Grapalat" w:eastAsia="Calibri" w:hAnsi="GHEA Grapalat" w:cs="Times New Roman"/>
-          <w:iCs/>
-          <w:sz w:val="18"/>
-          <w:szCs w:val="18"/>
-          <w:lang w:val="hy-AM"/>
-        </w:rPr>
-        <w:t>օրացուցային</w:t>
-      </w:r>
-      <w:r>
-        <w:rPr>
-          <w:rFonts w:ascii="GHEA Grapalat" w:eastAsia="Calibri" w:hAnsi="GHEA Grapalat" w:cs="Times New Roman"/>
-          <w:iCs/>
-          <w:sz w:val="18"/>
-          <w:szCs w:val="18"/>
-          <w:lang w:val="pt-BR"/>
-        </w:rPr>
-        <w:t xml:space="preserve"> </w:t>
-      </w:r>
-      <w:r>
-        <w:rPr>
-          <w:rFonts w:ascii="GHEA Grapalat" w:eastAsia="Calibri" w:hAnsi="GHEA Grapalat" w:cs="Times New Roman"/>
-          <w:iCs/>
-          <w:sz w:val="18"/>
-          <w:szCs w:val="18"/>
-          <w:lang w:val="hy-AM"/>
-        </w:rPr>
-        <w:t>օրով</w:t>
-      </w:r>
-      <w:r>
-        <w:rPr>
-          <w:rFonts w:ascii="GHEA Grapalat" w:eastAsia="Calibri" w:hAnsi="GHEA Grapalat" w:cs="Times New Roman"/>
-          <w:iCs/>
-          <w:sz w:val="18"/>
-          <w:szCs w:val="18"/>
-          <w:lang w:val="pt-BR"/>
-        </w:rPr>
-        <w:t xml:space="preserve">, </w:t>
-      </w:r>
-      <w:r>
-        <w:rPr>
-          <w:rFonts w:ascii="GHEA Grapalat" w:eastAsia="Calibri" w:hAnsi="GHEA Grapalat" w:cs="Times New Roman"/>
-          <w:iCs/>
-          <w:sz w:val="18"/>
-          <w:szCs w:val="18"/>
-          <w:lang w:val="hy-AM"/>
-        </w:rPr>
-        <w:t>բայց</w:t>
-      </w:r>
-      <w:r>
-        <w:rPr>
-          <w:rFonts w:ascii="GHEA Grapalat" w:eastAsia="Calibri" w:hAnsi="GHEA Grapalat" w:cs="Times New Roman"/>
-          <w:iCs/>
-          <w:sz w:val="18"/>
-          <w:szCs w:val="18"/>
-          <w:lang w:val="pt-BR"/>
-        </w:rPr>
-        <w:t xml:space="preserve"> </w:t>
-      </w:r>
-      <w:r>
-        <w:rPr>
-          <w:rFonts w:ascii="GHEA Grapalat" w:eastAsia="Calibri" w:hAnsi="GHEA Grapalat" w:cs="Times New Roman"/>
-          <w:iCs/>
-          <w:sz w:val="18"/>
-          <w:szCs w:val="18"/>
-          <w:lang w:val="hy-AM"/>
-        </w:rPr>
-        <w:t>ոչ</w:t>
-      </w:r>
-      <w:r>
-        <w:rPr>
-          <w:rFonts w:ascii="GHEA Grapalat" w:eastAsia="Calibri" w:hAnsi="GHEA Grapalat" w:cs="Times New Roman"/>
-          <w:iCs/>
-          <w:sz w:val="18"/>
-          <w:szCs w:val="18"/>
-          <w:lang w:val="pt-BR"/>
-        </w:rPr>
-        <w:t xml:space="preserve"> </w:t>
-      </w:r>
-      <w:r>
-        <w:rPr>
-          <w:rFonts w:ascii="GHEA Grapalat" w:eastAsia="Calibri" w:hAnsi="GHEA Grapalat" w:cs="Times New Roman"/>
-          <w:iCs/>
-          <w:sz w:val="18"/>
-          <w:szCs w:val="18"/>
-          <w:lang w:val="hy-AM"/>
-        </w:rPr>
-        <w:t>ավել</w:t>
-      </w:r>
-      <w:r>
-        <w:rPr>
-          <w:rFonts w:ascii="GHEA Grapalat" w:eastAsia="Calibri" w:hAnsi="GHEA Grapalat" w:cs="Times New Roman"/>
-          <w:iCs/>
-          <w:sz w:val="18"/>
-          <w:szCs w:val="18"/>
-          <w:lang w:val="pt-BR"/>
-        </w:rPr>
-        <w:t xml:space="preserve"> </w:t>
-      </w:r>
-      <w:r>
-        <w:rPr>
-          <w:rFonts w:ascii="GHEA Grapalat" w:eastAsia="Calibri" w:hAnsi="GHEA Grapalat" w:cs="Times New Roman"/>
-          <w:iCs/>
-          <w:sz w:val="18"/>
-          <w:szCs w:val="18"/>
-          <w:lang w:val="hy-AM"/>
-        </w:rPr>
-        <w:t>քան</w:t>
-      </w:r>
-      <w:r>
-        <w:rPr>
-          <w:rFonts w:ascii="GHEA Grapalat" w:eastAsia="Calibri" w:hAnsi="GHEA Grapalat" w:cs="Times New Roman"/>
-          <w:iCs/>
-          <w:sz w:val="18"/>
-          <w:szCs w:val="18"/>
-          <w:lang w:val="pt-BR"/>
-        </w:rPr>
-        <w:t xml:space="preserve"> </w:t>
-      </w:r>
-      <w:r>
-        <w:rPr>
-          <w:rFonts w:ascii="GHEA Grapalat" w:eastAsia="Calibri" w:hAnsi="GHEA Grapalat" w:cs="Times New Roman"/>
-          <w:iCs/>
-          <w:sz w:val="18"/>
-          <w:szCs w:val="18"/>
-          <w:lang w:val="hy-AM"/>
-        </w:rPr>
-        <w:t>պայմանագրով</w:t>
-      </w:r>
-      <w:r>
-        <w:rPr>
-          <w:rFonts w:ascii="GHEA Grapalat" w:eastAsia="Calibri" w:hAnsi="GHEA Grapalat" w:cs="Times New Roman"/>
-          <w:iCs/>
-          <w:sz w:val="18"/>
-          <w:szCs w:val="18"/>
-          <w:lang w:val="pt-BR"/>
-        </w:rPr>
-        <w:t xml:space="preserve"> </w:t>
-      </w:r>
-      <w:r>
-        <w:rPr>
-          <w:rFonts w:ascii="GHEA Grapalat" w:eastAsia="Calibri" w:hAnsi="GHEA Grapalat" w:cs="Times New Roman"/>
-          <w:iCs/>
-          <w:sz w:val="18"/>
-          <w:szCs w:val="18"/>
-          <w:lang w:val="hy-AM"/>
-        </w:rPr>
-        <w:t>սահմանված</w:t>
-      </w:r>
-      <w:r>
-        <w:rPr>
-          <w:rFonts w:ascii="GHEA Grapalat" w:eastAsia="Calibri" w:hAnsi="GHEA Grapalat" w:cs="Times New Roman"/>
-          <w:iCs/>
-          <w:sz w:val="18"/>
-          <w:szCs w:val="18"/>
-          <w:lang w:val="pt-BR"/>
-        </w:rPr>
-        <w:t xml:space="preserve"> </w:t>
-      </w:r>
-      <w:r>
-        <w:rPr>
-          <w:rFonts w:ascii="GHEA Grapalat" w:eastAsia="Calibri" w:hAnsi="GHEA Grapalat" w:cs="Times New Roman"/>
-          <w:iCs/>
-          <w:sz w:val="18"/>
-          <w:szCs w:val="18"/>
-          <w:lang w:val="hy-AM"/>
-        </w:rPr>
-        <w:t>ժամկետն</w:t>
-      </w:r>
-      <w:r>
-        <w:rPr>
-          <w:rFonts w:ascii="GHEA Grapalat" w:eastAsia="Calibri" w:hAnsi="GHEA Grapalat" w:cs="Times New Roman"/>
-          <w:iCs/>
-          <w:sz w:val="18"/>
-          <w:szCs w:val="18"/>
-          <w:lang w:val="pt-BR"/>
-        </w:rPr>
-        <w:t xml:space="preserve"> </w:t>
-      </w:r>
-      <w:r>
-        <w:rPr>
-          <w:rFonts w:ascii="GHEA Grapalat" w:eastAsia="Calibri" w:hAnsi="GHEA Grapalat" w:cs="Times New Roman"/>
-          <w:iCs/>
-          <w:sz w:val="18"/>
-          <w:szCs w:val="18"/>
-          <w:lang w:val="hy-AM"/>
-        </w:rPr>
-        <w:t>է – տույժ չենք վճարի,</w:t>
+        <w:t>կամ կնախատեսի ֆինանսական միջոցներ որոշ քանակի համար,</w:t>
       </w:r>
     </w:p>
     <w:p>
@@ -2222,27 +4175,319 @@
           <w:szCs w:val="18"/>
           <w:lang w:val="hy-AM"/>
         </w:rPr>
-        <w:t xml:space="preserve">Բ) մատակարարել </w:t>
-      </w:r>
-      <w:r>
-        <w:rPr>
-          <w:rFonts w:ascii="GHEA Grapalat" w:eastAsia="Calibri" w:hAnsi="GHEA Grapalat" w:cs="Times New Roman"/>
-          <w:iCs/>
-          <w:sz w:val="18"/>
-          <w:szCs w:val="18"/>
-          <w:lang w:val="hy-AM"/>
-        </w:rPr>
-        <w:t>5</w:t>
-      </w:r>
-      <w:r>
-        <w:rPr>
-          <w:rFonts w:ascii="GHEA Grapalat" w:eastAsia="Calibri" w:hAnsi="GHEA Grapalat" w:cs="Times New Roman"/>
-          <w:iCs/>
-          <w:sz w:val="18"/>
-          <w:szCs w:val="18"/>
-          <w:lang w:val="hy-AM"/>
-        </w:rPr>
-        <w:t xml:space="preserve"> օրացուցային օր ուշացումով – կվճարենք տույժ յուրաքանչյուր ուշացած աշխատանքային օրվա համար չմատակարարած գումարի 0,05%-ի չափով։</w:t>
+        <w:t>կամ ֆինանսական միջոցներ ընդհանրապես չի նախատեսի։</w:t>
+      </w:r>
+    </w:p>
+    <w:p>
+      <w:pPr>
+        <w:spacing w:after="0"/>
+        <w:ind w:firstLine="567"/>
+        <w:jc w:val="both"/>
+        <w:rPr>
+          <w:rFonts w:ascii="GHEA Grapalat" w:eastAsia="Calibri" w:hAnsi="GHEA Grapalat" w:cs="Times New Roman"/>
+          <w:iCs/>
+          <w:sz w:val="18"/>
+          <w:szCs w:val="18"/>
+          <w:lang w:val="hy-AM"/>
+        </w:rPr>
+      </w:pPr>
+      <w:r>
+        <w:rPr>
+          <w:rFonts w:ascii="GHEA Grapalat" w:eastAsia="Calibri" w:hAnsi="GHEA Grapalat" w:cs="Times New Roman"/>
+          <w:iCs/>
+          <w:sz w:val="18"/>
+          <w:szCs w:val="18"/>
+          <w:lang w:val="hy-AM"/>
+        </w:rPr>
+        <w:t>Համաձայնագիր կնքելուց հետո կարող ենք՝</w:t>
+      </w:r>
+    </w:p>
+    <w:p>
+      <w:pPr>
+        <w:spacing w:after="0"/>
+        <w:ind w:firstLine="567"/>
+        <w:jc w:val="both"/>
+        <w:rPr>
+          <w:rFonts w:ascii="GHEA Grapalat" w:eastAsia="Calibri" w:hAnsi="GHEA Grapalat" w:cs="Times New Roman"/>
+          <w:iCs/>
+          <w:sz w:val="18"/>
+          <w:szCs w:val="18"/>
+          <w:lang w:val="hy-AM"/>
+        </w:rPr>
+      </w:pPr>
+      <w:r>
+        <w:rPr>
+          <w:rFonts w:ascii="GHEA Grapalat" w:eastAsia="Calibri" w:hAnsi="GHEA Grapalat" w:cs="Times New Roman"/>
+          <w:iCs/>
+          <w:sz w:val="18"/>
+          <w:szCs w:val="18"/>
+          <w:lang w:val="hy-AM"/>
+        </w:rPr>
+        <w:t>Ա) խնդրել երկարաձգել մեկ</w:t>
+      </w:r>
+      <w:r>
+        <w:rPr>
+          <w:rFonts w:ascii="GHEA Grapalat" w:eastAsia="Calibri" w:hAnsi="GHEA Grapalat" w:cs="Times New Roman"/>
+          <w:iCs/>
+          <w:sz w:val="18"/>
+          <w:szCs w:val="18"/>
+          <w:lang w:val="pt-BR"/>
+        </w:rPr>
+        <w:t xml:space="preserve"> </w:t>
+      </w:r>
+      <w:r>
+        <w:rPr>
+          <w:rFonts w:ascii="GHEA Grapalat" w:eastAsia="Calibri" w:hAnsi="GHEA Grapalat" w:cs="Times New Roman"/>
+          <w:iCs/>
+          <w:sz w:val="18"/>
+          <w:szCs w:val="18"/>
+          <w:lang w:val="hy-AM"/>
+        </w:rPr>
+        <w:t>անգամ</w:t>
+      </w:r>
+      <w:r>
+        <w:rPr>
+          <w:rFonts w:ascii="GHEA Grapalat" w:eastAsia="Calibri" w:hAnsi="GHEA Grapalat" w:cs="Times New Roman"/>
+          <w:iCs/>
+          <w:sz w:val="18"/>
+          <w:szCs w:val="18"/>
+          <w:lang w:val="pt-BR"/>
+        </w:rPr>
+        <w:t xml:space="preserve"> </w:t>
+      </w:r>
+      <w:r>
+        <w:rPr>
+          <w:rFonts w:ascii="GHEA Grapalat" w:eastAsia="Calibri" w:hAnsi="GHEA Grapalat" w:cs="Times New Roman"/>
+          <w:iCs/>
+          <w:sz w:val="18"/>
+          <w:szCs w:val="18"/>
+          <w:lang w:val="hy-AM"/>
+        </w:rPr>
+        <w:t>մինչև</w:t>
+      </w:r>
+      <w:r>
+        <w:rPr>
+          <w:rFonts w:ascii="GHEA Grapalat" w:eastAsia="Calibri" w:hAnsi="GHEA Grapalat" w:cs="Times New Roman"/>
+          <w:iCs/>
+          <w:sz w:val="18"/>
+          <w:szCs w:val="18"/>
+          <w:lang w:val="pt-BR"/>
+        </w:rPr>
+        <w:t xml:space="preserve"> 30 </w:t>
+      </w:r>
+      <w:r>
+        <w:rPr>
+          <w:rFonts w:ascii="GHEA Grapalat" w:eastAsia="Calibri" w:hAnsi="GHEA Grapalat" w:cs="Times New Roman"/>
+          <w:iCs/>
+          <w:sz w:val="18"/>
+          <w:szCs w:val="18"/>
+          <w:lang w:val="hy-AM"/>
+        </w:rPr>
+        <w:t>օրացուցային</w:t>
+      </w:r>
+      <w:r>
+        <w:rPr>
+          <w:rFonts w:ascii="GHEA Grapalat" w:eastAsia="Calibri" w:hAnsi="GHEA Grapalat" w:cs="Times New Roman"/>
+          <w:iCs/>
+          <w:sz w:val="18"/>
+          <w:szCs w:val="18"/>
+          <w:lang w:val="pt-BR"/>
+        </w:rPr>
+        <w:t xml:space="preserve"> </w:t>
+      </w:r>
+      <w:r>
+        <w:rPr>
+          <w:rFonts w:ascii="GHEA Grapalat" w:eastAsia="Calibri" w:hAnsi="GHEA Grapalat" w:cs="Times New Roman"/>
+          <w:iCs/>
+          <w:sz w:val="18"/>
+          <w:szCs w:val="18"/>
+          <w:lang w:val="hy-AM"/>
+        </w:rPr>
+        <w:t>օրով</w:t>
+      </w:r>
+      <w:r>
+        <w:rPr>
+          <w:rFonts w:ascii="GHEA Grapalat" w:eastAsia="Calibri" w:hAnsi="GHEA Grapalat" w:cs="Times New Roman"/>
+          <w:iCs/>
+          <w:sz w:val="18"/>
+          <w:szCs w:val="18"/>
+          <w:lang w:val="pt-BR"/>
+        </w:rPr>
+        <w:t xml:space="preserve">, </w:t>
+      </w:r>
+      <w:r>
+        <w:rPr>
+          <w:rFonts w:ascii="GHEA Grapalat" w:eastAsia="Calibri" w:hAnsi="GHEA Grapalat" w:cs="Times New Roman"/>
+          <w:iCs/>
+          <w:sz w:val="18"/>
+          <w:szCs w:val="18"/>
+          <w:lang w:val="hy-AM"/>
+        </w:rPr>
+        <w:t>բայց</w:t>
+      </w:r>
+      <w:r>
+        <w:rPr>
+          <w:rFonts w:ascii="GHEA Grapalat" w:eastAsia="Calibri" w:hAnsi="GHEA Grapalat" w:cs="Times New Roman"/>
+          <w:iCs/>
+          <w:sz w:val="18"/>
+          <w:szCs w:val="18"/>
+          <w:lang w:val="pt-BR"/>
+        </w:rPr>
+        <w:t xml:space="preserve"> </w:t>
+      </w:r>
+      <w:r>
+        <w:rPr>
+          <w:rFonts w:ascii="GHEA Grapalat" w:eastAsia="Calibri" w:hAnsi="GHEA Grapalat" w:cs="Times New Roman"/>
+          <w:iCs/>
+          <w:sz w:val="18"/>
+          <w:szCs w:val="18"/>
+          <w:lang w:val="hy-AM"/>
+        </w:rPr>
+        <w:t>ոչ</w:t>
+      </w:r>
+      <w:r>
+        <w:rPr>
+          <w:rFonts w:ascii="GHEA Grapalat" w:eastAsia="Calibri" w:hAnsi="GHEA Grapalat" w:cs="Times New Roman"/>
+          <w:iCs/>
+          <w:sz w:val="18"/>
+          <w:szCs w:val="18"/>
+          <w:lang w:val="pt-BR"/>
+        </w:rPr>
+        <w:t xml:space="preserve"> </w:t>
+      </w:r>
+      <w:r>
+        <w:rPr>
+          <w:rFonts w:ascii="GHEA Grapalat" w:eastAsia="Calibri" w:hAnsi="GHEA Grapalat" w:cs="Times New Roman"/>
+          <w:iCs/>
+          <w:sz w:val="18"/>
+          <w:szCs w:val="18"/>
+          <w:lang w:val="hy-AM"/>
+        </w:rPr>
+        <w:t>ավել</w:t>
+      </w:r>
+      <w:r>
+        <w:rPr>
+          <w:rFonts w:ascii="GHEA Grapalat" w:eastAsia="Calibri" w:hAnsi="GHEA Grapalat" w:cs="Times New Roman"/>
+          <w:iCs/>
+          <w:sz w:val="18"/>
+          <w:szCs w:val="18"/>
+          <w:lang w:val="pt-BR"/>
+        </w:rPr>
+        <w:t xml:space="preserve"> </w:t>
+      </w:r>
+      <w:r>
+        <w:rPr>
+          <w:rFonts w:ascii="GHEA Grapalat" w:eastAsia="Calibri" w:hAnsi="GHEA Grapalat" w:cs="Times New Roman"/>
+          <w:iCs/>
+          <w:sz w:val="18"/>
+          <w:szCs w:val="18"/>
+          <w:lang w:val="hy-AM"/>
+        </w:rPr>
+        <w:t>քան</w:t>
+      </w:r>
+      <w:r>
+        <w:rPr>
+          <w:rFonts w:ascii="GHEA Grapalat" w:eastAsia="Calibri" w:hAnsi="GHEA Grapalat" w:cs="Times New Roman"/>
+          <w:iCs/>
+          <w:sz w:val="18"/>
+          <w:szCs w:val="18"/>
+          <w:lang w:val="pt-BR"/>
+        </w:rPr>
+        <w:t xml:space="preserve"> </w:t>
+      </w:r>
+      <w:r>
+        <w:rPr>
+          <w:rFonts w:ascii="GHEA Grapalat" w:eastAsia="Calibri" w:hAnsi="GHEA Grapalat" w:cs="Times New Roman"/>
+          <w:iCs/>
+          <w:sz w:val="18"/>
+          <w:szCs w:val="18"/>
+          <w:lang w:val="hy-AM"/>
+        </w:rPr>
+        <w:t>պայմանագրով</w:t>
+      </w:r>
+      <w:r>
+        <w:rPr>
+          <w:rFonts w:ascii="GHEA Grapalat" w:eastAsia="Calibri" w:hAnsi="GHEA Grapalat" w:cs="Times New Roman"/>
+          <w:iCs/>
+          <w:sz w:val="18"/>
+          <w:szCs w:val="18"/>
+          <w:lang w:val="pt-BR"/>
+        </w:rPr>
+        <w:t xml:space="preserve"> </w:t>
+      </w:r>
+      <w:r>
+        <w:rPr>
+          <w:rFonts w:ascii="GHEA Grapalat" w:eastAsia="Calibri" w:hAnsi="GHEA Grapalat" w:cs="Times New Roman"/>
+          <w:iCs/>
+          <w:sz w:val="18"/>
+          <w:szCs w:val="18"/>
+          <w:lang w:val="hy-AM"/>
+        </w:rPr>
+        <w:t>սահմանված</w:t>
+      </w:r>
+      <w:r>
+        <w:rPr>
+          <w:rFonts w:ascii="GHEA Grapalat" w:eastAsia="Calibri" w:hAnsi="GHEA Grapalat" w:cs="Times New Roman"/>
+          <w:iCs/>
+          <w:sz w:val="18"/>
+          <w:szCs w:val="18"/>
+          <w:lang w:val="pt-BR"/>
+        </w:rPr>
+        <w:t xml:space="preserve"> </w:t>
+      </w:r>
+      <w:r>
+        <w:rPr>
+          <w:rFonts w:ascii="GHEA Grapalat" w:eastAsia="Calibri" w:hAnsi="GHEA Grapalat" w:cs="Times New Roman"/>
+          <w:iCs/>
+          <w:sz w:val="18"/>
+          <w:szCs w:val="18"/>
+          <w:lang w:val="hy-AM"/>
+        </w:rPr>
+        <w:t>ժամկետն</w:t>
+      </w:r>
+      <w:r>
+        <w:rPr>
+          <w:rFonts w:ascii="GHEA Grapalat" w:eastAsia="Calibri" w:hAnsi="GHEA Grapalat" w:cs="Times New Roman"/>
+          <w:iCs/>
+          <w:sz w:val="18"/>
+          <w:szCs w:val="18"/>
+          <w:lang w:val="pt-BR"/>
+        </w:rPr>
+        <w:t xml:space="preserve"> </w:t>
+      </w:r>
+      <w:r>
+        <w:rPr>
+          <w:rFonts w:ascii="GHEA Grapalat" w:eastAsia="Calibri" w:hAnsi="GHEA Grapalat" w:cs="Times New Roman"/>
+          <w:iCs/>
+          <w:sz w:val="18"/>
+          <w:szCs w:val="18"/>
+          <w:lang w:val="hy-AM"/>
+        </w:rPr>
+        <w:t>է – տույժ չենք վճարի,</w:t>
+      </w:r>
+    </w:p>
+    <w:p>
+      <w:pPr>
+        <w:spacing w:after="0"/>
+        <w:ind w:firstLine="567"/>
+        <w:jc w:val="both"/>
+        <w:rPr>
+          <w:rFonts w:ascii="GHEA Grapalat" w:eastAsia="Calibri" w:hAnsi="GHEA Grapalat" w:cs="Times New Roman"/>
+          <w:iCs/>
+          <w:sz w:val="18"/>
+          <w:szCs w:val="18"/>
+          <w:lang w:val="hy-AM"/>
+        </w:rPr>
+      </w:pPr>
+      <w:r>
+        <w:rPr>
+          <w:rFonts w:ascii="GHEA Grapalat" w:eastAsia="Calibri" w:hAnsi="GHEA Grapalat" w:cs="Times New Roman"/>
+          <w:iCs/>
+          <w:sz w:val="18"/>
+          <w:szCs w:val="18"/>
+          <w:lang w:val="hy-AM"/>
+        </w:rPr>
+        <w:t>Բ) մատակարարել 10 օրացուցային օր ուշացումով – կվճարենք տույժ յուրաքանչյուր ուշացած աշխատանքային օրվա համար չմատակարարած գումարի 0,05%-ի չափով։</w:t>
       </w:r>
     </w:p>
     <w:p>
@@ -2497,7 +4742,7 @@
           <w:szCs w:val="18"/>
           <w:lang w:val="hy-AM"/>
         </w:rPr>
-        <w:t>09</w:t>
+        <w:t>10</w:t>
       </w:r>
       <w:r>
         <w:rPr>
@@ -2557,7 +4802,7 @@
           <w:szCs w:val="18"/>
           <w:lang w:val="hy-AM"/>
         </w:rPr>
-        <w:t>6</w:t>
+        <w:t>0</w:t>
       </w:r>
       <w:r>
         <w:rPr>
@@ -2577,6 +4822,173 @@
           <w:szCs w:val="18"/>
           <w:lang w:val="hy-AM"/>
         </w:rPr>
+        <w:t>00,</w:t>
+      </w:r>
+    </w:p>
+    <w:p>
+      <w:pPr>
+        <w:spacing w:after="0" w:line="240" w:lineRule="auto"/>
+        <w:ind w:firstLine="567"/>
+        <w:contextualSpacing/>
+        <w:jc w:val="both"/>
+        <w:rPr>
+          <w:rFonts w:ascii="GHEA Grapalat" w:eastAsia="Calibri" w:hAnsi="GHEA Grapalat" w:cs="Times New Roman"/>
+          <w:iCs/>
+          <w:sz w:val="18"/>
+          <w:szCs w:val="18"/>
+          <w:lang w:val="hy-AM"/>
+        </w:rPr>
+      </w:pPr>
+      <w:r>
+        <w:rPr>
+          <w:rFonts w:ascii="GHEA Grapalat" w:eastAsia="Calibri" w:hAnsi="GHEA Grapalat" w:cs="Times New Roman"/>
+          <w:iCs/>
+          <w:sz w:val="18"/>
+          <w:szCs w:val="18"/>
+          <w:lang w:val="hy-AM"/>
+        </w:rPr>
+        <w:t xml:space="preserve">Հակադարձ աճուրդ </w:t>
+      </w:r>
+      <w:r>
+        <w:rPr>
+          <w:rFonts w:ascii="GHEA Grapalat" w:eastAsia="Calibri" w:hAnsi="GHEA Grapalat" w:cs="Times New Roman"/>
+          <w:iCs/>
+          <w:sz w:val="18"/>
+          <w:szCs w:val="18"/>
+          <w:lang w:val="hy-AM"/>
+        </w:rPr>
+        <w:tab/>
+      </w:r>
+      <w:r>
+        <w:rPr>
+          <w:rFonts w:ascii="GHEA Grapalat" w:eastAsia="Calibri" w:hAnsi="GHEA Grapalat" w:cs="Times New Roman"/>
+          <w:iCs/>
+          <w:sz w:val="18"/>
+          <w:szCs w:val="18"/>
+          <w:lang w:val="hy-AM"/>
+        </w:rPr>
+        <w:tab/>
+      </w:r>
+      <w:r>
+        <w:rPr>
+          <w:rFonts w:ascii="GHEA Grapalat" w:eastAsia="Calibri" w:hAnsi="GHEA Grapalat" w:cs="Times New Roman"/>
+          <w:iCs/>
+          <w:sz w:val="18"/>
+          <w:szCs w:val="18"/>
+          <w:lang w:val="hy-AM"/>
+        </w:rPr>
+        <w:tab/>
+      </w:r>
+      <w:r>
+        <w:rPr>
+          <w:rFonts w:ascii="GHEA Grapalat" w:eastAsia="Times New Roman" w:hAnsi="GHEA Grapalat" w:cs="Times New Roman"/>
+          <w:iCs/>
+          <w:color w:val="000000"/>
+          <w:sz w:val="18"/>
+          <w:szCs w:val="18"/>
+          <w:lang w:val="hy-AM" w:eastAsia="ru-RU"/>
+        </w:rPr>
+        <w:t>–</w:t>
+      </w:r>
+      <w:r>
+        <w:rPr>
+          <w:rFonts w:ascii="GHEA Grapalat" w:eastAsia="Calibri" w:hAnsi="GHEA Grapalat" w:cs="Times New Roman"/>
+          <w:iCs/>
+          <w:sz w:val="18"/>
+          <w:szCs w:val="18"/>
+          <w:lang w:val="hy-AM"/>
+        </w:rPr>
+        <w:tab/>
+        <w:t>1</w:t>
+      </w:r>
+      <w:r>
+        <w:rPr>
+          <w:rFonts w:ascii="GHEA Grapalat" w:eastAsia="Calibri" w:hAnsi="GHEA Grapalat" w:cs="Times New Roman"/>
+          <w:iCs/>
+          <w:sz w:val="18"/>
+          <w:szCs w:val="18"/>
+          <w:lang w:val="hy-AM"/>
+        </w:rPr>
+        <w:t>1</w:t>
+      </w:r>
+      <w:r>
+        <w:rPr>
+          <w:rFonts w:ascii="GHEA Grapalat" w:eastAsia="Calibri" w:hAnsi="GHEA Grapalat" w:cs="Times New Roman"/>
+          <w:iCs/>
+          <w:sz w:val="18"/>
+          <w:szCs w:val="18"/>
+          <w:lang w:val="hy-AM"/>
+        </w:rPr>
+        <w:t>.0</w:t>
+      </w:r>
+      <w:r>
+        <w:rPr>
+          <w:rFonts w:ascii="GHEA Grapalat" w:eastAsia="Calibri" w:hAnsi="GHEA Grapalat" w:cs="Times New Roman"/>
+          <w:iCs/>
+          <w:sz w:val="18"/>
+          <w:szCs w:val="18"/>
+          <w:lang w:val="hy-AM"/>
+        </w:rPr>
+        <w:t>9</w:t>
+      </w:r>
+      <w:r>
+        <w:rPr>
+          <w:rFonts w:ascii="GHEA Grapalat" w:eastAsia="Calibri" w:hAnsi="GHEA Grapalat" w:cs="Times New Roman"/>
+          <w:iCs/>
+          <w:sz w:val="18"/>
+          <w:szCs w:val="18"/>
+          <w:lang w:val="hy-AM"/>
+        </w:rPr>
+        <w:t xml:space="preserve"> </w:t>
+      </w:r>
+      <w:r>
+        <w:rPr>
+          <w:rFonts w:ascii="GHEA Grapalat" w:eastAsia="Calibri" w:hAnsi="GHEA Grapalat" w:cs="Times New Roman"/>
+          <w:iCs/>
+          <w:sz w:val="18"/>
+          <w:szCs w:val="18"/>
+          <w:lang w:val="hy-AM"/>
+        </w:rPr>
+        <w:t>–</w:t>
+      </w:r>
+      <w:r>
+        <w:rPr>
+          <w:rFonts w:ascii="GHEA Grapalat" w:eastAsia="Calibri" w:hAnsi="GHEA Grapalat" w:cs="Times New Roman"/>
+          <w:iCs/>
+          <w:sz w:val="18"/>
+          <w:szCs w:val="18"/>
+          <w:lang w:val="hy-AM"/>
+        </w:rPr>
+        <w:t xml:space="preserve"> 1</w:t>
+      </w:r>
+      <w:r>
+        <w:rPr>
+          <w:rFonts w:ascii="GHEA Grapalat" w:eastAsia="Calibri" w:hAnsi="GHEA Grapalat" w:cs="Times New Roman"/>
+          <w:iCs/>
+          <w:sz w:val="18"/>
+          <w:szCs w:val="18"/>
+          <w:lang w:val="hy-AM"/>
+        </w:rPr>
+        <w:t>0</w:t>
+      </w:r>
+      <w:r>
+        <w:rPr>
+          <w:rFonts w:ascii="GHEA Grapalat" w:eastAsia="Calibri" w:hAnsi="GHEA Grapalat" w:cs="Times New Roman"/>
+          <w:iCs/>
+          <w:sz w:val="18"/>
+          <w:szCs w:val="18"/>
+          <w:lang w:val="hy-AM"/>
+        </w:rPr>
+        <w:t>։</w:t>
+      </w:r>
+      <w:r>
+        <w:rPr>
+          <w:rFonts w:ascii="GHEA Grapalat" w:eastAsia="Calibri" w:hAnsi="GHEA Grapalat" w:cs="Times New Roman"/>
+          <w:iCs/>
+          <w:sz w:val="18"/>
+          <w:szCs w:val="18"/>
+          <w:lang w:val="hy-AM"/>
+        </w:rPr>
         <w:t>00</w:t>
       </w:r>
       <w:r>
@@ -2588,6 +5000,16 @@
           <w:lang w:val="hy-AM"/>
         </w:rPr>
         <w:t>։</w:t>
+      </w:r>
+      <w:r>
+        <w:rPr>
+          <w:rFonts w:ascii="GHEA Grapalat" w:eastAsia="Calibri" w:hAnsi="GHEA Grapalat" w:cs="Times New Roman"/>
+          <w:iCs/>
+          <w:sz w:val="18"/>
+          <w:szCs w:val="18"/>
+          <w:lang w:val="hy-AM"/>
+        </w:rPr>
+        <w:tab/>
       </w:r>
     </w:p>
     <w:sectPr>
@@ -2619,8 +5041,8 @@
   </w:docDefaults>
   <w:latentStyles w:defLockedState="0" w:defUIPriority="99" w:defSemiHidden="0" w:defUnhideWhenUsed="0" w:defQFormat="0" w:count="376">
     <w:lsdException w:name="Normal" w:uiPriority="0" w:qFormat="1"/>
-    <w:lsdException w:name="heading 1" w:uiPriority="9" w:qFormat="1"/>
-    <w:lsdException w:name="heading 2" w:semiHidden="1" w:uiPriority="9" w:unhideWhenUsed="1" w:qFormat="1"/>
+    <w:lsdException w:name="heading 1" w:uiPriority="0" w:qFormat="1"/>
+    <w:lsdException w:name="heading 2" w:semiHidden="1" w:uiPriority="0" w:unhideWhenUsed="1" w:qFormat="1"/>
     <w:lsdException w:name="heading 3" w:semiHidden="1" w:uiPriority="9" w:unhideWhenUsed="1" w:qFormat="1"/>
     <w:lsdException w:name="heading 4" w:semiHidden="1" w:uiPriority="9" w:unhideWhenUsed="1" w:qFormat="1"/>
     <w:lsdException w:name="heading 5" w:semiHidden="1" w:uiPriority="9" w:unhideWhenUsed="1" w:qFormat="1"/>
@@ -2703,7 +5125,7 @@
     <w:lsdException w:name="Body Text Indent 2" w:semiHidden="1" w:unhideWhenUsed="1"/>
     <w:lsdException w:name="Body Text Indent 3" w:semiHidden="1" w:unhideWhenUsed="1"/>
     <w:lsdException w:name="Block Text" w:semiHidden="1" w:unhideWhenUsed="1"/>
-    <w:lsdException w:name="Hyperlink" w:semiHidden="1" w:unhideWhenUsed="1"/>
+    <w:lsdException w:name="Hyperlink" w:semiHidden="1" w:uiPriority="0" w:unhideWhenUsed="1"/>
     <w:lsdException w:name="FollowedHyperlink" w:semiHidden="1" w:unhideWhenUsed="1"/>
     <w:lsdException w:name="Strong" w:uiPriority="22" w:qFormat="1"/>
     <w:lsdException w:name="Emphasis" w:uiPriority="20" w:qFormat="1"/>
@@ -2999,6 +5421,51 @@
     <w:name w:val="Normal"/>
     <w:qFormat/>
   </w:style>
+  <w:style w:type="paragraph" w:styleId="1">
+    <w:name w:val="heading 1"/>
+    <w:basedOn w:val="a"/>
+    <w:next w:val="a"/>
+    <w:link w:val="10"/>
+    <w:qFormat/>
+    <w:rsid w:val="000F4AA5"/>
+    <w:pPr>
+      <w:keepNext/>
+      <w:spacing w:before="240" w:after="60" w:line="240" w:lineRule="auto"/>
+      <w:outlineLvl w:val="0"/>
+    </w:pPr>
+    <w:rPr>
+      <w:rFonts w:ascii="Arial" w:eastAsia="Times New Roman" w:hAnsi="Arial" w:cs="Arial"/>
+      <w:b/>
+      <w:bCs/>
+      <w:kern w:val="32"/>
+      <w:sz w:val="32"/>
+      <w:szCs w:val="32"/>
+      <w:lang w:val="en-US"/>
+    </w:rPr>
+  </w:style>
+  <w:style w:type="paragraph" w:styleId="2">
+    <w:name w:val="heading 2"/>
+    <w:basedOn w:val="a"/>
+    <w:next w:val="a"/>
+    <w:link w:val="20"/>
+    <w:qFormat/>
+    <w:rsid w:val="000F4AA5"/>
+    <w:pPr>
+      <w:keepNext/>
+      <w:spacing w:before="240" w:after="60" w:line="240" w:lineRule="auto"/>
+      <w:outlineLvl w:val="1"/>
+    </w:pPr>
+    <w:rPr>
+      <w:rFonts w:ascii="Arial" w:eastAsia="Times New Roman" w:hAnsi="Arial" w:cs="Arial"/>
+      <w:b/>
+      <w:bCs/>
+      <w:i/>
+      <w:iCs/>
+      <w:sz w:val="28"/>
+      <w:szCs w:val="28"/>
+      <w:lang w:val="en-US"/>
+    </w:rPr>
+  </w:style>
   <w:style w:type="character" w:default="1" w:styleId="a0">
     <w:name w:val="Default Paragraph Font"/>
     <w:uiPriority w:val="1"/>
@@ -3025,6 +5492,49 @@
     <w:uiPriority w:val="99"/>
     <w:semiHidden/>
     <w:unhideWhenUsed/>
+  </w:style>
+  <w:style w:type="character" w:customStyle="1" w:styleId="20">
+    <w:name w:val="Заголовок 2 Знак"/>
+    <w:basedOn w:val="a0"/>
+    <w:link w:val="2"/>
+    <w:rsid w:val="000F4AA5"/>
+    <w:rPr>
+      <w:rFonts w:ascii="Arial" w:eastAsia="Times New Roman" w:hAnsi="Arial" w:cs="Arial"/>
+      <w:b/>
+      <w:bCs/>
+      <w:i/>
+      <w:iCs/>
+      <w:sz w:val="28"/>
+      <w:szCs w:val="28"/>
+      <w:lang w:val="en-US"/>
+    </w:rPr>
+  </w:style>
+  <w:style w:type="character" w:styleId="a3">
+    <w:name w:val="Hyperlink"/>
+    <w:rsid w:val="000F4AA5"/>
+    <w:rPr>
+      <w:color w:val="757E88"/>
+      <w:u w:val="single"/>
+    </w:rPr>
+  </w:style>
+  <w:style w:type="character" w:customStyle="1" w:styleId="tsbody500medium">
+    <w:name w:val="tsbody500medium"/>
+    <w:rsid w:val="000F4AA5"/>
+  </w:style>
+  <w:style w:type="character" w:customStyle="1" w:styleId="10">
+    <w:name w:val="Заголовок 1 Знак"/>
+    <w:basedOn w:val="a0"/>
+    <w:link w:val="1"/>
+    <w:rsid w:val="000F4AA5"/>
+    <w:rPr>
+      <w:rFonts w:ascii="Arial" w:eastAsia="Times New Roman" w:hAnsi="Arial" w:cs="Arial"/>
+      <w:b/>
+      <w:bCs/>
+      <w:kern w:val="32"/>
+      <w:sz w:val="32"/>
+      <w:szCs w:val="32"/>
+      <w:lang w:val="en-US"/>
+    </w:rPr>
   </w:style>
 </w:styles>
 </file>

</xml_diff>